<commit_message>
Worked on Project Plan
Added some missing details
</commit_message>
<xml_diff>
--- a/Project Plan.docx
+++ b/Project Plan.docx
@@ -123,7 +123,7 @@
       </w:tblPr>
       <w:tblGrid>
         <w:gridCol w:w="1052"/>
-        <w:gridCol w:w="2884"/>
+        <w:gridCol w:w="3164"/>
         <w:gridCol w:w="1870"/>
         <w:gridCol w:w="1844"/>
       </w:tblGrid>
@@ -166,6 +166,9 @@
         </w:tc>
       </w:tr>
       <w:tr>
+        <w:trPr>
+          <w:trHeight w:val="346"/>
+        </w:trPr>
         <w:tc>
           <w:tcPr>
             <w:cnfStyle w:val="001000000000" w:firstRow="0" w:lastRow="0" w:firstColumn="1" w:lastColumn="0" w:oddVBand="0" w:evenVBand="0" w:oddHBand="0" w:evenHBand="0" w:firstRowFirstColumn="0" w:firstRowLastColumn="0" w:lastRowFirstColumn="0" w:lastRowLastColumn="0"/>
@@ -175,18 +178,12 @@
               <w:left w:val="single" w:sz="4" w:space="0" w:color="E59EDC" w:themeColor="accent5" w:themeTint="66"/>
               <w:right w:val="single" w:sz="4" w:space="0" w:color="E59EDC" w:themeColor="accent5" w:themeTint="66"/>
             </w:tcBorders>
-          </w:tcPr>
-          <w:p>
-            <w:pPr>
-              <w:spacing w:after="0" w:line="240" w:lineRule="auto"/>
-              <w:jc w:val="center"/>
-              <w:rPr>
-                <w:rFonts w:ascii="Helvetica" w:hAnsi="Helvetica" w:cs="Helvetica"/>
-                <w:b/>
-                <w:bCs/>
-              </w:rPr>
-            </w:pPr>
-            <w:r>
+            <w:vAlign w:val="center"/>
+          </w:tcPr>
+          <w:p>
+            <w:pPr>
+              <w:spacing w:after="0" w:line="240" w:lineRule="auto"/>
+              <w:jc w:val="center"/>
               <w:rPr>
                 <w:rFonts w:ascii="Helvetica" w:hAnsi="Helvetica" w:cs="Helvetica"/>
                 <w:b/>
@@ -194,6 +191,15 @@
                 <w:i w:val="0"/>
                 <w:iCs w:val="0"/>
               </w:rPr>
+            </w:pPr>
+            <w:r>
+              <w:rPr>
+                <w:rFonts w:ascii="Helvetica" w:hAnsi="Helvetica" w:cs="Helvetica"/>
+                <w:b/>
+                <w:bCs/>
+                <w:i w:val="0"/>
+                <w:iCs w:val="0"/>
+              </w:rPr>
               <w:t>Task ID</w:t>
             </w:r>
           </w:p>
@@ -208,6 +214,7 @@
               <w:right w:val="single" w:sz="4" w:space="0" w:color="E59EDC" w:themeColor="accent5" w:themeTint="66"/>
             </w:tcBorders>
             <w:shd w:val="clear" w:color="auto" w:fill="F2CEED" w:themeFill="accent5" w:themeFillTint="33"/>
+            <w:vAlign w:val="center"/>
           </w:tcPr>
           <w:p>
             <w:pPr>
@@ -218,8 +225,6 @@
                 <w:rFonts w:ascii="Helvetica" w:hAnsi="Helvetica" w:cs="Helvetica"/>
                 <w:b/>
                 <w:bCs/>
-                <w:i/>
-                <w:iCs/>
               </w:rPr>
             </w:pPr>
             <w:r>
@@ -227,8 +232,6 @@
                 <w:rFonts w:ascii="Helvetica" w:hAnsi="Helvetica" w:cs="Helvetica"/>
                 <w:b/>
                 <w:bCs/>
-                <w:i/>
-                <w:iCs/>
               </w:rPr>
               <w:t>Task</w:t>
             </w:r>
@@ -244,6 +247,7 @@
               <w:right w:val="single" w:sz="4" w:space="0" w:color="E59EDC" w:themeColor="accent5" w:themeTint="66"/>
             </w:tcBorders>
             <w:shd w:val="clear" w:color="auto" w:fill="F2CEED" w:themeFill="accent5" w:themeFillTint="33"/>
+            <w:vAlign w:val="center"/>
           </w:tcPr>
           <w:p>
             <w:pPr>
@@ -276,6 +280,7 @@
               <w:right w:val="single" w:sz="4" w:space="0" w:color="E59EDC" w:themeColor="accent5" w:themeTint="66"/>
             </w:tcBorders>
             <w:shd w:val="clear" w:color="auto" w:fill="F2CEED" w:themeFill="accent5" w:themeFillTint="33"/>
+            <w:vAlign w:val="center"/>
           </w:tcPr>
           <w:p>
             <w:pPr>
@@ -300,6 +305,9 @@
         </w:tc>
       </w:tr>
       <w:tr>
+        <w:trPr>
+          <w:trHeight w:val="346"/>
+        </w:trPr>
         <w:tc>
           <w:tcPr>
             <w:cnfStyle w:val="001000000000" w:firstRow="0" w:lastRow="0" w:firstColumn="1" w:lastColumn="0" w:oddVBand="0" w:evenVBand="0" w:oddHBand="0" w:evenHBand="0" w:firstRowFirstColumn="0" w:firstRowLastColumn="0" w:lastRowFirstColumn="0" w:lastRowLastColumn="0"/>
@@ -309,21 +317,24 @@
               <w:left w:val="single" w:sz="4" w:space="0" w:color="E59EDC" w:themeColor="accent5" w:themeTint="66"/>
               <w:right w:val="single" w:sz="4" w:space="0" w:color="E59EDC" w:themeColor="accent5" w:themeTint="66"/>
             </w:tcBorders>
-          </w:tcPr>
-          <w:p>
-            <w:pPr>
-              <w:spacing w:after="0" w:line="240" w:lineRule="auto"/>
-              <w:jc w:val="center"/>
-              <w:rPr>
-                <w:rFonts w:ascii="Helvetica" w:hAnsi="Helvetica" w:cs="Helvetica"/>
-              </w:rPr>
-            </w:pPr>
-            <w:r>
+            <w:vAlign w:val="center"/>
+          </w:tcPr>
+          <w:p>
+            <w:pPr>
+              <w:spacing w:after="0" w:line="240" w:lineRule="auto"/>
+              <w:jc w:val="center"/>
               <w:rPr>
                 <w:rFonts w:ascii="Helvetica" w:hAnsi="Helvetica" w:cs="Helvetica"/>
                 <w:i w:val="0"/>
                 <w:iCs w:val="0"/>
               </w:rPr>
+            </w:pPr>
+            <w:r>
+              <w:rPr>
+                <w:rFonts w:ascii="Helvetica" w:hAnsi="Helvetica" w:cs="Helvetica"/>
+                <w:i w:val="0"/>
+                <w:iCs w:val="0"/>
+              </w:rPr>
               <w:t>T1</w:t>
             </w:r>
           </w:p>
@@ -336,6 +347,1277 @@
               <w:left w:val="single" w:sz="4" w:space="0" w:color="E59EDC" w:themeColor="accent5" w:themeTint="66"/>
               <w:right w:val="single" w:sz="4" w:space="0" w:color="E59EDC" w:themeColor="accent5" w:themeTint="66"/>
             </w:tcBorders>
+            <w:vAlign w:val="center"/>
+          </w:tcPr>
+          <w:p>
+            <w:pPr>
+              <w:spacing w:after="0" w:line="240" w:lineRule="auto"/>
+              <w:jc w:val="center"/>
+              <w:cnfStyle w:val="000000000000" w:firstRow="0" w:lastRow="0" w:firstColumn="0" w:lastColumn="0" w:oddVBand="0" w:evenVBand="0" w:oddHBand="0" w:evenHBand="0" w:firstRowFirstColumn="0" w:firstRowLastColumn="0" w:lastRowFirstColumn="0" w:lastRowLastColumn="0"/>
+              <w:rPr>
+                <w:rFonts w:ascii="Helvetica" w:hAnsi="Helvetica" w:cs="Helvetica"/>
+              </w:rPr>
+            </w:pPr>
+            <w:r>
+              <w:rPr>
+                <w:rFonts w:ascii="Helvetica" w:hAnsi="Helvetica" w:cs="Helvetica"/>
+              </w:rPr>
+              <w:t>Create customer</w:t>
+            </w:r>
+          </w:p>
+        </w:tc>
+        <w:tc>
+          <w:tcPr>
+            <w:tcW w:w="0" w:type="auto"/>
+            <w:tcBorders>
+              <w:top w:val="single" w:sz="4" w:space="0" w:color="E59EDC" w:themeColor="accent5" w:themeTint="66"/>
+              <w:left w:val="single" w:sz="4" w:space="0" w:color="E59EDC" w:themeColor="accent5" w:themeTint="66"/>
+            </w:tcBorders>
+            <w:vAlign w:val="center"/>
+          </w:tcPr>
+          <w:p>
+            <w:pPr>
+              <w:spacing w:after="0" w:line="240" w:lineRule="auto"/>
+              <w:jc w:val="center"/>
+              <w:cnfStyle w:val="000000000000" w:firstRow="0" w:lastRow="0" w:firstColumn="0" w:lastColumn="0" w:oddVBand="0" w:evenVBand="0" w:oddHBand="0" w:evenHBand="0" w:firstRowFirstColumn="0" w:firstRowLastColumn="0" w:lastRowFirstColumn="0" w:lastRowLastColumn="0"/>
+              <w:rPr>
+                <w:rFonts w:ascii="Helvetica" w:hAnsi="Helvetica" w:cs="Helvetica"/>
+              </w:rPr>
+            </w:pPr>
+            <w:r>
+              <w:rPr>
+                <w:rFonts w:ascii="Helvetica" w:hAnsi="Helvetica" w:cs="Helvetica"/>
+              </w:rPr>
+              <w:t>3</w:t>
+            </w:r>
+          </w:p>
+        </w:tc>
+        <w:tc>
+          <w:tcPr>
+            <w:tcW w:w="0" w:type="auto"/>
+            <w:tcBorders>
+              <w:top w:val="single" w:sz="4" w:space="0" w:color="E59EDC" w:themeColor="accent5" w:themeTint="66"/>
+            </w:tcBorders>
+            <w:vAlign w:val="center"/>
+          </w:tcPr>
+          <w:p>
+            <w:pPr>
+              <w:spacing w:after="0" w:line="240" w:lineRule="auto"/>
+              <w:jc w:val="center"/>
+              <w:cnfStyle w:val="000000000000" w:firstRow="0" w:lastRow="0" w:firstColumn="0" w:lastColumn="0" w:oddVBand="0" w:evenVBand="0" w:oddHBand="0" w:evenHBand="0" w:firstRowFirstColumn="0" w:firstRowLastColumn="0" w:lastRowFirstColumn="0" w:lastRowLastColumn="0"/>
+              <w:rPr>
+                <w:rFonts w:ascii="Helvetica" w:hAnsi="Helvetica" w:cs="Helvetica"/>
+              </w:rPr>
+            </w:pPr>
+            <w:r>
+              <w:rPr>
+                <w:rFonts w:ascii="Helvetica" w:hAnsi="Helvetica" w:cs="Helvetica"/>
+              </w:rPr>
+              <w:t>T12</w:t>
+            </w:r>
+          </w:p>
+        </w:tc>
+      </w:tr>
+      <w:tr>
+        <w:trPr>
+          <w:trHeight w:val="346"/>
+        </w:trPr>
+        <w:tc>
+          <w:tcPr>
+            <w:cnfStyle w:val="001000000000" w:firstRow="0" w:lastRow="0" w:firstColumn="1" w:lastColumn="0" w:oddVBand="0" w:evenVBand="0" w:oddHBand="0" w:evenHBand="0" w:firstRowFirstColumn="0" w:firstRowLastColumn="0" w:lastRowFirstColumn="0" w:lastRowLastColumn="0"/>
+            <w:tcW w:w="0" w:type="auto"/>
+            <w:tcBorders>
+              <w:top w:val="single" w:sz="4" w:space="0" w:color="E59EDC" w:themeColor="accent5" w:themeTint="66"/>
+              <w:left w:val="single" w:sz="4" w:space="0" w:color="E59EDC" w:themeColor="accent5" w:themeTint="66"/>
+              <w:right w:val="single" w:sz="4" w:space="0" w:color="E59EDC" w:themeColor="accent5" w:themeTint="66"/>
+            </w:tcBorders>
+            <w:vAlign w:val="center"/>
+          </w:tcPr>
+          <w:p>
+            <w:pPr>
+              <w:spacing w:after="0" w:line="240" w:lineRule="auto"/>
+              <w:jc w:val="center"/>
+              <w:rPr>
+                <w:rFonts w:ascii="Helvetica" w:hAnsi="Helvetica" w:cs="Helvetica"/>
+                <w:i w:val="0"/>
+                <w:iCs w:val="0"/>
+              </w:rPr>
+            </w:pPr>
+            <w:r>
+              <w:rPr>
+                <w:rFonts w:ascii="Helvetica" w:hAnsi="Helvetica" w:cs="Helvetica"/>
+                <w:i w:val="0"/>
+                <w:iCs w:val="0"/>
+              </w:rPr>
+              <w:t>T2</w:t>
+            </w:r>
+          </w:p>
+        </w:tc>
+        <w:tc>
+          <w:tcPr>
+            <w:tcW w:w="0" w:type="auto"/>
+            <w:tcBorders>
+              <w:left w:val="single" w:sz="4" w:space="0" w:color="E59EDC" w:themeColor="accent5" w:themeTint="66"/>
+              <w:right w:val="single" w:sz="4" w:space="0" w:color="E59EDC" w:themeColor="accent5" w:themeTint="66"/>
+            </w:tcBorders>
+            <w:shd w:val="clear" w:color="auto" w:fill="F2CEED" w:themeFill="accent5" w:themeFillTint="33"/>
+            <w:vAlign w:val="center"/>
+          </w:tcPr>
+          <w:p>
+            <w:pPr>
+              <w:spacing w:after="0" w:line="240" w:lineRule="auto"/>
+              <w:jc w:val="center"/>
+              <w:cnfStyle w:val="000000000000" w:firstRow="0" w:lastRow="0" w:firstColumn="0" w:lastColumn="0" w:oddVBand="0" w:evenVBand="0" w:oddHBand="0" w:evenHBand="0" w:firstRowFirstColumn="0" w:firstRowLastColumn="0" w:lastRowFirstColumn="0" w:lastRowLastColumn="0"/>
+              <w:rPr>
+                <w:rFonts w:ascii="Helvetica" w:hAnsi="Helvetica" w:cs="Helvetica"/>
+              </w:rPr>
+            </w:pPr>
+            <w:r>
+              <w:rPr>
+                <w:rFonts w:ascii="Helvetica" w:hAnsi="Helvetica" w:cs="Helvetica"/>
+              </w:rPr>
+              <w:t>Create newsagent</w:t>
+            </w:r>
+          </w:p>
+        </w:tc>
+        <w:tc>
+          <w:tcPr>
+            <w:tcW w:w="0" w:type="auto"/>
+            <w:tcBorders>
+              <w:left w:val="single" w:sz="4" w:space="0" w:color="E59EDC" w:themeColor="accent5" w:themeTint="66"/>
+            </w:tcBorders>
+            <w:shd w:val="clear" w:color="auto" w:fill="F2CEED" w:themeFill="accent5" w:themeFillTint="33"/>
+            <w:vAlign w:val="center"/>
+          </w:tcPr>
+          <w:p>
+            <w:pPr>
+              <w:spacing w:after="0" w:line="240" w:lineRule="auto"/>
+              <w:jc w:val="center"/>
+              <w:cnfStyle w:val="000000000000" w:firstRow="0" w:lastRow="0" w:firstColumn="0" w:lastColumn="0" w:oddVBand="0" w:evenVBand="0" w:oddHBand="0" w:evenHBand="0" w:firstRowFirstColumn="0" w:firstRowLastColumn="0" w:lastRowFirstColumn="0" w:lastRowLastColumn="0"/>
+              <w:rPr>
+                <w:rFonts w:ascii="Helvetica" w:hAnsi="Helvetica" w:cs="Helvetica"/>
+              </w:rPr>
+            </w:pPr>
+            <w:r>
+              <w:rPr>
+                <w:rFonts w:ascii="Helvetica" w:hAnsi="Helvetica" w:cs="Helvetica"/>
+              </w:rPr>
+              <w:t>3</w:t>
+            </w:r>
+          </w:p>
+        </w:tc>
+        <w:tc>
+          <w:tcPr>
+            <w:tcW w:w="0" w:type="auto"/>
+            <w:shd w:val="clear" w:color="auto" w:fill="F2CEED" w:themeFill="accent5" w:themeFillTint="33"/>
+            <w:vAlign w:val="center"/>
+          </w:tcPr>
+          <w:p>
+            <w:pPr>
+              <w:spacing w:after="0" w:line="240" w:lineRule="auto"/>
+              <w:jc w:val="center"/>
+              <w:cnfStyle w:val="000000000000" w:firstRow="0" w:lastRow="0" w:firstColumn="0" w:lastColumn="0" w:oddVBand="0" w:evenVBand="0" w:oddHBand="0" w:evenHBand="0" w:firstRowFirstColumn="0" w:firstRowLastColumn="0" w:lastRowFirstColumn="0" w:lastRowLastColumn="0"/>
+              <w:rPr>
+                <w:rFonts w:ascii="Helvetica" w:hAnsi="Helvetica" w:cs="Helvetica"/>
+              </w:rPr>
+            </w:pPr>
+            <w:r>
+              <w:rPr>
+                <w:rFonts w:ascii="Helvetica" w:hAnsi="Helvetica" w:cs="Helvetica"/>
+              </w:rPr>
+              <w:t>T12</w:t>
+            </w:r>
+          </w:p>
+        </w:tc>
+      </w:tr>
+      <w:tr>
+        <w:trPr>
+          <w:trHeight w:val="346"/>
+        </w:trPr>
+        <w:tc>
+          <w:tcPr>
+            <w:cnfStyle w:val="001000000000" w:firstRow="0" w:lastRow="0" w:firstColumn="1" w:lastColumn="0" w:oddVBand="0" w:evenVBand="0" w:oddHBand="0" w:evenHBand="0" w:firstRowFirstColumn="0" w:firstRowLastColumn="0" w:lastRowFirstColumn="0" w:lastRowLastColumn="0"/>
+            <w:tcW w:w="0" w:type="auto"/>
+            <w:tcBorders>
+              <w:top w:val="single" w:sz="4" w:space="0" w:color="E59EDC" w:themeColor="accent5" w:themeTint="66"/>
+              <w:left w:val="single" w:sz="4" w:space="0" w:color="E59EDC" w:themeColor="accent5" w:themeTint="66"/>
+              <w:right w:val="single" w:sz="4" w:space="0" w:color="E59EDC" w:themeColor="accent5" w:themeTint="66"/>
+            </w:tcBorders>
+            <w:vAlign w:val="center"/>
+          </w:tcPr>
+          <w:p>
+            <w:pPr>
+              <w:spacing w:after="0" w:line="240" w:lineRule="auto"/>
+              <w:jc w:val="center"/>
+              <w:rPr>
+                <w:rFonts w:ascii="Helvetica" w:hAnsi="Helvetica" w:cs="Helvetica"/>
+                <w:i w:val="0"/>
+                <w:iCs w:val="0"/>
+              </w:rPr>
+            </w:pPr>
+            <w:r>
+              <w:rPr>
+                <w:rFonts w:ascii="Helvetica" w:hAnsi="Helvetica" w:cs="Helvetica"/>
+                <w:i w:val="0"/>
+                <w:iCs w:val="0"/>
+              </w:rPr>
+              <w:t>T3</w:t>
+            </w:r>
+          </w:p>
+        </w:tc>
+        <w:tc>
+          <w:tcPr>
+            <w:tcW w:w="0" w:type="auto"/>
+            <w:tcBorders>
+              <w:left w:val="single" w:sz="4" w:space="0" w:color="E59EDC" w:themeColor="accent5" w:themeTint="66"/>
+              <w:right w:val="single" w:sz="4" w:space="0" w:color="E59EDC" w:themeColor="accent5" w:themeTint="66"/>
+            </w:tcBorders>
+            <w:vAlign w:val="center"/>
+          </w:tcPr>
+          <w:p>
+            <w:pPr>
+              <w:spacing w:after="0" w:line="240" w:lineRule="auto"/>
+              <w:jc w:val="center"/>
+              <w:cnfStyle w:val="000000000000" w:firstRow="0" w:lastRow="0" w:firstColumn="0" w:lastColumn="0" w:oddVBand="0" w:evenVBand="0" w:oddHBand="0" w:evenHBand="0" w:firstRowFirstColumn="0" w:firstRowLastColumn="0" w:lastRowFirstColumn="0" w:lastRowLastColumn="0"/>
+              <w:rPr>
+                <w:rFonts w:ascii="Helvetica" w:hAnsi="Helvetica" w:cs="Helvetica"/>
+              </w:rPr>
+            </w:pPr>
+            <w:r>
+              <w:rPr>
+                <w:rFonts w:ascii="Helvetica" w:hAnsi="Helvetica" w:cs="Helvetica"/>
+              </w:rPr>
+              <w:t>Create delivery person</w:t>
+            </w:r>
+          </w:p>
+        </w:tc>
+        <w:tc>
+          <w:tcPr>
+            <w:tcW w:w="0" w:type="auto"/>
+            <w:tcBorders>
+              <w:left w:val="single" w:sz="4" w:space="0" w:color="E59EDC" w:themeColor="accent5" w:themeTint="66"/>
+            </w:tcBorders>
+            <w:vAlign w:val="center"/>
+          </w:tcPr>
+          <w:p>
+            <w:pPr>
+              <w:spacing w:after="0" w:line="240" w:lineRule="auto"/>
+              <w:jc w:val="center"/>
+              <w:cnfStyle w:val="000000000000" w:firstRow="0" w:lastRow="0" w:firstColumn="0" w:lastColumn="0" w:oddVBand="0" w:evenVBand="0" w:oddHBand="0" w:evenHBand="0" w:firstRowFirstColumn="0" w:firstRowLastColumn="0" w:lastRowFirstColumn="0" w:lastRowLastColumn="0"/>
+              <w:rPr>
+                <w:rFonts w:ascii="Helvetica" w:hAnsi="Helvetica" w:cs="Helvetica"/>
+              </w:rPr>
+            </w:pPr>
+            <w:r>
+              <w:rPr>
+                <w:rFonts w:ascii="Helvetica" w:hAnsi="Helvetica" w:cs="Helvetica"/>
+              </w:rPr>
+              <w:t>3</w:t>
+            </w:r>
+          </w:p>
+        </w:tc>
+        <w:tc>
+          <w:tcPr>
+            <w:tcW w:w="0" w:type="auto"/>
+            <w:vAlign w:val="center"/>
+          </w:tcPr>
+          <w:p>
+            <w:pPr>
+              <w:spacing w:after="0" w:line="240" w:lineRule="auto"/>
+              <w:jc w:val="center"/>
+              <w:cnfStyle w:val="000000000000" w:firstRow="0" w:lastRow="0" w:firstColumn="0" w:lastColumn="0" w:oddVBand="0" w:evenVBand="0" w:oddHBand="0" w:evenHBand="0" w:firstRowFirstColumn="0" w:firstRowLastColumn="0" w:lastRowFirstColumn="0" w:lastRowLastColumn="0"/>
+              <w:rPr>
+                <w:rFonts w:ascii="Helvetica" w:hAnsi="Helvetica" w:cs="Helvetica"/>
+              </w:rPr>
+            </w:pPr>
+            <w:r>
+              <w:rPr>
+                <w:rFonts w:ascii="Helvetica" w:hAnsi="Helvetica" w:cs="Helvetica"/>
+              </w:rPr>
+              <w:t>T12</w:t>
+            </w:r>
+          </w:p>
+        </w:tc>
+      </w:tr>
+      <w:tr>
+        <w:trPr>
+          <w:trHeight w:val="346"/>
+        </w:trPr>
+        <w:tc>
+          <w:tcPr>
+            <w:cnfStyle w:val="001000000000" w:firstRow="0" w:lastRow="0" w:firstColumn="1" w:lastColumn="0" w:oddVBand="0" w:evenVBand="0" w:oddHBand="0" w:evenHBand="0" w:firstRowFirstColumn="0" w:firstRowLastColumn="0" w:lastRowFirstColumn="0" w:lastRowLastColumn="0"/>
+            <w:tcW w:w="0" w:type="auto"/>
+            <w:tcBorders>
+              <w:top w:val="single" w:sz="4" w:space="0" w:color="E59EDC" w:themeColor="accent5" w:themeTint="66"/>
+              <w:left w:val="single" w:sz="4" w:space="0" w:color="E59EDC" w:themeColor="accent5" w:themeTint="66"/>
+              <w:right w:val="single" w:sz="4" w:space="0" w:color="E59EDC" w:themeColor="accent5" w:themeTint="66"/>
+            </w:tcBorders>
+            <w:vAlign w:val="center"/>
+          </w:tcPr>
+          <w:p>
+            <w:pPr>
+              <w:spacing w:after="0" w:line="240" w:lineRule="auto"/>
+              <w:jc w:val="center"/>
+              <w:rPr>
+                <w:rFonts w:ascii="Helvetica" w:hAnsi="Helvetica" w:cs="Helvetica"/>
+                <w:i w:val="0"/>
+                <w:iCs w:val="0"/>
+              </w:rPr>
+            </w:pPr>
+            <w:r>
+              <w:rPr>
+                <w:rFonts w:ascii="Helvetica" w:hAnsi="Helvetica" w:cs="Helvetica"/>
+                <w:i w:val="0"/>
+                <w:iCs w:val="0"/>
+              </w:rPr>
+              <w:t>T4</w:t>
+            </w:r>
+          </w:p>
+        </w:tc>
+        <w:tc>
+          <w:tcPr>
+            <w:tcW w:w="0" w:type="auto"/>
+            <w:tcBorders>
+              <w:left w:val="single" w:sz="4" w:space="0" w:color="E59EDC" w:themeColor="accent5" w:themeTint="66"/>
+              <w:right w:val="single" w:sz="4" w:space="0" w:color="E59EDC" w:themeColor="accent5" w:themeTint="66"/>
+            </w:tcBorders>
+            <w:shd w:val="clear" w:color="auto" w:fill="F2CEED" w:themeFill="accent5" w:themeFillTint="33"/>
+            <w:vAlign w:val="center"/>
+          </w:tcPr>
+          <w:p>
+            <w:pPr>
+              <w:spacing w:after="0" w:line="240" w:lineRule="auto"/>
+              <w:jc w:val="center"/>
+              <w:cnfStyle w:val="000000000000" w:firstRow="0" w:lastRow="0" w:firstColumn="0" w:lastColumn="0" w:oddVBand="0" w:evenVBand="0" w:oddHBand="0" w:evenHBand="0" w:firstRowFirstColumn="0" w:firstRowLastColumn="0" w:lastRowFirstColumn="0" w:lastRowLastColumn="0"/>
+              <w:rPr>
+                <w:rFonts w:ascii="Helvetica" w:hAnsi="Helvetica" w:cs="Helvetica"/>
+              </w:rPr>
+            </w:pPr>
+            <w:r>
+              <w:rPr>
+                <w:rFonts w:ascii="Helvetica" w:hAnsi="Helvetica" w:cs="Helvetica"/>
+              </w:rPr>
+              <w:t>Create order book</w:t>
+            </w:r>
+          </w:p>
+        </w:tc>
+        <w:tc>
+          <w:tcPr>
+            <w:tcW w:w="0" w:type="auto"/>
+            <w:tcBorders>
+              <w:left w:val="single" w:sz="4" w:space="0" w:color="E59EDC" w:themeColor="accent5" w:themeTint="66"/>
+            </w:tcBorders>
+            <w:shd w:val="clear" w:color="auto" w:fill="F2CEED" w:themeFill="accent5" w:themeFillTint="33"/>
+            <w:vAlign w:val="center"/>
+          </w:tcPr>
+          <w:p>
+            <w:pPr>
+              <w:spacing w:after="0" w:line="240" w:lineRule="auto"/>
+              <w:jc w:val="center"/>
+              <w:cnfStyle w:val="000000000000" w:firstRow="0" w:lastRow="0" w:firstColumn="0" w:lastColumn="0" w:oddVBand="0" w:evenVBand="0" w:oddHBand="0" w:evenHBand="0" w:firstRowFirstColumn="0" w:firstRowLastColumn="0" w:lastRowFirstColumn="0" w:lastRowLastColumn="0"/>
+              <w:rPr>
+                <w:rFonts w:ascii="Helvetica" w:hAnsi="Helvetica" w:cs="Helvetica"/>
+              </w:rPr>
+            </w:pPr>
+            <w:r>
+              <w:rPr>
+                <w:rFonts w:ascii="Helvetica" w:hAnsi="Helvetica" w:cs="Helvetica"/>
+              </w:rPr>
+              <w:t>3</w:t>
+            </w:r>
+          </w:p>
+        </w:tc>
+        <w:tc>
+          <w:tcPr>
+            <w:tcW w:w="0" w:type="auto"/>
+            <w:shd w:val="clear" w:color="auto" w:fill="F2CEED" w:themeFill="accent5" w:themeFillTint="33"/>
+            <w:vAlign w:val="center"/>
+          </w:tcPr>
+          <w:p>
+            <w:pPr>
+              <w:spacing w:after="0" w:line="240" w:lineRule="auto"/>
+              <w:jc w:val="center"/>
+              <w:cnfStyle w:val="000000000000" w:firstRow="0" w:lastRow="0" w:firstColumn="0" w:lastColumn="0" w:oddVBand="0" w:evenVBand="0" w:oddHBand="0" w:evenHBand="0" w:firstRowFirstColumn="0" w:firstRowLastColumn="0" w:lastRowFirstColumn="0" w:lastRowLastColumn="0"/>
+              <w:rPr>
+                <w:rFonts w:ascii="Helvetica" w:hAnsi="Helvetica" w:cs="Helvetica"/>
+              </w:rPr>
+            </w:pPr>
+            <w:r>
+              <w:rPr>
+                <w:rFonts w:ascii="Helvetica" w:hAnsi="Helvetica" w:cs="Helvetica"/>
+              </w:rPr>
+              <w:t>T12</w:t>
+            </w:r>
+          </w:p>
+        </w:tc>
+      </w:tr>
+      <w:tr>
+        <w:trPr>
+          <w:trHeight w:val="346"/>
+        </w:trPr>
+        <w:tc>
+          <w:tcPr>
+            <w:cnfStyle w:val="001000000000" w:firstRow="0" w:lastRow="0" w:firstColumn="1" w:lastColumn="0" w:oddVBand="0" w:evenVBand="0" w:oddHBand="0" w:evenHBand="0" w:firstRowFirstColumn="0" w:firstRowLastColumn="0" w:lastRowFirstColumn="0" w:lastRowLastColumn="0"/>
+            <w:tcW w:w="0" w:type="auto"/>
+            <w:tcBorders>
+              <w:top w:val="single" w:sz="4" w:space="0" w:color="E59EDC" w:themeColor="accent5" w:themeTint="66"/>
+              <w:left w:val="single" w:sz="4" w:space="0" w:color="E59EDC" w:themeColor="accent5" w:themeTint="66"/>
+              <w:right w:val="single" w:sz="4" w:space="0" w:color="E59EDC" w:themeColor="accent5" w:themeTint="66"/>
+            </w:tcBorders>
+            <w:vAlign w:val="center"/>
+          </w:tcPr>
+          <w:p>
+            <w:pPr>
+              <w:spacing w:after="0" w:line="240" w:lineRule="auto"/>
+              <w:jc w:val="center"/>
+              <w:rPr>
+                <w:rFonts w:ascii="Helvetica" w:hAnsi="Helvetica" w:cs="Helvetica"/>
+                <w:i w:val="0"/>
+                <w:iCs w:val="0"/>
+              </w:rPr>
+            </w:pPr>
+            <w:r>
+              <w:rPr>
+                <w:rFonts w:ascii="Helvetica" w:hAnsi="Helvetica" w:cs="Helvetica"/>
+                <w:i w:val="0"/>
+                <w:iCs w:val="0"/>
+              </w:rPr>
+              <w:t>T5</w:t>
+            </w:r>
+          </w:p>
+        </w:tc>
+        <w:tc>
+          <w:tcPr>
+            <w:tcW w:w="0" w:type="auto"/>
+            <w:tcBorders>
+              <w:left w:val="single" w:sz="4" w:space="0" w:color="E59EDC" w:themeColor="accent5" w:themeTint="66"/>
+              <w:right w:val="single" w:sz="4" w:space="0" w:color="E59EDC" w:themeColor="accent5" w:themeTint="66"/>
+            </w:tcBorders>
+            <w:vAlign w:val="center"/>
+          </w:tcPr>
+          <w:p>
+            <w:pPr>
+              <w:spacing w:after="0" w:line="240" w:lineRule="auto"/>
+              <w:jc w:val="center"/>
+              <w:cnfStyle w:val="000000000000" w:firstRow="0" w:lastRow="0" w:firstColumn="0" w:lastColumn="0" w:oddVBand="0" w:evenVBand="0" w:oddHBand="0" w:evenHBand="0" w:firstRowFirstColumn="0" w:firstRowLastColumn="0" w:lastRowFirstColumn="0" w:lastRowLastColumn="0"/>
+              <w:rPr>
+                <w:rFonts w:ascii="Helvetica" w:hAnsi="Helvetica" w:cs="Helvetica"/>
+              </w:rPr>
+            </w:pPr>
+            <w:r>
+              <w:rPr>
+                <w:rFonts w:ascii="Helvetica" w:hAnsi="Helvetica" w:cs="Helvetica"/>
+              </w:rPr>
+              <w:t>Create publications</w:t>
+            </w:r>
+          </w:p>
+        </w:tc>
+        <w:tc>
+          <w:tcPr>
+            <w:tcW w:w="0" w:type="auto"/>
+            <w:tcBorders>
+              <w:left w:val="single" w:sz="4" w:space="0" w:color="E59EDC" w:themeColor="accent5" w:themeTint="66"/>
+            </w:tcBorders>
+            <w:vAlign w:val="center"/>
+          </w:tcPr>
+          <w:p>
+            <w:pPr>
+              <w:spacing w:after="0" w:line="240" w:lineRule="auto"/>
+              <w:jc w:val="center"/>
+              <w:cnfStyle w:val="000000000000" w:firstRow="0" w:lastRow="0" w:firstColumn="0" w:lastColumn="0" w:oddVBand="0" w:evenVBand="0" w:oddHBand="0" w:evenHBand="0" w:firstRowFirstColumn="0" w:firstRowLastColumn="0" w:lastRowFirstColumn="0" w:lastRowLastColumn="0"/>
+              <w:rPr>
+                <w:rFonts w:ascii="Helvetica" w:hAnsi="Helvetica" w:cs="Helvetica"/>
+              </w:rPr>
+            </w:pPr>
+            <w:r>
+              <w:rPr>
+                <w:rFonts w:ascii="Helvetica" w:hAnsi="Helvetica" w:cs="Helvetica"/>
+              </w:rPr>
+              <w:t>3</w:t>
+            </w:r>
+          </w:p>
+        </w:tc>
+        <w:tc>
+          <w:tcPr>
+            <w:tcW w:w="0" w:type="auto"/>
+            <w:vAlign w:val="center"/>
+          </w:tcPr>
+          <w:p>
+            <w:pPr>
+              <w:spacing w:after="0" w:line="240" w:lineRule="auto"/>
+              <w:jc w:val="center"/>
+              <w:cnfStyle w:val="000000000000" w:firstRow="0" w:lastRow="0" w:firstColumn="0" w:lastColumn="0" w:oddVBand="0" w:evenVBand="0" w:oddHBand="0" w:evenHBand="0" w:firstRowFirstColumn="0" w:firstRowLastColumn="0" w:lastRowFirstColumn="0" w:lastRowLastColumn="0"/>
+              <w:rPr>
+                <w:rFonts w:ascii="Helvetica" w:hAnsi="Helvetica" w:cs="Helvetica"/>
+              </w:rPr>
+            </w:pPr>
+            <w:r>
+              <w:rPr>
+                <w:rFonts w:ascii="Helvetica" w:hAnsi="Helvetica" w:cs="Helvetica"/>
+              </w:rPr>
+              <w:t>T12</w:t>
+            </w:r>
+          </w:p>
+        </w:tc>
+      </w:tr>
+      <w:tr>
+        <w:trPr>
+          <w:trHeight w:val="346"/>
+        </w:trPr>
+        <w:tc>
+          <w:tcPr>
+            <w:cnfStyle w:val="001000000000" w:firstRow="0" w:lastRow="0" w:firstColumn="1" w:lastColumn="0" w:oddVBand="0" w:evenVBand="0" w:oddHBand="0" w:evenHBand="0" w:firstRowFirstColumn="0" w:firstRowLastColumn="0" w:lastRowFirstColumn="0" w:lastRowLastColumn="0"/>
+            <w:tcW w:w="0" w:type="auto"/>
+            <w:tcBorders>
+              <w:top w:val="single" w:sz="4" w:space="0" w:color="E59EDC" w:themeColor="accent5" w:themeTint="66"/>
+              <w:left w:val="single" w:sz="4" w:space="0" w:color="E59EDC" w:themeColor="accent5" w:themeTint="66"/>
+              <w:right w:val="single" w:sz="4" w:space="0" w:color="E59EDC" w:themeColor="accent5" w:themeTint="66"/>
+            </w:tcBorders>
+            <w:vAlign w:val="center"/>
+          </w:tcPr>
+          <w:p>
+            <w:pPr>
+              <w:spacing w:after="0" w:line="240" w:lineRule="auto"/>
+              <w:jc w:val="center"/>
+              <w:rPr>
+                <w:rFonts w:ascii="Helvetica" w:hAnsi="Helvetica" w:cs="Helvetica"/>
+                <w:i w:val="0"/>
+                <w:iCs w:val="0"/>
+              </w:rPr>
+            </w:pPr>
+            <w:r>
+              <w:rPr>
+                <w:rFonts w:ascii="Helvetica" w:hAnsi="Helvetica" w:cs="Helvetica"/>
+                <w:i w:val="0"/>
+                <w:iCs w:val="0"/>
+              </w:rPr>
+              <w:t>T6</w:t>
+            </w:r>
+          </w:p>
+        </w:tc>
+        <w:tc>
+          <w:tcPr>
+            <w:tcW w:w="0" w:type="auto"/>
+            <w:tcBorders>
+              <w:left w:val="single" w:sz="4" w:space="0" w:color="E59EDC" w:themeColor="accent5" w:themeTint="66"/>
+              <w:right w:val="single" w:sz="4" w:space="0" w:color="E59EDC" w:themeColor="accent5" w:themeTint="66"/>
+            </w:tcBorders>
+            <w:shd w:val="clear" w:color="auto" w:fill="F2CEED" w:themeFill="accent5" w:themeFillTint="33"/>
+            <w:vAlign w:val="center"/>
+          </w:tcPr>
+          <w:p>
+            <w:pPr>
+              <w:spacing w:after="0" w:line="240" w:lineRule="auto"/>
+              <w:jc w:val="center"/>
+              <w:cnfStyle w:val="000000000000" w:firstRow="0" w:lastRow="0" w:firstColumn="0" w:lastColumn="0" w:oddVBand="0" w:evenVBand="0" w:oddHBand="0" w:evenHBand="0" w:firstRowFirstColumn="0" w:firstRowLastColumn="0" w:lastRowFirstColumn="0" w:lastRowLastColumn="0"/>
+              <w:rPr>
+                <w:rFonts w:ascii="Helvetica" w:hAnsi="Helvetica" w:cs="Helvetica"/>
+              </w:rPr>
+            </w:pPr>
+            <w:r>
+              <w:rPr>
+                <w:rFonts w:ascii="Helvetica" w:hAnsi="Helvetica" w:cs="Helvetica"/>
+              </w:rPr>
+              <w:t>Create delivery docket</w:t>
+            </w:r>
+          </w:p>
+        </w:tc>
+        <w:tc>
+          <w:tcPr>
+            <w:tcW w:w="0" w:type="auto"/>
+            <w:tcBorders>
+              <w:left w:val="single" w:sz="4" w:space="0" w:color="E59EDC" w:themeColor="accent5" w:themeTint="66"/>
+            </w:tcBorders>
+            <w:shd w:val="clear" w:color="auto" w:fill="F2CEED" w:themeFill="accent5" w:themeFillTint="33"/>
+            <w:vAlign w:val="center"/>
+          </w:tcPr>
+          <w:p>
+            <w:pPr>
+              <w:spacing w:after="0" w:line="240" w:lineRule="auto"/>
+              <w:jc w:val="center"/>
+              <w:cnfStyle w:val="000000000000" w:firstRow="0" w:lastRow="0" w:firstColumn="0" w:lastColumn="0" w:oddVBand="0" w:evenVBand="0" w:oddHBand="0" w:evenHBand="0" w:firstRowFirstColumn="0" w:firstRowLastColumn="0" w:lastRowFirstColumn="0" w:lastRowLastColumn="0"/>
+              <w:rPr>
+                <w:rFonts w:ascii="Helvetica" w:hAnsi="Helvetica" w:cs="Helvetica"/>
+              </w:rPr>
+            </w:pPr>
+            <w:r>
+              <w:rPr>
+                <w:rFonts w:ascii="Helvetica" w:hAnsi="Helvetica" w:cs="Helvetica"/>
+              </w:rPr>
+              <w:t>3</w:t>
+            </w:r>
+          </w:p>
+        </w:tc>
+        <w:tc>
+          <w:tcPr>
+            <w:tcW w:w="0" w:type="auto"/>
+            <w:shd w:val="clear" w:color="auto" w:fill="F2CEED" w:themeFill="accent5" w:themeFillTint="33"/>
+            <w:vAlign w:val="center"/>
+          </w:tcPr>
+          <w:p>
+            <w:pPr>
+              <w:spacing w:after="0" w:line="240" w:lineRule="auto"/>
+              <w:jc w:val="center"/>
+              <w:cnfStyle w:val="000000000000" w:firstRow="0" w:lastRow="0" w:firstColumn="0" w:lastColumn="0" w:oddVBand="0" w:evenVBand="0" w:oddHBand="0" w:evenHBand="0" w:firstRowFirstColumn="0" w:firstRowLastColumn="0" w:lastRowFirstColumn="0" w:lastRowLastColumn="0"/>
+              <w:rPr>
+                <w:rFonts w:ascii="Helvetica" w:hAnsi="Helvetica" w:cs="Helvetica"/>
+              </w:rPr>
+            </w:pPr>
+            <w:r>
+              <w:rPr>
+                <w:rFonts w:ascii="Helvetica" w:hAnsi="Helvetica" w:cs="Helvetica"/>
+              </w:rPr>
+              <w:t>T12</w:t>
+            </w:r>
+          </w:p>
+        </w:tc>
+      </w:tr>
+      <w:tr>
+        <w:trPr>
+          <w:trHeight w:val="346"/>
+        </w:trPr>
+        <w:tc>
+          <w:tcPr>
+            <w:cnfStyle w:val="001000000000" w:firstRow="0" w:lastRow="0" w:firstColumn="1" w:lastColumn="0" w:oddVBand="0" w:evenVBand="0" w:oddHBand="0" w:evenHBand="0" w:firstRowFirstColumn="0" w:firstRowLastColumn="0" w:lastRowFirstColumn="0" w:lastRowLastColumn="0"/>
+            <w:tcW w:w="0" w:type="auto"/>
+            <w:tcBorders>
+              <w:top w:val="single" w:sz="4" w:space="0" w:color="E59EDC" w:themeColor="accent5" w:themeTint="66"/>
+              <w:left w:val="single" w:sz="4" w:space="0" w:color="E59EDC" w:themeColor="accent5" w:themeTint="66"/>
+              <w:right w:val="single" w:sz="4" w:space="0" w:color="E59EDC" w:themeColor="accent5" w:themeTint="66"/>
+            </w:tcBorders>
+            <w:vAlign w:val="center"/>
+          </w:tcPr>
+          <w:p>
+            <w:pPr>
+              <w:spacing w:after="0" w:line="240" w:lineRule="auto"/>
+              <w:jc w:val="center"/>
+              <w:rPr>
+                <w:rFonts w:ascii="Helvetica" w:hAnsi="Helvetica" w:cs="Helvetica"/>
+                <w:i w:val="0"/>
+                <w:iCs w:val="0"/>
+              </w:rPr>
+            </w:pPr>
+            <w:r>
+              <w:rPr>
+                <w:rFonts w:ascii="Helvetica" w:hAnsi="Helvetica" w:cs="Helvetica"/>
+                <w:i w:val="0"/>
+                <w:iCs w:val="0"/>
+              </w:rPr>
+              <w:t>T7</w:t>
+            </w:r>
+          </w:p>
+        </w:tc>
+        <w:tc>
+          <w:tcPr>
+            <w:tcW w:w="0" w:type="auto"/>
+            <w:tcBorders>
+              <w:left w:val="single" w:sz="4" w:space="0" w:color="E59EDC" w:themeColor="accent5" w:themeTint="66"/>
+              <w:right w:val="single" w:sz="4" w:space="0" w:color="E59EDC" w:themeColor="accent5" w:themeTint="66"/>
+            </w:tcBorders>
+            <w:vAlign w:val="center"/>
+          </w:tcPr>
+          <w:p>
+            <w:pPr>
+              <w:spacing w:after="0" w:line="240" w:lineRule="auto"/>
+              <w:jc w:val="center"/>
+              <w:cnfStyle w:val="000000000000" w:firstRow="0" w:lastRow="0" w:firstColumn="0" w:lastColumn="0" w:oddVBand="0" w:evenVBand="0" w:oddHBand="0" w:evenHBand="0" w:firstRowFirstColumn="0" w:firstRowLastColumn="0" w:lastRowFirstColumn="0" w:lastRowLastColumn="0"/>
+              <w:rPr>
+                <w:rFonts w:ascii="Helvetica" w:hAnsi="Helvetica" w:cs="Helvetica"/>
+              </w:rPr>
+            </w:pPr>
+            <w:r>
+              <w:rPr>
+                <w:rFonts w:ascii="Helvetica" w:hAnsi="Helvetica" w:cs="Helvetica"/>
+              </w:rPr>
+              <w:t>Create delivery area</w:t>
+            </w:r>
+          </w:p>
+        </w:tc>
+        <w:tc>
+          <w:tcPr>
+            <w:tcW w:w="0" w:type="auto"/>
+            <w:tcBorders>
+              <w:left w:val="single" w:sz="4" w:space="0" w:color="E59EDC" w:themeColor="accent5" w:themeTint="66"/>
+            </w:tcBorders>
+            <w:vAlign w:val="center"/>
+          </w:tcPr>
+          <w:p>
+            <w:pPr>
+              <w:spacing w:after="0" w:line="240" w:lineRule="auto"/>
+              <w:jc w:val="center"/>
+              <w:cnfStyle w:val="000000000000" w:firstRow="0" w:lastRow="0" w:firstColumn="0" w:lastColumn="0" w:oddVBand="0" w:evenVBand="0" w:oddHBand="0" w:evenHBand="0" w:firstRowFirstColumn="0" w:firstRowLastColumn="0" w:lastRowFirstColumn="0" w:lastRowLastColumn="0"/>
+              <w:rPr>
+                <w:rFonts w:ascii="Helvetica" w:hAnsi="Helvetica" w:cs="Helvetica"/>
+              </w:rPr>
+            </w:pPr>
+            <w:r>
+              <w:rPr>
+                <w:rFonts w:ascii="Helvetica" w:hAnsi="Helvetica" w:cs="Helvetica"/>
+              </w:rPr>
+              <w:t>3</w:t>
+            </w:r>
+          </w:p>
+        </w:tc>
+        <w:tc>
+          <w:tcPr>
+            <w:tcW w:w="0" w:type="auto"/>
+            <w:vAlign w:val="center"/>
+          </w:tcPr>
+          <w:p>
+            <w:pPr>
+              <w:spacing w:after="0" w:line="240" w:lineRule="auto"/>
+              <w:jc w:val="center"/>
+              <w:cnfStyle w:val="000000000000" w:firstRow="0" w:lastRow="0" w:firstColumn="0" w:lastColumn="0" w:oddVBand="0" w:evenVBand="0" w:oddHBand="0" w:evenHBand="0" w:firstRowFirstColumn="0" w:firstRowLastColumn="0" w:lastRowFirstColumn="0" w:lastRowLastColumn="0"/>
+              <w:rPr>
+                <w:rFonts w:ascii="Helvetica" w:hAnsi="Helvetica" w:cs="Helvetica"/>
+              </w:rPr>
+            </w:pPr>
+            <w:r>
+              <w:rPr>
+                <w:rFonts w:ascii="Helvetica" w:hAnsi="Helvetica" w:cs="Helvetica"/>
+              </w:rPr>
+              <w:t>T12</w:t>
+            </w:r>
+          </w:p>
+        </w:tc>
+      </w:tr>
+      <w:tr>
+        <w:trPr>
+          <w:trHeight w:val="346"/>
+        </w:trPr>
+        <w:tc>
+          <w:tcPr>
+            <w:cnfStyle w:val="001000000000" w:firstRow="0" w:lastRow="0" w:firstColumn="1" w:lastColumn="0" w:oddVBand="0" w:evenVBand="0" w:oddHBand="0" w:evenHBand="0" w:firstRowFirstColumn="0" w:firstRowLastColumn="0" w:lastRowFirstColumn="0" w:lastRowLastColumn="0"/>
+            <w:tcW w:w="0" w:type="auto"/>
+            <w:tcBorders>
+              <w:top w:val="single" w:sz="4" w:space="0" w:color="E59EDC" w:themeColor="accent5" w:themeTint="66"/>
+              <w:left w:val="single" w:sz="4" w:space="0" w:color="E59EDC" w:themeColor="accent5" w:themeTint="66"/>
+              <w:right w:val="single" w:sz="4" w:space="0" w:color="E59EDC" w:themeColor="accent5" w:themeTint="66"/>
+            </w:tcBorders>
+            <w:vAlign w:val="center"/>
+          </w:tcPr>
+          <w:p>
+            <w:pPr>
+              <w:spacing w:after="0" w:line="240" w:lineRule="auto"/>
+              <w:jc w:val="center"/>
+              <w:rPr>
+                <w:rFonts w:ascii="Helvetica" w:hAnsi="Helvetica" w:cs="Helvetica"/>
+                <w:i w:val="0"/>
+                <w:iCs w:val="0"/>
+              </w:rPr>
+            </w:pPr>
+            <w:r>
+              <w:rPr>
+                <w:rFonts w:ascii="Helvetica" w:hAnsi="Helvetica" w:cs="Helvetica"/>
+                <w:i w:val="0"/>
+                <w:iCs w:val="0"/>
+              </w:rPr>
+              <w:t>T8</w:t>
+            </w:r>
+          </w:p>
+        </w:tc>
+        <w:tc>
+          <w:tcPr>
+            <w:tcW w:w="0" w:type="auto"/>
+            <w:tcBorders>
+              <w:left w:val="single" w:sz="4" w:space="0" w:color="E59EDC" w:themeColor="accent5" w:themeTint="66"/>
+              <w:right w:val="single" w:sz="4" w:space="0" w:color="E59EDC" w:themeColor="accent5" w:themeTint="66"/>
+            </w:tcBorders>
+            <w:shd w:val="clear" w:color="auto" w:fill="F2CEED" w:themeFill="accent5" w:themeFillTint="33"/>
+            <w:vAlign w:val="center"/>
+          </w:tcPr>
+          <w:p>
+            <w:pPr>
+              <w:spacing w:after="0" w:line="240" w:lineRule="auto"/>
+              <w:jc w:val="center"/>
+              <w:cnfStyle w:val="000000000000" w:firstRow="0" w:lastRow="0" w:firstColumn="0" w:lastColumn="0" w:oddVBand="0" w:evenVBand="0" w:oddHBand="0" w:evenHBand="0" w:firstRowFirstColumn="0" w:firstRowLastColumn="0" w:lastRowFirstColumn="0" w:lastRowLastColumn="0"/>
+              <w:rPr>
+                <w:rFonts w:ascii="Helvetica" w:hAnsi="Helvetica" w:cs="Helvetica"/>
+              </w:rPr>
+            </w:pPr>
+            <w:r>
+              <w:rPr>
+                <w:rFonts w:ascii="Helvetica" w:hAnsi="Helvetica" w:cs="Helvetica"/>
+              </w:rPr>
+              <w:t>Create bill</w:t>
+            </w:r>
+          </w:p>
+        </w:tc>
+        <w:tc>
+          <w:tcPr>
+            <w:tcW w:w="0" w:type="auto"/>
+            <w:tcBorders>
+              <w:left w:val="single" w:sz="4" w:space="0" w:color="E59EDC" w:themeColor="accent5" w:themeTint="66"/>
+            </w:tcBorders>
+            <w:shd w:val="clear" w:color="auto" w:fill="F2CEED" w:themeFill="accent5" w:themeFillTint="33"/>
+            <w:vAlign w:val="center"/>
+          </w:tcPr>
+          <w:p>
+            <w:pPr>
+              <w:spacing w:after="0" w:line="240" w:lineRule="auto"/>
+              <w:jc w:val="center"/>
+              <w:cnfStyle w:val="000000000000" w:firstRow="0" w:lastRow="0" w:firstColumn="0" w:lastColumn="0" w:oddVBand="0" w:evenVBand="0" w:oddHBand="0" w:evenHBand="0" w:firstRowFirstColumn="0" w:firstRowLastColumn="0" w:lastRowFirstColumn="0" w:lastRowLastColumn="0"/>
+              <w:rPr>
+                <w:rFonts w:ascii="Helvetica" w:hAnsi="Helvetica" w:cs="Helvetica"/>
+              </w:rPr>
+            </w:pPr>
+            <w:r>
+              <w:rPr>
+                <w:rFonts w:ascii="Helvetica" w:hAnsi="Helvetica" w:cs="Helvetica"/>
+              </w:rPr>
+              <w:t>3</w:t>
+            </w:r>
+          </w:p>
+        </w:tc>
+        <w:tc>
+          <w:tcPr>
+            <w:tcW w:w="0" w:type="auto"/>
+            <w:shd w:val="clear" w:color="auto" w:fill="F2CEED" w:themeFill="accent5" w:themeFillTint="33"/>
+            <w:vAlign w:val="center"/>
+          </w:tcPr>
+          <w:p>
+            <w:pPr>
+              <w:spacing w:after="0" w:line="240" w:lineRule="auto"/>
+              <w:jc w:val="center"/>
+              <w:cnfStyle w:val="000000000000" w:firstRow="0" w:lastRow="0" w:firstColumn="0" w:lastColumn="0" w:oddVBand="0" w:evenVBand="0" w:oddHBand="0" w:evenHBand="0" w:firstRowFirstColumn="0" w:firstRowLastColumn="0" w:lastRowFirstColumn="0" w:lastRowLastColumn="0"/>
+              <w:rPr>
+                <w:rFonts w:ascii="Helvetica" w:hAnsi="Helvetica" w:cs="Helvetica"/>
+              </w:rPr>
+            </w:pPr>
+            <w:r>
+              <w:rPr>
+                <w:rFonts w:ascii="Helvetica" w:hAnsi="Helvetica" w:cs="Helvetica"/>
+              </w:rPr>
+              <w:t>T12</w:t>
+            </w:r>
+          </w:p>
+        </w:tc>
+      </w:tr>
+      <w:tr>
+        <w:trPr>
+          <w:trHeight w:val="346"/>
+        </w:trPr>
+        <w:tc>
+          <w:tcPr>
+            <w:cnfStyle w:val="001000000000" w:firstRow="0" w:lastRow="0" w:firstColumn="1" w:lastColumn="0" w:oddVBand="0" w:evenVBand="0" w:oddHBand="0" w:evenHBand="0" w:firstRowFirstColumn="0" w:firstRowLastColumn="0" w:lastRowFirstColumn="0" w:lastRowLastColumn="0"/>
+            <w:tcW w:w="0" w:type="auto"/>
+            <w:tcBorders>
+              <w:top w:val="single" w:sz="4" w:space="0" w:color="E59EDC" w:themeColor="accent5" w:themeTint="66"/>
+              <w:left w:val="single" w:sz="4" w:space="0" w:color="E59EDC" w:themeColor="accent5" w:themeTint="66"/>
+              <w:right w:val="single" w:sz="4" w:space="0" w:color="E59EDC" w:themeColor="accent5" w:themeTint="66"/>
+            </w:tcBorders>
+            <w:vAlign w:val="center"/>
+          </w:tcPr>
+          <w:p>
+            <w:pPr>
+              <w:spacing w:after="0" w:line="240" w:lineRule="auto"/>
+              <w:jc w:val="center"/>
+              <w:rPr>
+                <w:rFonts w:ascii="Helvetica" w:hAnsi="Helvetica" w:cs="Helvetica"/>
+                <w:i w:val="0"/>
+                <w:iCs w:val="0"/>
+              </w:rPr>
+            </w:pPr>
+            <w:r>
+              <w:rPr>
+                <w:rFonts w:ascii="Helvetica" w:hAnsi="Helvetica" w:cs="Helvetica"/>
+                <w:i w:val="0"/>
+                <w:iCs w:val="0"/>
+              </w:rPr>
+              <w:t>T9</w:t>
+            </w:r>
+          </w:p>
+        </w:tc>
+        <w:tc>
+          <w:tcPr>
+            <w:tcW w:w="0" w:type="auto"/>
+            <w:tcBorders>
+              <w:left w:val="single" w:sz="4" w:space="0" w:color="E59EDC" w:themeColor="accent5" w:themeTint="66"/>
+              <w:right w:val="single" w:sz="4" w:space="0" w:color="E59EDC" w:themeColor="accent5" w:themeTint="66"/>
+            </w:tcBorders>
+            <w:vAlign w:val="center"/>
+          </w:tcPr>
+          <w:p>
+            <w:pPr>
+              <w:spacing w:after="0" w:line="240" w:lineRule="auto"/>
+              <w:jc w:val="center"/>
+              <w:cnfStyle w:val="000000000000" w:firstRow="0" w:lastRow="0" w:firstColumn="0" w:lastColumn="0" w:oddVBand="0" w:evenVBand="0" w:oddHBand="0" w:evenHBand="0" w:firstRowFirstColumn="0" w:firstRowLastColumn="0" w:lastRowFirstColumn="0" w:lastRowLastColumn="0"/>
+              <w:rPr>
+                <w:rFonts w:ascii="Helvetica" w:hAnsi="Helvetica" w:cs="Helvetica"/>
+              </w:rPr>
+            </w:pPr>
+            <w:r>
+              <w:rPr>
+                <w:rFonts w:ascii="Helvetica" w:hAnsi="Helvetica" w:cs="Helvetica"/>
+              </w:rPr>
+              <w:t>Set up database</w:t>
+            </w:r>
+          </w:p>
+        </w:tc>
+        <w:tc>
+          <w:tcPr>
+            <w:tcW w:w="0" w:type="auto"/>
+            <w:tcBorders>
+              <w:left w:val="single" w:sz="4" w:space="0" w:color="E59EDC" w:themeColor="accent5" w:themeTint="66"/>
+            </w:tcBorders>
+            <w:vAlign w:val="center"/>
+          </w:tcPr>
+          <w:p>
+            <w:pPr>
+              <w:spacing w:after="0" w:line="240" w:lineRule="auto"/>
+              <w:jc w:val="center"/>
+              <w:cnfStyle w:val="000000000000" w:firstRow="0" w:lastRow="0" w:firstColumn="0" w:lastColumn="0" w:oddVBand="0" w:evenVBand="0" w:oddHBand="0" w:evenHBand="0" w:firstRowFirstColumn="0" w:firstRowLastColumn="0" w:lastRowFirstColumn="0" w:lastRowLastColumn="0"/>
+              <w:rPr>
+                <w:rFonts w:ascii="Helvetica" w:hAnsi="Helvetica" w:cs="Helvetica"/>
+              </w:rPr>
+            </w:pPr>
+            <w:r>
+              <w:rPr>
+                <w:rFonts w:ascii="Helvetica" w:hAnsi="Helvetica" w:cs="Helvetica"/>
+              </w:rPr>
+              <w:t>2</w:t>
+            </w:r>
+          </w:p>
+        </w:tc>
+        <w:tc>
+          <w:tcPr>
+            <w:tcW w:w="0" w:type="auto"/>
+            <w:vAlign w:val="center"/>
+          </w:tcPr>
+          <w:p>
+            <w:pPr>
+              <w:spacing w:after="0" w:line="240" w:lineRule="auto"/>
+              <w:jc w:val="center"/>
+              <w:cnfStyle w:val="000000000000" w:firstRow="0" w:lastRow="0" w:firstColumn="0" w:lastColumn="0" w:oddVBand="0" w:evenVBand="0" w:oddHBand="0" w:evenHBand="0" w:firstRowFirstColumn="0" w:firstRowLastColumn="0" w:lastRowFirstColumn="0" w:lastRowLastColumn="0"/>
+              <w:rPr>
+                <w:rFonts w:ascii="Helvetica" w:hAnsi="Helvetica" w:cs="Helvetica"/>
+              </w:rPr>
+            </w:pPr>
+            <w:r>
+              <w:rPr>
+                <w:rFonts w:ascii="Helvetica" w:hAnsi="Helvetica" w:cs="Helvetica"/>
+              </w:rPr>
+              <w:t>T1</w:t>
+            </w:r>
+          </w:p>
+        </w:tc>
+      </w:tr>
+      <w:tr>
+        <w:trPr>
+          <w:trHeight w:val="346"/>
+        </w:trPr>
+        <w:tc>
+          <w:tcPr>
+            <w:cnfStyle w:val="001000000000" w:firstRow="0" w:lastRow="0" w:firstColumn="1" w:lastColumn="0" w:oddVBand="0" w:evenVBand="0" w:oddHBand="0" w:evenHBand="0" w:firstRowFirstColumn="0" w:firstRowLastColumn="0" w:lastRowFirstColumn="0" w:lastRowLastColumn="0"/>
+            <w:tcW w:w="0" w:type="auto"/>
+            <w:tcBorders>
+              <w:top w:val="single" w:sz="4" w:space="0" w:color="E59EDC" w:themeColor="accent5" w:themeTint="66"/>
+              <w:left w:val="single" w:sz="4" w:space="0" w:color="E59EDC" w:themeColor="accent5" w:themeTint="66"/>
+              <w:right w:val="single" w:sz="4" w:space="0" w:color="E59EDC" w:themeColor="accent5" w:themeTint="66"/>
+            </w:tcBorders>
+            <w:vAlign w:val="center"/>
+          </w:tcPr>
+          <w:p>
+            <w:pPr>
+              <w:spacing w:after="0" w:line="240" w:lineRule="auto"/>
+              <w:jc w:val="center"/>
+              <w:rPr>
+                <w:rFonts w:ascii="Helvetica" w:hAnsi="Helvetica" w:cs="Helvetica"/>
+                <w:i w:val="0"/>
+                <w:iCs w:val="0"/>
+              </w:rPr>
+            </w:pPr>
+            <w:r>
+              <w:rPr>
+                <w:rFonts w:ascii="Helvetica" w:hAnsi="Helvetica" w:cs="Helvetica"/>
+                <w:i w:val="0"/>
+                <w:iCs w:val="0"/>
+              </w:rPr>
+              <w:t>T10</w:t>
+            </w:r>
+          </w:p>
+        </w:tc>
+        <w:tc>
+          <w:tcPr>
+            <w:tcW w:w="0" w:type="auto"/>
+            <w:tcBorders>
+              <w:left w:val="single" w:sz="4" w:space="0" w:color="E59EDC" w:themeColor="accent5" w:themeTint="66"/>
+              <w:right w:val="single" w:sz="4" w:space="0" w:color="E59EDC" w:themeColor="accent5" w:themeTint="66"/>
+            </w:tcBorders>
+            <w:shd w:val="clear" w:color="auto" w:fill="F2CEED" w:themeFill="accent5" w:themeFillTint="33"/>
+            <w:vAlign w:val="center"/>
+          </w:tcPr>
+          <w:p>
+            <w:pPr>
+              <w:spacing w:after="0" w:line="240" w:lineRule="auto"/>
+              <w:jc w:val="center"/>
+              <w:cnfStyle w:val="000000000000" w:firstRow="0" w:lastRow="0" w:firstColumn="0" w:lastColumn="0" w:oddVBand="0" w:evenVBand="0" w:oddHBand="0" w:evenHBand="0" w:firstRowFirstColumn="0" w:firstRowLastColumn="0" w:lastRowFirstColumn="0" w:lastRowLastColumn="0"/>
+              <w:rPr>
+                <w:rFonts w:ascii="Helvetica" w:hAnsi="Helvetica" w:cs="Helvetica"/>
+              </w:rPr>
+            </w:pPr>
+            <w:r>
+              <w:rPr>
+                <w:rFonts w:ascii="Helvetica" w:hAnsi="Helvetica" w:cs="Helvetica"/>
+              </w:rPr>
+              <w:t>Implementing database</w:t>
+            </w:r>
+          </w:p>
+        </w:tc>
+        <w:tc>
+          <w:tcPr>
+            <w:tcW w:w="0" w:type="auto"/>
+            <w:tcBorders>
+              <w:left w:val="single" w:sz="4" w:space="0" w:color="E59EDC" w:themeColor="accent5" w:themeTint="66"/>
+            </w:tcBorders>
+            <w:shd w:val="clear" w:color="auto" w:fill="F2CEED" w:themeFill="accent5" w:themeFillTint="33"/>
+            <w:vAlign w:val="center"/>
+          </w:tcPr>
+          <w:p>
+            <w:pPr>
+              <w:spacing w:after="0" w:line="240" w:lineRule="auto"/>
+              <w:jc w:val="center"/>
+              <w:cnfStyle w:val="000000000000" w:firstRow="0" w:lastRow="0" w:firstColumn="0" w:lastColumn="0" w:oddVBand="0" w:evenVBand="0" w:oddHBand="0" w:evenHBand="0" w:firstRowFirstColumn="0" w:firstRowLastColumn="0" w:lastRowFirstColumn="0" w:lastRowLastColumn="0"/>
+              <w:rPr>
+                <w:rFonts w:ascii="Helvetica" w:hAnsi="Helvetica" w:cs="Helvetica"/>
+              </w:rPr>
+            </w:pPr>
+            <w:r>
+              <w:rPr>
+                <w:rFonts w:ascii="Helvetica" w:hAnsi="Helvetica" w:cs="Helvetica"/>
+              </w:rPr>
+              <w:t>6</w:t>
+            </w:r>
+          </w:p>
+        </w:tc>
+        <w:tc>
+          <w:tcPr>
+            <w:tcW w:w="0" w:type="auto"/>
+            <w:shd w:val="clear" w:color="auto" w:fill="F2CEED" w:themeFill="accent5" w:themeFillTint="33"/>
+            <w:vAlign w:val="center"/>
+          </w:tcPr>
+          <w:p>
+            <w:pPr>
+              <w:spacing w:after="0" w:line="240" w:lineRule="auto"/>
+              <w:jc w:val="center"/>
+              <w:cnfStyle w:val="000000000000" w:firstRow="0" w:lastRow="0" w:firstColumn="0" w:lastColumn="0" w:oddVBand="0" w:evenVBand="0" w:oddHBand="0" w:evenHBand="0" w:firstRowFirstColumn="0" w:firstRowLastColumn="0" w:lastRowFirstColumn="0" w:lastRowLastColumn="0"/>
+              <w:rPr>
+                <w:rFonts w:ascii="Helvetica" w:hAnsi="Helvetica" w:cs="Helvetica"/>
+              </w:rPr>
+            </w:pPr>
+            <w:r>
+              <w:rPr>
+                <w:rFonts w:ascii="Helvetica" w:hAnsi="Helvetica" w:cs="Helvetica"/>
+              </w:rPr>
+              <w:t>T1-T4</w:t>
+            </w:r>
+          </w:p>
+        </w:tc>
+      </w:tr>
+      <w:tr>
+        <w:trPr>
+          <w:trHeight w:val="346"/>
+        </w:trPr>
+        <w:tc>
+          <w:tcPr>
+            <w:cnfStyle w:val="001000000000" w:firstRow="0" w:lastRow="0" w:firstColumn="1" w:lastColumn="0" w:oddVBand="0" w:evenVBand="0" w:oddHBand="0" w:evenHBand="0" w:firstRowFirstColumn="0" w:firstRowLastColumn="0" w:lastRowFirstColumn="0" w:lastRowLastColumn="0"/>
+            <w:tcW w:w="0" w:type="auto"/>
+            <w:tcBorders>
+              <w:top w:val="single" w:sz="4" w:space="0" w:color="E59EDC" w:themeColor="accent5" w:themeTint="66"/>
+              <w:left w:val="single" w:sz="4" w:space="0" w:color="E59EDC" w:themeColor="accent5" w:themeTint="66"/>
+              <w:bottom w:val="single" w:sz="4" w:space="0" w:color="E59EDC" w:themeColor="accent5" w:themeTint="66"/>
+              <w:right w:val="single" w:sz="4" w:space="0" w:color="E59EDC" w:themeColor="accent5" w:themeTint="66"/>
+            </w:tcBorders>
+            <w:vAlign w:val="center"/>
+          </w:tcPr>
+          <w:p>
+            <w:pPr>
+              <w:spacing w:after="0" w:line="240" w:lineRule="auto"/>
+              <w:jc w:val="center"/>
+              <w:rPr>
+                <w:rFonts w:ascii="Helvetica" w:hAnsi="Helvetica" w:cs="Helvetica"/>
+                <w:i w:val="0"/>
+                <w:iCs w:val="0"/>
+              </w:rPr>
+            </w:pPr>
+            <w:r>
+              <w:rPr>
+                <w:rFonts w:ascii="Helvetica" w:hAnsi="Helvetica" w:cs="Helvetica"/>
+                <w:i w:val="0"/>
+                <w:iCs w:val="0"/>
+              </w:rPr>
+              <w:t>T11</w:t>
+            </w:r>
+          </w:p>
+        </w:tc>
+        <w:tc>
+          <w:tcPr>
+            <w:tcW w:w="0" w:type="auto"/>
+            <w:tcBorders>
+              <w:left w:val="single" w:sz="4" w:space="0" w:color="E59EDC" w:themeColor="accent5" w:themeTint="66"/>
+              <w:right w:val="single" w:sz="4" w:space="0" w:color="E59EDC" w:themeColor="accent5" w:themeTint="66"/>
+            </w:tcBorders>
+            <w:vAlign w:val="center"/>
+          </w:tcPr>
+          <w:p>
+            <w:pPr>
+              <w:spacing w:after="0" w:line="240" w:lineRule="auto"/>
+              <w:jc w:val="center"/>
+              <w:cnfStyle w:val="000000000000" w:firstRow="0" w:lastRow="0" w:firstColumn="0" w:lastColumn="0" w:oddVBand="0" w:evenVBand="0" w:oddHBand="0" w:evenHBand="0" w:firstRowFirstColumn="0" w:firstRowLastColumn="0" w:lastRowFirstColumn="0" w:lastRowLastColumn="0"/>
+              <w:rPr>
+                <w:rFonts w:ascii="Helvetica" w:hAnsi="Helvetica" w:cs="Helvetica"/>
+              </w:rPr>
+            </w:pPr>
+            <w:r>
+              <w:rPr>
+                <w:rFonts w:ascii="Helvetica" w:hAnsi="Helvetica" w:cs="Helvetica"/>
+              </w:rPr>
+              <w:t>Set up GUI</w:t>
+            </w:r>
+          </w:p>
+        </w:tc>
+        <w:tc>
+          <w:tcPr>
+            <w:tcW w:w="0" w:type="auto"/>
+            <w:tcBorders>
+              <w:left w:val="single" w:sz="4" w:space="0" w:color="E59EDC" w:themeColor="accent5" w:themeTint="66"/>
+            </w:tcBorders>
+            <w:vAlign w:val="center"/>
+          </w:tcPr>
+          <w:p>
+            <w:pPr>
+              <w:spacing w:after="0" w:line="240" w:lineRule="auto"/>
+              <w:jc w:val="center"/>
+              <w:cnfStyle w:val="000000000000" w:firstRow="0" w:lastRow="0" w:firstColumn="0" w:lastColumn="0" w:oddVBand="0" w:evenVBand="0" w:oddHBand="0" w:evenHBand="0" w:firstRowFirstColumn="0" w:firstRowLastColumn="0" w:lastRowFirstColumn="0" w:lastRowLastColumn="0"/>
+              <w:rPr>
+                <w:rFonts w:ascii="Helvetica" w:hAnsi="Helvetica" w:cs="Helvetica"/>
+              </w:rPr>
+            </w:pPr>
+            <w:r>
+              <w:rPr>
+                <w:rFonts w:ascii="Helvetica" w:hAnsi="Helvetica" w:cs="Helvetica"/>
+              </w:rPr>
+              <w:t>6</w:t>
+            </w:r>
+          </w:p>
+        </w:tc>
+        <w:tc>
+          <w:tcPr>
+            <w:tcW w:w="0" w:type="auto"/>
+            <w:vAlign w:val="center"/>
+          </w:tcPr>
+          <w:p>
+            <w:pPr>
+              <w:spacing w:after="0" w:line="240" w:lineRule="auto"/>
+              <w:jc w:val="center"/>
+              <w:cnfStyle w:val="000000000000" w:firstRow="0" w:lastRow="0" w:firstColumn="0" w:lastColumn="0" w:oddVBand="0" w:evenVBand="0" w:oddHBand="0" w:evenHBand="0" w:firstRowFirstColumn="0" w:firstRowLastColumn="0" w:lastRowFirstColumn="0" w:lastRowLastColumn="0"/>
+              <w:rPr>
+                <w:rFonts w:ascii="Helvetica" w:hAnsi="Helvetica" w:cs="Helvetica"/>
+              </w:rPr>
+            </w:pPr>
+            <w:r>
+              <w:rPr>
+                <w:rFonts w:ascii="Helvetica" w:hAnsi="Helvetica" w:cs="Helvetica"/>
+              </w:rPr>
+              <w:t>T1-T8</w:t>
+            </w:r>
+          </w:p>
+        </w:tc>
+      </w:tr>
+      <w:tr>
+        <w:trPr>
+          <w:trHeight w:val="346"/>
+        </w:trPr>
+        <w:tc>
+          <w:tcPr>
+            <w:cnfStyle w:val="001000000000" w:firstRow="0" w:lastRow="0" w:firstColumn="1" w:lastColumn="0" w:oddVBand="0" w:evenVBand="0" w:oddHBand="0" w:evenHBand="0" w:firstRowFirstColumn="0" w:firstRowLastColumn="0" w:lastRowFirstColumn="0" w:lastRowLastColumn="0"/>
+            <w:tcW w:w="0" w:type="auto"/>
+            <w:tcBorders>
+              <w:top w:val="single" w:sz="4" w:space="0" w:color="E59EDC" w:themeColor="accent5" w:themeTint="66"/>
+              <w:left w:val="single" w:sz="4" w:space="0" w:color="E59EDC" w:themeColor="accent5" w:themeTint="66"/>
+              <w:bottom w:val="single" w:sz="4" w:space="0" w:color="E59EDC" w:themeColor="accent5" w:themeTint="66"/>
+              <w:right w:val="single" w:sz="4" w:space="0" w:color="E59EDC" w:themeColor="accent5" w:themeTint="66"/>
+            </w:tcBorders>
+            <w:vAlign w:val="center"/>
+          </w:tcPr>
+          <w:p>
+            <w:pPr>
+              <w:spacing w:after="0" w:line="240" w:lineRule="auto"/>
+              <w:jc w:val="center"/>
+              <w:rPr>
+                <w:rFonts w:ascii="Helvetica" w:hAnsi="Helvetica" w:cs="Helvetica"/>
+                <w:i w:val="0"/>
+                <w:iCs w:val="0"/>
+              </w:rPr>
+            </w:pPr>
+            <w:r>
+              <w:rPr>
+                <w:rFonts w:ascii="Helvetica" w:hAnsi="Helvetica" w:cs="Helvetica"/>
+                <w:i w:val="0"/>
+                <w:iCs w:val="0"/>
+              </w:rPr>
+              <w:t>T12</w:t>
+            </w:r>
+          </w:p>
+        </w:tc>
+        <w:tc>
+          <w:tcPr>
+            <w:tcW w:w="0" w:type="auto"/>
+            <w:tcBorders>
+              <w:left w:val="single" w:sz="4" w:space="0" w:color="E59EDC" w:themeColor="accent5" w:themeTint="66"/>
+              <w:right w:val="single" w:sz="4" w:space="0" w:color="E59EDC" w:themeColor="accent5" w:themeTint="66"/>
+            </w:tcBorders>
+            <w:shd w:val="clear" w:color="auto" w:fill="F2CEED" w:themeFill="accent5" w:themeFillTint="33"/>
+            <w:vAlign w:val="center"/>
+          </w:tcPr>
+          <w:p>
+            <w:pPr>
+              <w:spacing w:after="0" w:line="240" w:lineRule="auto"/>
+              <w:jc w:val="center"/>
+              <w:cnfStyle w:val="000000000000" w:firstRow="0" w:lastRow="0" w:firstColumn="0" w:lastColumn="0" w:oddVBand="0" w:evenVBand="0" w:oddHBand="0" w:evenHBand="0" w:firstRowFirstColumn="0" w:firstRowLastColumn="0" w:lastRowFirstColumn="0" w:lastRowLastColumn="0"/>
+              <w:rPr>
+                <w:rFonts w:ascii="Helvetica" w:hAnsi="Helvetica" w:cs="Helvetica"/>
+              </w:rPr>
+            </w:pPr>
+            <w:r>
+              <w:rPr>
+                <w:rFonts w:ascii="Helvetica" w:hAnsi="Helvetica" w:cs="Helvetica"/>
+              </w:rPr>
+              <w:t>Design System Architecture</w:t>
+            </w:r>
+          </w:p>
+        </w:tc>
+        <w:tc>
+          <w:tcPr>
+            <w:tcW w:w="0" w:type="auto"/>
+            <w:tcBorders>
+              <w:left w:val="single" w:sz="4" w:space="0" w:color="E59EDC" w:themeColor="accent5" w:themeTint="66"/>
+            </w:tcBorders>
+            <w:shd w:val="clear" w:color="auto" w:fill="F2CEED" w:themeFill="accent5" w:themeFillTint="33"/>
+            <w:vAlign w:val="center"/>
+          </w:tcPr>
+          <w:p>
+            <w:pPr>
+              <w:spacing w:after="0" w:line="240" w:lineRule="auto"/>
+              <w:jc w:val="center"/>
+              <w:cnfStyle w:val="000000000000" w:firstRow="0" w:lastRow="0" w:firstColumn="0" w:lastColumn="0" w:oddVBand="0" w:evenVBand="0" w:oddHBand="0" w:evenHBand="0" w:firstRowFirstColumn="0" w:firstRowLastColumn="0" w:lastRowFirstColumn="0" w:lastRowLastColumn="0"/>
+              <w:rPr>
+                <w:rFonts w:ascii="Helvetica" w:hAnsi="Helvetica" w:cs="Helvetica"/>
+              </w:rPr>
+            </w:pPr>
+            <w:r>
+              <w:rPr>
+                <w:rFonts w:ascii="Helvetica" w:hAnsi="Helvetica" w:cs="Helvetica"/>
+              </w:rPr>
+              <w:t>6</w:t>
+            </w:r>
+          </w:p>
+        </w:tc>
+        <w:tc>
+          <w:tcPr>
+            <w:tcW w:w="0" w:type="auto"/>
+            <w:shd w:val="clear" w:color="auto" w:fill="F2CEED" w:themeFill="accent5" w:themeFillTint="33"/>
+            <w:vAlign w:val="center"/>
           </w:tcPr>
           <w:p>
             <w:pPr>
@@ -346,1111 +1628,8 @@
                 <w:rFonts w:ascii="Helvetica" w:hAnsi="Helvetica" w:cs="Helvetica"/>
                 <w:b/>
                 <w:bCs/>
-                <w:i/>
-                <w:iCs/>
-              </w:rPr>
-            </w:pPr>
-            <w:r>
-              <w:rPr>
-                <w:rFonts w:ascii="Helvetica" w:hAnsi="Helvetica" w:cs="Helvetica"/>
-                <w:b/>
-                <w:bCs/>
-                <w:i/>
-                <w:iCs/>
-              </w:rPr>
-              <w:t>Create customer</w:t>
-            </w:r>
-          </w:p>
-        </w:tc>
-        <w:tc>
-          <w:tcPr>
-            <w:tcW w:w="0" w:type="auto"/>
-            <w:tcBorders>
-              <w:top w:val="single" w:sz="4" w:space="0" w:color="E59EDC" w:themeColor="accent5" w:themeTint="66"/>
-              <w:left w:val="single" w:sz="4" w:space="0" w:color="E59EDC" w:themeColor="accent5" w:themeTint="66"/>
-            </w:tcBorders>
-          </w:tcPr>
-          <w:p>
-            <w:pPr>
-              <w:spacing w:after="0" w:line="240" w:lineRule="auto"/>
-              <w:jc w:val="center"/>
-              <w:cnfStyle w:val="000000000000" w:firstRow="0" w:lastRow="0" w:firstColumn="0" w:lastColumn="0" w:oddVBand="0" w:evenVBand="0" w:oddHBand="0" w:evenHBand="0" w:firstRowFirstColumn="0" w:firstRowLastColumn="0" w:lastRowFirstColumn="0" w:lastRowLastColumn="0"/>
-              <w:rPr>
-                <w:rFonts w:ascii="Helvetica" w:hAnsi="Helvetica" w:cs="Helvetica"/>
-              </w:rPr>
-            </w:pPr>
-            <w:r>
-              <w:rPr>
-                <w:rFonts w:ascii="Helvetica" w:hAnsi="Helvetica" w:cs="Helvetica"/>
-              </w:rPr>
-              <w:t>3</w:t>
-            </w:r>
-          </w:p>
-        </w:tc>
-        <w:tc>
-          <w:tcPr>
-            <w:tcW w:w="0" w:type="auto"/>
-            <w:tcBorders>
-              <w:top w:val="single" w:sz="4" w:space="0" w:color="E59EDC" w:themeColor="accent5" w:themeTint="66"/>
-            </w:tcBorders>
-          </w:tcPr>
-          <w:p>
-            <w:pPr>
-              <w:spacing w:after="0" w:line="240" w:lineRule="auto"/>
-              <w:jc w:val="center"/>
-              <w:cnfStyle w:val="000000000000" w:firstRow="0" w:lastRow="0" w:firstColumn="0" w:lastColumn="0" w:oddVBand="0" w:evenVBand="0" w:oddHBand="0" w:evenHBand="0" w:firstRowFirstColumn="0" w:firstRowLastColumn="0" w:lastRowFirstColumn="0" w:lastRowLastColumn="0"/>
-              <w:rPr>
-                <w:rFonts w:ascii="Helvetica" w:hAnsi="Helvetica" w:cs="Helvetica"/>
-              </w:rPr>
-            </w:pPr>
-          </w:p>
-        </w:tc>
-      </w:tr>
-      <w:tr>
-        <w:tc>
-          <w:tcPr>
-            <w:cnfStyle w:val="001000000000" w:firstRow="0" w:lastRow="0" w:firstColumn="1" w:lastColumn="0" w:oddVBand="0" w:evenVBand="0" w:oddHBand="0" w:evenHBand="0" w:firstRowFirstColumn="0" w:firstRowLastColumn="0" w:lastRowFirstColumn="0" w:lastRowLastColumn="0"/>
-            <w:tcW w:w="0" w:type="auto"/>
-            <w:tcBorders>
-              <w:top w:val="single" w:sz="4" w:space="0" w:color="E59EDC" w:themeColor="accent5" w:themeTint="66"/>
-              <w:left w:val="single" w:sz="4" w:space="0" w:color="E59EDC" w:themeColor="accent5" w:themeTint="66"/>
-              <w:right w:val="single" w:sz="4" w:space="0" w:color="E59EDC" w:themeColor="accent5" w:themeTint="66"/>
-            </w:tcBorders>
-          </w:tcPr>
-          <w:p>
-            <w:pPr>
-              <w:spacing w:after="0" w:line="240" w:lineRule="auto"/>
-              <w:jc w:val="center"/>
-              <w:rPr>
-                <w:rFonts w:ascii="Helvetica" w:hAnsi="Helvetica" w:cs="Helvetica"/>
-              </w:rPr>
-            </w:pPr>
-            <w:r>
-              <w:rPr>
-                <w:rFonts w:ascii="Helvetica" w:hAnsi="Helvetica" w:cs="Helvetica"/>
-                <w:i w:val="0"/>
-                <w:iCs w:val="0"/>
-              </w:rPr>
-              <w:t>T2</w:t>
-            </w:r>
-          </w:p>
-        </w:tc>
-        <w:tc>
-          <w:tcPr>
-            <w:tcW w:w="0" w:type="auto"/>
-            <w:tcBorders>
-              <w:left w:val="single" w:sz="4" w:space="0" w:color="E59EDC" w:themeColor="accent5" w:themeTint="66"/>
-              <w:right w:val="single" w:sz="4" w:space="0" w:color="E59EDC" w:themeColor="accent5" w:themeTint="66"/>
-            </w:tcBorders>
-            <w:shd w:val="clear" w:color="auto" w:fill="F2CEED" w:themeFill="accent5" w:themeFillTint="33"/>
-          </w:tcPr>
-          <w:p>
-            <w:pPr>
-              <w:spacing w:after="0" w:line="240" w:lineRule="auto"/>
-              <w:jc w:val="center"/>
-              <w:cnfStyle w:val="000000000000" w:firstRow="0" w:lastRow="0" w:firstColumn="0" w:lastColumn="0" w:oddVBand="0" w:evenVBand="0" w:oddHBand="0" w:evenHBand="0" w:firstRowFirstColumn="0" w:firstRowLastColumn="0" w:lastRowFirstColumn="0" w:lastRowLastColumn="0"/>
-              <w:rPr>
-                <w:rFonts w:ascii="Helvetica" w:hAnsi="Helvetica" w:cs="Helvetica"/>
-                <w:b/>
-                <w:bCs/>
-                <w:i/>
-                <w:iCs/>
-              </w:rPr>
-            </w:pPr>
-            <w:r>
-              <w:rPr>
-                <w:rFonts w:ascii="Helvetica" w:hAnsi="Helvetica" w:cs="Helvetica"/>
-                <w:b/>
-                <w:bCs/>
-                <w:i/>
-                <w:iCs/>
-              </w:rPr>
-              <w:t>Create newsagent</w:t>
-            </w:r>
-          </w:p>
-        </w:tc>
-        <w:tc>
-          <w:tcPr>
-            <w:tcW w:w="0" w:type="auto"/>
-            <w:tcBorders>
-              <w:left w:val="single" w:sz="4" w:space="0" w:color="E59EDC" w:themeColor="accent5" w:themeTint="66"/>
-            </w:tcBorders>
-            <w:shd w:val="clear" w:color="auto" w:fill="F2CEED" w:themeFill="accent5" w:themeFillTint="33"/>
-          </w:tcPr>
-          <w:p>
-            <w:pPr>
-              <w:spacing w:after="0" w:line="240" w:lineRule="auto"/>
-              <w:jc w:val="center"/>
-              <w:cnfStyle w:val="000000000000" w:firstRow="0" w:lastRow="0" w:firstColumn="0" w:lastColumn="0" w:oddVBand="0" w:evenVBand="0" w:oddHBand="0" w:evenHBand="0" w:firstRowFirstColumn="0" w:firstRowLastColumn="0" w:lastRowFirstColumn="0" w:lastRowLastColumn="0"/>
-              <w:rPr>
-                <w:rFonts w:ascii="Helvetica" w:hAnsi="Helvetica" w:cs="Helvetica"/>
-              </w:rPr>
-            </w:pPr>
-            <w:r>
-              <w:rPr>
-                <w:rFonts w:ascii="Helvetica" w:hAnsi="Helvetica" w:cs="Helvetica"/>
-              </w:rPr>
-              <w:t>3</w:t>
-            </w:r>
-          </w:p>
-        </w:tc>
-        <w:tc>
-          <w:tcPr>
-            <w:tcW w:w="0" w:type="auto"/>
-            <w:shd w:val="clear" w:color="auto" w:fill="F2CEED" w:themeFill="accent5" w:themeFillTint="33"/>
-          </w:tcPr>
-          <w:p>
-            <w:pPr>
-              <w:spacing w:after="0" w:line="240" w:lineRule="auto"/>
-              <w:jc w:val="center"/>
-              <w:cnfStyle w:val="000000000000" w:firstRow="0" w:lastRow="0" w:firstColumn="0" w:lastColumn="0" w:oddVBand="0" w:evenVBand="0" w:oddHBand="0" w:evenHBand="0" w:firstRowFirstColumn="0" w:firstRowLastColumn="0" w:lastRowFirstColumn="0" w:lastRowLastColumn="0"/>
-              <w:rPr>
-                <w:rFonts w:ascii="Helvetica" w:hAnsi="Helvetica" w:cs="Helvetica"/>
-              </w:rPr>
-            </w:pPr>
-          </w:p>
-        </w:tc>
-      </w:tr>
-      <w:tr>
-        <w:tc>
-          <w:tcPr>
-            <w:cnfStyle w:val="001000000000" w:firstRow="0" w:lastRow="0" w:firstColumn="1" w:lastColumn="0" w:oddVBand="0" w:evenVBand="0" w:oddHBand="0" w:evenHBand="0" w:firstRowFirstColumn="0" w:firstRowLastColumn="0" w:lastRowFirstColumn="0" w:lastRowLastColumn="0"/>
-            <w:tcW w:w="0" w:type="auto"/>
-            <w:tcBorders>
-              <w:top w:val="single" w:sz="4" w:space="0" w:color="E59EDC" w:themeColor="accent5" w:themeTint="66"/>
-              <w:left w:val="single" w:sz="4" w:space="0" w:color="E59EDC" w:themeColor="accent5" w:themeTint="66"/>
-              <w:right w:val="single" w:sz="4" w:space="0" w:color="E59EDC" w:themeColor="accent5" w:themeTint="66"/>
-            </w:tcBorders>
-          </w:tcPr>
-          <w:p>
-            <w:pPr>
-              <w:spacing w:after="0" w:line="240" w:lineRule="auto"/>
-              <w:jc w:val="center"/>
-              <w:rPr>
-                <w:rFonts w:ascii="Helvetica" w:hAnsi="Helvetica" w:cs="Helvetica"/>
-              </w:rPr>
-            </w:pPr>
-            <w:r>
-              <w:rPr>
-                <w:rFonts w:ascii="Helvetica" w:hAnsi="Helvetica" w:cs="Helvetica"/>
-                <w:i w:val="0"/>
-                <w:iCs w:val="0"/>
-              </w:rPr>
-              <w:t>T3</w:t>
-            </w:r>
-          </w:p>
-        </w:tc>
-        <w:tc>
-          <w:tcPr>
-            <w:tcW w:w="0" w:type="auto"/>
-            <w:tcBorders>
-              <w:left w:val="single" w:sz="4" w:space="0" w:color="E59EDC" w:themeColor="accent5" w:themeTint="66"/>
-              <w:right w:val="single" w:sz="4" w:space="0" w:color="E59EDC" w:themeColor="accent5" w:themeTint="66"/>
-            </w:tcBorders>
-          </w:tcPr>
-          <w:p>
-            <w:pPr>
-              <w:spacing w:after="0" w:line="240" w:lineRule="auto"/>
-              <w:jc w:val="center"/>
-              <w:cnfStyle w:val="000000000000" w:firstRow="0" w:lastRow="0" w:firstColumn="0" w:lastColumn="0" w:oddVBand="0" w:evenVBand="0" w:oddHBand="0" w:evenHBand="0" w:firstRowFirstColumn="0" w:firstRowLastColumn="0" w:lastRowFirstColumn="0" w:lastRowLastColumn="0"/>
-              <w:rPr>
-                <w:rFonts w:ascii="Helvetica" w:hAnsi="Helvetica" w:cs="Helvetica"/>
-                <w:b/>
-                <w:bCs/>
-                <w:i/>
-                <w:iCs/>
-              </w:rPr>
-            </w:pPr>
-            <w:r>
-              <w:rPr>
-                <w:rFonts w:ascii="Helvetica" w:hAnsi="Helvetica" w:cs="Helvetica"/>
-                <w:b/>
-                <w:bCs/>
-                <w:i/>
-                <w:iCs/>
-              </w:rPr>
-              <w:t>Create delivery person</w:t>
-            </w:r>
-          </w:p>
-        </w:tc>
-        <w:tc>
-          <w:tcPr>
-            <w:tcW w:w="0" w:type="auto"/>
-            <w:tcBorders>
-              <w:left w:val="single" w:sz="4" w:space="0" w:color="E59EDC" w:themeColor="accent5" w:themeTint="66"/>
-            </w:tcBorders>
-          </w:tcPr>
-          <w:p>
-            <w:pPr>
-              <w:spacing w:after="0" w:line="240" w:lineRule="auto"/>
-              <w:jc w:val="center"/>
-              <w:cnfStyle w:val="000000000000" w:firstRow="0" w:lastRow="0" w:firstColumn="0" w:lastColumn="0" w:oddVBand="0" w:evenVBand="0" w:oddHBand="0" w:evenHBand="0" w:firstRowFirstColumn="0" w:firstRowLastColumn="0" w:lastRowFirstColumn="0" w:lastRowLastColumn="0"/>
-              <w:rPr>
-                <w:rFonts w:ascii="Helvetica" w:hAnsi="Helvetica" w:cs="Helvetica"/>
-              </w:rPr>
-            </w:pPr>
-            <w:r>
-              <w:rPr>
-                <w:rFonts w:ascii="Helvetica" w:hAnsi="Helvetica" w:cs="Helvetica"/>
-              </w:rPr>
-              <w:t>3</w:t>
-            </w:r>
-          </w:p>
-        </w:tc>
-        <w:tc>
-          <w:tcPr>
-            <w:tcW w:w="0" w:type="auto"/>
-          </w:tcPr>
-          <w:p>
-            <w:pPr>
-              <w:spacing w:after="0" w:line="240" w:lineRule="auto"/>
-              <w:jc w:val="center"/>
-              <w:cnfStyle w:val="000000000000" w:firstRow="0" w:lastRow="0" w:firstColumn="0" w:lastColumn="0" w:oddVBand="0" w:evenVBand="0" w:oddHBand="0" w:evenHBand="0" w:firstRowFirstColumn="0" w:firstRowLastColumn="0" w:lastRowFirstColumn="0" w:lastRowLastColumn="0"/>
-              <w:rPr>
-                <w:rFonts w:ascii="Helvetica" w:hAnsi="Helvetica" w:cs="Helvetica"/>
-              </w:rPr>
-            </w:pPr>
-          </w:p>
-        </w:tc>
-      </w:tr>
-      <w:tr>
-        <w:tc>
-          <w:tcPr>
-            <w:cnfStyle w:val="001000000000" w:firstRow="0" w:lastRow="0" w:firstColumn="1" w:lastColumn="0" w:oddVBand="0" w:evenVBand="0" w:oddHBand="0" w:evenHBand="0" w:firstRowFirstColumn="0" w:firstRowLastColumn="0" w:lastRowFirstColumn="0" w:lastRowLastColumn="0"/>
-            <w:tcW w:w="0" w:type="auto"/>
-            <w:tcBorders>
-              <w:top w:val="single" w:sz="4" w:space="0" w:color="E59EDC" w:themeColor="accent5" w:themeTint="66"/>
-              <w:left w:val="single" w:sz="4" w:space="0" w:color="E59EDC" w:themeColor="accent5" w:themeTint="66"/>
-              <w:right w:val="single" w:sz="4" w:space="0" w:color="E59EDC" w:themeColor="accent5" w:themeTint="66"/>
-            </w:tcBorders>
-          </w:tcPr>
-          <w:p>
-            <w:pPr>
-              <w:spacing w:after="0" w:line="240" w:lineRule="auto"/>
-              <w:jc w:val="center"/>
-              <w:rPr>
-                <w:rFonts w:ascii="Helvetica" w:hAnsi="Helvetica" w:cs="Helvetica"/>
-              </w:rPr>
-            </w:pPr>
-            <w:r>
-              <w:rPr>
-                <w:rFonts w:ascii="Helvetica" w:hAnsi="Helvetica" w:cs="Helvetica"/>
-                <w:i w:val="0"/>
-                <w:iCs w:val="0"/>
-              </w:rPr>
-              <w:t>T4</w:t>
-            </w:r>
-          </w:p>
-        </w:tc>
-        <w:tc>
-          <w:tcPr>
-            <w:tcW w:w="0" w:type="auto"/>
-            <w:tcBorders>
-              <w:left w:val="single" w:sz="4" w:space="0" w:color="E59EDC" w:themeColor="accent5" w:themeTint="66"/>
-              <w:right w:val="single" w:sz="4" w:space="0" w:color="E59EDC" w:themeColor="accent5" w:themeTint="66"/>
-            </w:tcBorders>
-            <w:shd w:val="clear" w:color="auto" w:fill="F2CEED" w:themeFill="accent5" w:themeFillTint="33"/>
-          </w:tcPr>
-          <w:p>
-            <w:pPr>
-              <w:spacing w:after="0" w:line="240" w:lineRule="auto"/>
-              <w:jc w:val="center"/>
-              <w:cnfStyle w:val="000000000000" w:firstRow="0" w:lastRow="0" w:firstColumn="0" w:lastColumn="0" w:oddVBand="0" w:evenVBand="0" w:oddHBand="0" w:evenHBand="0" w:firstRowFirstColumn="0" w:firstRowLastColumn="0" w:lastRowFirstColumn="0" w:lastRowLastColumn="0"/>
-              <w:rPr>
-                <w:rFonts w:ascii="Helvetica" w:hAnsi="Helvetica" w:cs="Helvetica"/>
-                <w:b/>
-                <w:bCs/>
-                <w:i/>
-                <w:iCs/>
-              </w:rPr>
-            </w:pPr>
-            <w:r>
-              <w:rPr>
-                <w:rFonts w:ascii="Helvetica" w:hAnsi="Helvetica" w:cs="Helvetica"/>
-                <w:b/>
-                <w:bCs/>
-                <w:i/>
-                <w:iCs/>
-              </w:rPr>
-              <w:t>Create order book</w:t>
-            </w:r>
-          </w:p>
-        </w:tc>
-        <w:tc>
-          <w:tcPr>
-            <w:tcW w:w="0" w:type="auto"/>
-            <w:tcBorders>
-              <w:left w:val="single" w:sz="4" w:space="0" w:color="E59EDC" w:themeColor="accent5" w:themeTint="66"/>
-            </w:tcBorders>
-            <w:shd w:val="clear" w:color="auto" w:fill="F2CEED" w:themeFill="accent5" w:themeFillTint="33"/>
-          </w:tcPr>
-          <w:p>
-            <w:pPr>
-              <w:spacing w:after="0" w:line="240" w:lineRule="auto"/>
-              <w:jc w:val="center"/>
-              <w:cnfStyle w:val="000000000000" w:firstRow="0" w:lastRow="0" w:firstColumn="0" w:lastColumn="0" w:oddVBand="0" w:evenVBand="0" w:oddHBand="0" w:evenHBand="0" w:firstRowFirstColumn="0" w:firstRowLastColumn="0" w:lastRowFirstColumn="0" w:lastRowLastColumn="0"/>
-              <w:rPr>
-                <w:rFonts w:ascii="Helvetica" w:hAnsi="Helvetica" w:cs="Helvetica"/>
-              </w:rPr>
-            </w:pPr>
-            <w:r>
-              <w:rPr>
-                <w:rFonts w:ascii="Helvetica" w:hAnsi="Helvetica" w:cs="Helvetica"/>
-              </w:rPr>
-              <w:t>3</w:t>
-            </w:r>
-          </w:p>
-        </w:tc>
-        <w:tc>
-          <w:tcPr>
-            <w:tcW w:w="0" w:type="auto"/>
-            <w:shd w:val="clear" w:color="auto" w:fill="F2CEED" w:themeFill="accent5" w:themeFillTint="33"/>
-          </w:tcPr>
-          <w:p>
-            <w:pPr>
-              <w:spacing w:after="0" w:line="240" w:lineRule="auto"/>
-              <w:jc w:val="center"/>
-              <w:cnfStyle w:val="000000000000" w:firstRow="0" w:lastRow="0" w:firstColumn="0" w:lastColumn="0" w:oddVBand="0" w:evenVBand="0" w:oddHBand="0" w:evenHBand="0" w:firstRowFirstColumn="0" w:firstRowLastColumn="0" w:lastRowFirstColumn="0" w:lastRowLastColumn="0"/>
-              <w:rPr>
-                <w:rFonts w:ascii="Helvetica" w:hAnsi="Helvetica" w:cs="Helvetica"/>
-              </w:rPr>
-            </w:pPr>
-          </w:p>
-        </w:tc>
-      </w:tr>
-      <w:tr>
-        <w:tc>
-          <w:tcPr>
-            <w:cnfStyle w:val="001000000000" w:firstRow="0" w:lastRow="0" w:firstColumn="1" w:lastColumn="0" w:oddVBand="0" w:evenVBand="0" w:oddHBand="0" w:evenHBand="0" w:firstRowFirstColumn="0" w:firstRowLastColumn="0" w:lastRowFirstColumn="0" w:lastRowLastColumn="0"/>
-            <w:tcW w:w="0" w:type="auto"/>
-            <w:tcBorders>
-              <w:top w:val="single" w:sz="4" w:space="0" w:color="E59EDC" w:themeColor="accent5" w:themeTint="66"/>
-              <w:left w:val="single" w:sz="4" w:space="0" w:color="E59EDC" w:themeColor="accent5" w:themeTint="66"/>
-              <w:right w:val="single" w:sz="4" w:space="0" w:color="E59EDC" w:themeColor="accent5" w:themeTint="66"/>
-            </w:tcBorders>
-          </w:tcPr>
-          <w:p>
-            <w:pPr>
-              <w:spacing w:after="0" w:line="240" w:lineRule="auto"/>
-              <w:jc w:val="center"/>
-              <w:rPr>
-                <w:rFonts w:ascii="Helvetica" w:hAnsi="Helvetica" w:cs="Helvetica"/>
-              </w:rPr>
-            </w:pPr>
-            <w:r>
-              <w:rPr>
-                <w:rFonts w:ascii="Helvetica" w:hAnsi="Helvetica" w:cs="Helvetica"/>
-                <w:i w:val="0"/>
-                <w:iCs w:val="0"/>
-              </w:rPr>
-              <w:t>T5</w:t>
-            </w:r>
-          </w:p>
-        </w:tc>
-        <w:tc>
-          <w:tcPr>
-            <w:tcW w:w="0" w:type="auto"/>
-            <w:tcBorders>
-              <w:left w:val="single" w:sz="4" w:space="0" w:color="E59EDC" w:themeColor="accent5" w:themeTint="66"/>
-              <w:right w:val="single" w:sz="4" w:space="0" w:color="E59EDC" w:themeColor="accent5" w:themeTint="66"/>
-            </w:tcBorders>
-          </w:tcPr>
-          <w:p>
-            <w:pPr>
-              <w:spacing w:after="0" w:line="240" w:lineRule="auto"/>
-              <w:jc w:val="center"/>
-              <w:cnfStyle w:val="000000000000" w:firstRow="0" w:lastRow="0" w:firstColumn="0" w:lastColumn="0" w:oddVBand="0" w:evenVBand="0" w:oddHBand="0" w:evenHBand="0" w:firstRowFirstColumn="0" w:firstRowLastColumn="0" w:lastRowFirstColumn="0" w:lastRowLastColumn="0"/>
-              <w:rPr>
-                <w:rFonts w:ascii="Helvetica" w:hAnsi="Helvetica" w:cs="Helvetica"/>
-                <w:b/>
-                <w:bCs/>
-                <w:i/>
-                <w:iCs/>
-              </w:rPr>
-            </w:pPr>
-            <w:r>
-              <w:rPr>
-                <w:rFonts w:ascii="Helvetica" w:hAnsi="Helvetica" w:cs="Helvetica"/>
-                <w:b/>
-                <w:bCs/>
-                <w:i/>
-                <w:iCs/>
-              </w:rPr>
-              <w:t>Create publications</w:t>
-            </w:r>
-          </w:p>
-        </w:tc>
-        <w:tc>
-          <w:tcPr>
-            <w:tcW w:w="0" w:type="auto"/>
-            <w:tcBorders>
-              <w:left w:val="single" w:sz="4" w:space="0" w:color="E59EDC" w:themeColor="accent5" w:themeTint="66"/>
-            </w:tcBorders>
-          </w:tcPr>
-          <w:p>
-            <w:pPr>
-              <w:spacing w:after="0" w:line="240" w:lineRule="auto"/>
-              <w:jc w:val="center"/>
-              <w:cnfStyle w:val="000000000000" w:firstRow="0" w:lastRow="0" w:firstColumn="0" w:lastColumn="0" w:oddVBand="0" w:evenVBand="0" w:oddHBand="0" w:evenHBand="0" w:firstRowFirstColumn="0" w:firstRowLastColumn="0" w:lastRowFirstColumn="0" w:lastRowLastColumn="0"/>
-              <w:rPr>
-                <w:rFonts w:ascii="Helvetica" w:hAnsi="Helvetica" w:cs="Helvetica"/>
-              </w:rPr>
-            </w:pPr>
-            <w:r>
-              <w:rPr>
-                <w:rFonts w:ascii="Helvetica" w:hAnsi="Helvetica" w:cs="Helvetica"/>
-              </w:rPr>
-              <w:t>3</w:t>
-            </w:r>
-          </w:p>
-        </w:tc>
-        <w:tc>
-          <w:tcPr>
-            <w:tcW w:w="0" w:type="auto"/>
-          </w:tcPr>
-          <w:p>
-            <w:pPr>
-              <w:spacing w:after="0" w:line="240" w:lineRule="auto"/>
-              <w:jc w:val="center"/>
-              <w:cnfStyle w:val="000000000000" w:firstRow="0" w:lastRow="0" w:firstColumn="0" w:lastColumn="0" w:oddVBand="0" w:evenVBand="0" w:oddHBand="0" w:evenHBand="0" w:firstRowFirstColumn="0" w:firstRowLastColumn="0" w:lastRowFirstColumn="0" w:lastRowLastColumn="0"/>
-              <w:rPr>
-                <w:rFonts w:ascii="Helvetica" w:hAnsi="Helvetica" w:cs="Helvetica"/>
-              </w:rPr>
-            </w:pPr>
-          </w:p>
-        </w:tc>
-      </w:tr>
-      <w:tr>
-        <w:tc>
-          <w:tcPr>
-            <w:cnfStyle w:val="001000000000" w:firstRow="0" w:lastRow="0" w:firstColumn="1" w:lastColumn="0" w:oddVBand="0" w:evenVBand="0" w:oddHBand="0" w:evenHBand="0" w:firstRowFirstColumn="0" w:firstRowLastColumn="0" w:lastRowFirstColumn="0" w:lastRowLastColumn="0"/>
-            <w:tcW w:w="0" w:type="auto"/>
-            <w:tcBorders>
-              <w:top w:val="single" w:sz="4" w:space="0" w:color="E59EDC" w:themeColor="accent5" w:themeTint="66"/>
-              <w:left w:val="single" w:sz="4" w:space="0" w:color="E59EDC" w:themeColor="accent5" w:themeTint="66"/>
-              <w:right w:val="single" w:sz="4" w:space="0" w:color="E59EDC" w:themeColor="accent5" w:themeTint="66"/>
-            </w:tcBorders>
-          </w:tcPr>
-          <w:p>
-            <w:pPr>
-              <w:spacing w:after="0" w:line="240" w:lineRule="auto"/>
-              <w:jc w:val="center"/>
-              <w:rPr>
-                <w:rFonts w:ascii="Helvetica" w:hAnsi="Helvetica" w:cs="Helvetica"/>
-              </w:rPr>
-            </w:pPr>
-            <w:r>
-              <w:rPr>
-                <w:rFonts w:ascii="Helvetica" w:hAnsi="Helvetica" w:cs="Helvetica"/>
-                <w:i w:val="0"/>
-                <w:iCs w:val="0"/>
-              </w:rPr>
-              <w:t>T6</w:t>
-            </w:r>
-          </w:p>
-        </w:tc>
-        <w:tc>
-          <w:tcPr>
-            <w:tcW w:w="0" w:type="auto"/>
-            <w:tcBorders>
-              <w:left w:val="single" w:sz="4" w:space="0" w:color="E59EDC" w:themeColor="accent5" w:themeTint="66"/>
-              <w:right w:val="single" w:sz="4" w:space="0" w:color="E59EDC" w:themeColor="accent5" w:themeTint="66"/>
-            </w:tcBorders>
-            <w:shd w:val="clear" w:color="auto" w:fill="F2CEED" w:themeFill="accent5" w:themeFillTint="33"/>
-          </w:tcPr>
-          <w:p>
-            <w:pPr>
-              <w:spacing w:after="0" w:line="240" w:lineRule="auto"/>
-              <w:jc w:val="center"/>
-              <w:cnfStyle w:val="000000000000" w:firstRow="0" w:lastRow="0" w:firstColumn="0" w:lastColumn="0" w:oddVBand="0" w:evenVBand="0" w:oddHBand="0" w:evenHBand="0" w:firstRowFirstColumn="0" w:firstRowLastColumn="0" w:lastRowFirstColumn="0" w:lastRowLastColumn="0"/>
-              <w:rPr>
-                <w:rFonts w:ascii="Helvetica" w:hAnsi="Helvetica" w:cs="Helvetica"/>
-                <w:b/>
-                <w:bCs/>
-                <w:i/>
-                <w:iCs/>
-              </w:rPr>
-            </w:pPr>
-            <w:r>
-              <w:rPr>
-                <w:rFonts w:ascii="Helvetica" w:hAnsi="Helvetica" w:cs="Helvetica"/>
-                <w:b/>
-                <w:bCs/>
-                <w:i/>
-                <w:iCs/>
-              </w:rPr>
-              <w:t>Create delivery docket</w:t>
-            </w:r>
-          </w:p>
-        </w:tc>
-        <w:tc>
-          <w:tcPr>
-            <w:tcW w:w="0" w:type="auto"/>
-            <w:tcBorders>
-              <w:left w:val="single" w:sz="4" w:space="0" w:color="E59EDC" w:themeColor="accent5" w:themeTint="66"/>
-            </w:tcBorders>
-            <w:shd w:val="clear" w:color="auto" w:fill="F2CEED" w:themeFill="accent5" w:themeFillTint="33"/>
-          </w:tcPr>
-          <w:p>
-            <w:pPr>
-              <w:spacing w:after="0" w:line="240" w:lineRule="auto"/>
-              <w:jc w:val="center"/>
-              <w:cnfStyle w:val="000000000000" w:firstRow="0" w:lastRow="0" w:firstColumn="0" w:lastColumn="0" w:oddVBand="0" w:evenVBand="0" w:oddHBand="0" w:evenHBand="0" w:firstRowFirstColumn="0" w:firstRowLastColumn="0" w:lastRowFirstColumn="0" w:lastRowLastColumn="0"/>
-              <w:rPr>
-                <w:rFonts w:ascii="Helvetica" w:hAnsi="Helvetica" w:cs="Helvetica"/>
-              </w:rPr>
-            </w:pPr>
-            <w:r>
-              <w:rPr>
-                <w:rFonts w:ascii="Helvetica" w:hAnsi="Helvetica" w:cs="Helvetica"/>
-              </w:rPr>
-              <w:t>3</w:t>
-            </w:r>
-          </w:p>
-        </w:tc>
-        <w:tc>
-          <w:tcPr>
-            <w:tcW w:w="0" w:type="auto"/>
-            <w:shd w:val="clear" w:color="auto" w:fill="F2CEED" w:themeFill="accent5" w:themeFillTint="33"/>
-          </w:tcPr>
-          <w:p>
-            <w:pPr>
-              <w:spacing w:after="0" w:line="240" w:lineRule="auto"/>
-              <w:jc w:val="center"/>
-              <w:cnfStyle w:val="000000000000" w:firstRow="0" w:lastRow="0" w:firstColumn="0" w:lastColumn="0" w:oddVBand="0" w:evenVBand="0" w:oddHBand="0" w:evenHBand="0" w:firstRowFirstColumn="0" w:firstRowLastColumn="0" w:lastRowFirstColumn="0" w:lastRowLastColumn="0"/>
-              <w:rPr>
-                <w:rFonts w:ascii="Helvetica" w:hAnsi="Helvetica" w:cs="Helvetica"/>
-              </w:rPr>
-            </w:pPr>
-          </w:p>
-        </w:tc>
-      </w:tr>
-      <w:tr>
-        <w:tc>
-          <w:tcPr>
-            <w:cnfStyle w:val="001000000000" w:firstRow="0" w:lastRow="0" w:firstColumn="1" w:lastColumn="0" w:oddVBand="0" w:evenVBand="0" w:oddHBand="0" w:evenHBand="0" w:firstRowFirstColumn="0" w:firstRowLastColumn="0" w:lastRowFirstColumn="0" w:lastRowLastColumn="0"/>
-            <w:tcW w:w="0" w:type="auto"/>
-            <w:tcBorders>
-              <w:top w:val="single" w:sz="4" w:space="0" w:color="E59EDC" w:themeColor="accent5" w:themeTint="66"/>
-              <w:left w:val="single" w:sz="4" w:space="0" w:color="E59EDC" w:themeColor="accent5" w:themeTint="66"/>
-              <w:right w:val="single" w:sz="4" w:space="0" w:color="E59EDC" w:themeColor="accent5" w:themeTint="66"/>
-            </w:tcBorders>
-          </w:tcPr>
-          <w:p>
-            <w:pPr>
-              <w:spacing w:after="0" w:line="240" w:lineRule="auto"/>
-              <w:jc w:val="center"/>
-              <w:rPr>
-                <w:rFonts w:ascii="Helvetica" w:hAnsi="Helvetica" w:cs="Helvetica"/>
-              </w:rPr>
-            </w:pPr>
-            <w:r>
-              <w:rPr>
-                <w:rFonts w:ascii="Helvetica" w:hAnsi="Helvetica" w:cs="Helvetica"/>
-                <w:i w:val="0"/>
-                <w:iCs w:val="0"/>
-              </w:rPr>
-              <w:t>T7</w:t>
-            </w:r>
-          </w:p>
-        </w:tc>
-        <w:tc>
-          <w:tcPr>
-            <w:tcW w:w="0" w:type="auto"/>
-            <w:tcBorders>
-              <w:left w:val="single" w:sz="4" w:space="0" w:color="E59EDC" w:themeColor="accent5" w:themeTint="66"/>
-              <w:right w:val="single" w:sz="4" w:space="0" w:color="E59EDC" w:themeColor="accent5" w:themeTint="66"/>
-            </w:tcBorders>
-          </w:tcPr>
-          <w:p>
-            <w:pPr>
-              <w:spacing w:after="0" w:line="240" w:lineRule="auto"/>
-              <w:jc w:val="center"/>
-              <w:cnfStyle w:val="000000000000" w:firstRow="0" w:lastRow="0" w:firstColumn="0" w:lastColumn="0" w:oddVBand="0" w:evenVBand="0" w:oddHBand="0" w:evenHBand="0" w:firstRowFirstColumn="0" w:firstRowLastColumn="0" w:lastRowFirstColumn="0" w:lastRowLastColumn="0"/>
-              <w:rPr>
-                <w:rFonts w:ascii="Helvetica" w:hAnsi="Helvetica" w:cs="Helvetica"/>
-                <w:b/>
-                <w:bCs/>
-                <w:i/>
-                <w:iCs/>
-              </w:rPr>
-            </w:pPr>
-            <w:r>
-              <w:rPr>
-                <w:rFonts w:ascii="Helvetica" w:hAnsi="Helvetica" w:cs="Helvetica"/>
-                <w:b/>
-                <w:bCs/>
-                <w:i/>
-                <w:iCs/>
-              </w:rPr>
-              <w:t>Create delivery area</w:t>
-            </w:r>
-          </w:p>
-        </w:tc>
-        <w:tc>
-          <w:tcPr>
-            <w:tcW w:w="0" w:type="auto"/>
-            <w:tcBorders>
-              <w:left w:val="single" w:sz="4" w:space="0" w:color="E59EDC" w:themeColor="accent5" w:themeTint="66"/>
-            </w:tcBorders>
-          </w:tcPr>
-          <w:p>
-            <w:pPr>
-              <w:spacing w:after="0" w:line="240" w:lineRule="auto"/>
-              <w:jc w:val="center"/>
-              <w:cnfStyle w:val="000000000000" w:firstRow="0" w:lastRow="0" w:firstColumn="0" w:lastColumn="0" w:oddVBand="0" w:evenVBand="0" w:oddHBand="0" w:evenHBand="0" w:firstRowFirstColumn="0" w:firstRowLastColumn="0" w:lastRowFirstColumn="0" w:lastRowLastColumn="0"/>
-              <w:rPr>
-                <w:rFonts w:ascii="Helvetica" w:hAnsi="Helvetica" w:cs="Helvetica"/>
-              </w:rPr>
-            </w:pPr>
-            <w:r>
-              <w:rPr>
-                <w:rFonts w:ascii="Helvetica" w:hAnsi="Helvetica" w:cs="Helvetica"/>
-              </w:rPr>
-              <w:t>3</w:t>
-            </w:r>
-          </w:p>
-        </w:tc>
-        <w:tc>
-          <w:tcPr>
-            <w:tcW w:w="0" w:type="auto"/>
-          </w:tcPr>
-          <w:p>
-            <w:pPr>
-              <w:spacing w:after="0" w:line="240" w:lineRule="auto"/>
-              <w:jc w:val="center"/>
-              <w:cnfStyle w:val="000000000000" w:firstRow="0" w:lastRow="0" w:firstColumn="0" w:lastColumn="0" w:oddVBand="0" w:evenVBand="0" w:oddHBand="0" w:evenHBand="0" w:firstRowFirstColumn="0" w:firstRowLastColumn="0" w:lastRowFirstColumn="0" w:lastRowLastColumn="0"/>
-              <w:rPr>
-                <w:rFonts w:ascii="Helvetica" w:hAnsi="Helvetica" w:cs="Helvetica"/>
-              </w:rPr>
-            </w:pPr>
-          </w:p>
-        </w:tc>
-      </w:tr>
-      <w:tr>
-        <w:tc>
-          <w:tcPr>
-            <w:cnfStyle w:val="001000000000" w:firstRow="0" w:lastRow="0" w:firstColumn="1" w:lastColumn="0" w:oddVBand="0" w:evenVBand="0" w:oddHBand="0" w:evenHBand="0" w:firstRowFirstColumn="0" w:firstRowLastColumn="0" w:lastRowFirstColumn="0" w:lastRowLastColumn="0"/>
-            <w:tcW w:w="0" w:type="auto"/>
-            <w:tcBorders>
-              <w:top w:val="single" w:sz="4" w:space="0" w:color="E59EDC" w:themeColor="accent5" w:themeTint="66"/>
-              <w:left w:val="single" w:sz="4" w:space="0" w:color="E59EDC" w:themeColor="accent5" w:themeTint="66"/>
-              <w:right w:val="single" w:sz="4" w:space="0" w:color="E59EDC" w:themeColor="accent5" w:themeTint="66"/>
-            </w:tcBorders>
-          </w:tcPr>
-          <w:p>
-            <w:pPr>
-              <w:spacing w:after="0" w:line="240" w:lineRule="auto"/>
-              <w:jc w:val="center"/>
-              <w:rPr>
-                <w:rFonts w:ascii="Helvetica" w:hAnsi="Helvetica" w:cs="Helvetica"/>
-                <w:i w:val="0"/>
-                <w:iCs w:val="0"/>
-              </w:rPr>
-            </w:pPr>
-            <w:r>
-              <w:rPr>
-                <w:rFonts w:ascii="Helvetica" w:hAnsi="Helvetica" w:cs="Helvetica"/>
-              </w:rPr>
-              <w:t>T8</w:t>
-            </w:r>
-          </w:p>
-        </w:tc>
-        <w:tc>
-          <w:tcPr>
-            <w:tcW w:w="0" w:type="auto"/>
-            <w:tcBorders>
-              <w:left w:val="single" w:sz="4" w:space="0" w:color="E59EDC" w:themeColor="accent5" w:themeTint="66"/>
-              <w:right w:val="single" w:sz="4" w:space="0" w:color="E59EDC" w:themeColor="accent5" w:themeTint="66"/>
-            </w:tcBorders>
-            <w:shd w:val="clear" w:color="auto" w:fill="F2CEED" w:themeFill="accent5" w:themeFillTint="33"/>
-          </w:tcPr>
-          <w:p>
-            <w:pPr>
-              <w:spacing w:after="0" w:line="240" w:lineRule="auto"/>
-              <w:jc w:val="center"/>
-              <w:cnfStyle w:val="000000000000" w:firstRow="0" w:lastRow="0" w:firstColumn="0" w:lastColumn="0" w:oddVBand="0" w:evenVBand="0" w:oddHBand="0" w:evenHBand="0" w:firstRowFirstColumn="0" w:firstRowLastColumn="0" w:lastRowFirstColumn="0" w:lastRowLastColumn="0"/>
-              <w:rPr>
-                <w:rFonts w:ascii="Helvetica" w:hAnsi="Helvetica" w:cs="Helvetica"/>
-                <w:b/>
-                <w:bCs/>
-                <w:i/>
-                <w:iCs/>
-              </w:rPr>
-            </w:pPr>
-            <w:r>
-              <w:rPr>
-                <w:rFonts w:ascii="Helvetica" w:hAnsi="Helvetica" w:cs="Helvetica"/>
-                <w:b/>
-                <w:bCs/>
-                <w:i/>
-                <w:iCs/>
-              </w:rPr>
-              <w:t>Create bill</w:t>
-            </w:r>
-          </w:p>
-        </w:tc>
-        <w:tc>
-          <w:tcPr>
-            <w:tcW w:w="0" w:type="auto"/>
-            <w:tcBorders>
-              <w:left w:val="single" w:sz="4" w:space="0" w:color="E59EDC" w:themeColor="accent5" w:themeTint="66"/>
-            </w:tcBorders>
-            <w:shd w:val="clear" w:color="auto" w:fill="F2CEED" w:themeFill="accent5" w:themeFillTint="33"/>
-          </w:tcPr>
-          <w:p>
-            <w:pPr>
-              <w:spacing w:after="0" w:line="240" w:lineRule="auto"/>
-              <w:jc w:val="center"/>
-              <w:cnfStyle w:val="000000000000" w:firstRow="0" w:lastRow="0" w:firstColumn="0" w:lastColumn="0" w:oddVBand="0" w:evenVBand="0" w:oddHBand="0" w:evenHBand="0" w:firstRowFirstColumn="0" w:firstRowLastColumn="0" w:lastRowFirstColumn="0" w:lastRowLastColumn="0"/>
-              <w:rPr>
-                <w:rFonts w:ascii="Helvetica" w:hAnsi="Helvetica" w:cs="Helvetica"/>
-              </w:rPr>
-            </w:pPr>
-            <w:r>
-              <w:rPr>
-                <w:rFonts w:ascii="Helvetica" w:hAnsi="Helvetica" w:cs="Helvetica"/>
-              </w:rPr>
-              <w:t>3</w:t>
-            </w:r>
-          </w:p>
-        </w:tc>
-        <w:tc>
-          <w:tcPr>
-            <w:tcW w:w="0" w:type="auto"/>
-            <w:shd w:val="clear" w:color="auto" w:fill="F2CEED" w:themeFill="accent5" w:themeFillTint="33"/>
-          </w:tcPr>
-          <w:p>
-            <w:pPr>
-              <w:spacing w:after="0" w:line="240" w:lineRule="auto"/>
-              <w:jc w:val="center"/>
-              <w:cnfStyle w:val="000000000000" w:firstRow="0" w:lastRow="0" w:firstColumn="0" w:lastColumn="0" w:oddVBand="0" w:evenVBand="0" w:oddHBand="0" w:evenHBand="0" w:firstRowFirstColumn="0" w:firstRowLastColumn="0" w:lastRowFirstColumn="0" w:lastRowLastColumn="0"/>
-              <w:rPr>
-                <w:rFonts w:ascii="Helvetica" w:hAnsi="Helvetica" w:cs="Helvetica"/>
-              </w:rPr>
-            </w:pPr>
-          </w:p>
-        </w:tc>
-      </w:tr>
-      <w:tr>
-        <w:tc>
-          <w:tcPr>
-            <w:cnfStyle w:val="001000000000" w:firstRow="0" w:lastRow="0" w:firstColumn="1" w:lastColumn="0" w:oddVBand="0" w:evenVBand="0" w:oddHBand="0" w:evenHBand="0" w:firstRowFirstColumn="0" w:firstRowLastColumn="0" w:lastRowFirstColumn="0" w:lastRowLastColumn="0"/>
-            <w:tcW w:w="0" w:type="auto"/>
-            <w:tcBorders>
-              <w:top w:val="single" w:sz="4" w:space="0" w:color="E59EDC" w:themeColor="accent5" w:themeTint="66"/>
-              <w:left w:val="single" w:sz="4" w:space="0" w:color="E59EDC" w:themeColor="accent5" w:themeTint="66"/>
-              <w:right w:val="single" w:sz="4" w:space="0" w:color="E59EDC" w:themeColor="accent5" w:themeTint="66"/>
-            </w:tcBorders>
-          </w:tcPr>
-          <w:p>
-            <w:pPr>
-              <w:spacing w:after="0" w:line="240" w:lineRule="auto"/>
-              <w:jc w:val="center"/>
-              <w:rPr>
-                <w:rFonts w:ascii="Helvetica" w:hAnsi="Helvetica" w:cs="Helvetica"/>
-                <w:i w:val="0"/>
-                <w:iCs w:val="0"/>
-              </w:rPr>
-            </w:pPr>
-            <w:r>
-              <w:rPr>
-                <w:rFonts w:ascii="Helvetica" w:hAnsi="Helvetica" w:cs="Helvetica"/>
-              </w:rPr>
-              <w:t>T9</w:t>
-            </w:r>
-          </w:p>
-        </w:tc>
-        <w:tc>
-          <w:tcPr>
-            <w:tcW w:w="0" w:type="auto"/>
-            <w:tcBorders>
-              <w:left w:val="single" w:sz="4" w:space="0" w:color="E59EDC" w:themeColor="accent5" w:themeTint="66"/>
-              <w:right w:val="single" w:sz="4" w:space="0" w:color="E59EDC" w:themeColor="accent5" w:themeTint="66"/>
-            </w:tcBorders>
-          </w:tcPr>
-          <w:p>
-            <w:pPr>
-              <w:spacing w:after="0" w:line="240" w:lineRule="auto"/>
-              <w:jc w:val="center"/>
-              <w:cnfStyle w:val="000000000000" w:firstRow="0" w:lastRow="0" w:firstColumn="0" w:lastColumn="0" w:oddVBand="0" w:evenVBand="0" w:oddHBand="0" w:evenHBand="0" w:firstRowFirstColumn="0" w:firstRowLastColumn="0" w:lastRowFirstColumn="0" w:lastRowLastColumn="0"/>
-              <w:rPr>
-                <w:rFonts w:ascii="Helvetica" w:hAnsi="Helvetica" w:cs="Helvetica"/>
-                <w:b/>
-                <w:bCs/>
-                <w:i/>
-                <w:iCs/>
-              </w:rPr>
-            </w:pPr>
-            <w:r>
-              <w:rPr>
-                <w:rFonts w:ascii="Helvetica" w:hAnsi="Helvetica" w:cs="Helvetica"/>
-                <w:b/>
-                <w:bCs/>
-                <w:i/>
-                <w:iCs/>
-              </w:rPr>
-              <w:t>Set up database</w:t>
-            </w:r>
-          </w:p>
-        </w:tc>
-        <w:tc>
-          <w:tcPr>
-            <w:tcW w:w="0" w:type="auto"/>
-            <w:tcBorders>
-              <w:left w:val="single" w:sz="4" w:space="0" w:color="E59EDC" w:themeColor="accent5" w:themeTint="66"/>
-            </w:tcBorders>
-          </w:tcPr>
-          <w:p>
-            <w:pPr>
-              <w:spacing w:after="0" w:line="240" w:lineRule="auto"/>
-              <w:jc w:val="center"/>
-              <w:cnfStyle w:val="000000000000" w:firstRow="0" w:lastRow="0" w:firstColumn="0" w:lastColumn="0" w:oddVBand="0" w:evenVBand="0" w:oddHBand="0" w:evenHBand="0" w:firstRowFirstColumn="0" w:firstRowLastColumn="0" w:lastRowFirstColumn="0" w:lastRowLastColumn="0"/>
-              <w:rPr>
-                <w:rFonts w:ascii="Helvetica" w:hAnsi="Helvetica" w:cs="Helvetica"/>
-              </w:rPr>
-            </w:pPr>
-            <w:r>
-              <w:rPr>
-                <w:rFonts w:ascii="Helvetica" w:hAnsi="Helvetica" w:cs="Helvetica"/>
-              </w:rPr>
-              <w:t>2</w:t>
-            </w:r>
-          </w:p>
-        </w:tc>
-        <w:tc>
-          <w:tcPr>
-            <w:tcW w:w="0" w:type="auto"/>
-          </w:tcPr>
-          <w:p>
-            <w:pPr>
-              <w:spacing w:after="0" w:line="240" w:lineRule="auto"/>
-              <w:jc w:val="center"/>
-              <w:cnfStyle w:val="000000000000" w:firstRow="0" w:lastRow="0" w:firstColumn="0" w:lastColumn="0" w:oddVBand="0" w:evenVBand="0" w:oddHBand="0" w:evenHBand="0" w:firstRowFirstColumn="0" w:firstRowLastColumn="0" w:lastRowFirstColumn="0" w:lastRowLastColumn="0"/>
-              <w:rPr>
-                <w:rFonts w:ascii="Helvetica" w:hAnsi="Helvetica" w:cs="Helvetica"/>
-              </w:rPr>
-            </w:pPr>
-            <w:r>
-              <w:rPr>
-                <w:rFonts w:ascii="Helvetica" w:hAnsi="Helvetica" w:cs="Helvetica"/>
-              </w:rPr>
-              <w:t>T1</w:t>
-            </w:r>
-          </w:p>
-        </w:tc>
-      </w:tr>
-      <w:tr>
-        <w:tc>
-          <w:tcPr>
-            <w:cnfStyle w:val="001000000000" w:firstRow="0" w:lastRow="0" w:firstColumn="1" w:lastColumn="0" w:oddVBand="0" w:evenVBand="0" w:oddHBand="0" w:evenHBand="0" w:firstRowFirstColumn="0" w:firstRowLastColumn="0" w:lastRowFirstColumn="0" w:lastRowLastColumn="0"/>
-            <w:tcW w:w="0" w:type="auto"/>
-            <w:tcBorders>
-              <w:top w:val="single" w:sz="4" w:space="0" w:color="E59EDC" w:themeColor="accent5" w:themeTint="66"/>
-              <w:left w:val="single" w:sz="4" w:space="0" w:color="E59EDC" w:themeColor="accent5" w:themeTint="66"/>
-              <w:right w:val="single" w:sz="4" w:space="0" w:color="E59EDC" w:themeColor="accent5" w:themeTint="66"/>
-            </w:tcBorders>
-          </w:tcPr>
-          <w:p>
-            <w:pPr>
-              <w:spacing w:after="0" w:line="240" w:lineRule="auto"/>
-              <w:jc w:val="center"/>
-              <w:rPr>
-                <w:rFonts w:ascii="Helvetica" w:hAnsi="Helvetica" w:cs="Helvetica"/>
-                <w:i w:val="0"/>
-                <w:iCs w:val="0"/>
-              </w:rPr>
-            </w:pPr>
-            <w:r>
-              <w:rPr>
-                <w:rFonts w:ascii="Helvetica" w:hAnsi="Helvetica" w:cs="Helvetica"/>
-              </w:rPr>
-              <w:t>T10</w:t>
-            </w:r>
-          </w:p>
-        </w:tc>
-        <w:tc>
-          <w:tcPr>
-            <w:tcW w:w="0" w:type="auto"/>
-            <w:tcBorders>
-              <w:left w:val="single" w:sz="4" w:space="0" w:color="E59EDC" w:themeColor="accent5" w:themeTint="66"/>
-              <w:right w:val="single" w:sz="4" w:space="0" w:color="E59EDC" w:themeColor="accent5" w:themeTint="66"/>
-            </w:tcBorders>
-            <w:shd w:val="clear" w:color="auto" w:fill="F2CEED" w:themeFill="accent5" w:themeFillTint="33"/>
-          </w:tcPr>
-          <w:p>
-            <w:pPr>
-              <w:spacing w:after="0" w:line="240" w:lineRule="auto"/>
-              <w:jc w:val="center"/>
-              <w:cnfStyle w:val="000000000000" w:firstRow="0" w:lastRow="0" w:firstColumn="0" w:lastColumn="0" w:oddVBand="0" w:evenVBand="0" w:oddHBand="0" w:evenHBand="0" w:firstRowFirstColumn="0" w:firstRowLastColumn="0" w:lastRowFirstColumn="0" w:lastRowLastColumn="0"/>
-              <w:rPr>
-                <w:rFonts w:ascii="Helvetica" w:hAnsi="Helvetica" w:cs="Helvetica"/>
-                <w:b/>
-                <w:bCs/>
-                <w:i/>
-                <w:iCs/>
-              </w:rPr>
-            </w:pPr>
-            <w:r>
-              <w:rPr>
-                <w:rFonts w:ascii="Helvetica" w:hAnsi="Helvetica" w:cs="Helvetica"/>
-                <w:b/>
-                <w:bCs/>
-                <w:i/>
-                <w:iCs/>
-              </w:rPr>
-              <w:t>Implementing database</w:t>
-            </w:r>
-          </w:p>
-        </w:tc>
-        <w:tc>
-          <w:tcPr>
-            <w:tcW w:w="0" w:type="auto"/>
-            <w:tcBorders>
-              <w:left w:val="single" w:sz="4" w:space="0" w:color="E59EDC" w:themeColor="accent5" w:themeTint="66"/>
-            </w:tcBorders>
-            <w:shd w:val="clear" w:color="auto" w:fill="F2CEED" w:themeFill="accent5" w:themeFillTint="33"/>
-          </w:tcPr>
-          <w:p>
-            <w:pPr>
-              <w:spacing w:after="0" w:line="240" w:lineRule="auto"/>
-              <w:jc w:val="center"/>
-              <w:cnfStyle w:val="000000000000" w:firstRow="0" w:lastRow="0" w:firstColumn="0" w:lastColumn="0" w:oddVBand="0" w:evenVBand="0" w:oddHBand="0" w:evenHBand="0" w:firstRowFirstColumn="0" w:firstRowLastColumn="0" w:lastRowFirstColumn="0" w:lastRowLastColumn="0"/>
-              <w:rPr>
-                <w:rFonts w:ascii="Helvetica" w:hAnsi="Helvetica" w:cs="Helvetica"/>
-              </w:rPr>
-            </w:pPr>
-            <w:r>
-              <w:rPr>
-                <w:rFonts w:ascii="Helvetica" w:hAnsi="Helvetica" w:cs="Helvetica"/>
-              </w:rPr>
-              <w:t>5</w:t>
-            </w:r>
-          </w:p>
-        </w:tc>
-        <w:tc>
-          <w:tcPr>
-            <w:tcW w:w="0" w:type="auto"/>
-            <w:shd w:val="clear" w:color="auto" w:fill="F2CEED" w:themeFill="accent5" w:themeFillTint="33"/>
-          </w:tcPr>
-          <w:p>
-            <w:pPr>
-              <w:spacing w:after="0" w:line="240" w:lineRule="auto"/>
-              <w:jc w:val="center"/>
-              <w:cnfStyle w:val="000000000000" w:firstRow="0" w:lastRow="0" w:firstColumn="0" w:lastColumn="0" w:oddVBand="0" w:evenVBand="0" w:oddHBand="0" w:evenHBand="0" w:firstRowFirstColumn="0" w:firstRowLastColumn="0" w:lastRowFirstColumn="0" w:lastRowLastColumn="0"/>
-              <w:rPr>
-                <w:rFonts w:ascii="Helvetica" w:hAnsi="Helvetica" w:cs="Helvetica"/>
-              </w:rPr>
-            </w:pPr>
-            <w:r>
-              <w:rPr>
-                <w:rFonts w:ascii="Helvetica" w:hAnsi="Helvetica" w:cs="Helvetica"/>
-              </w:rPr>
-              <w:t>T1-T4</w:t>
-            </w:r>
-          </w:p>
-        </w:tc>
-      </w:tr>
-      <w:tr>
-        <w:tc>
-          <w:tcPr>
-            <w:cnfStyle w:val="001000000000" w:firstRow="0" w:lastRow="0" w:firstColumn="1" w:lastColumn="0" w:oddVBand="0" w:evenVBand="0" w:oddHBand="0" w:evenHBand="0" w:firstRowFirstColumn="0" w:firstRowLastColumn="0" w:lastRowFirstColumn="0" w:lastRowLastColumn="0"/>
-            <w:tcW w:w="0" w:type="auto"/>
-            <w:tcBorders>
-              <w:top w:val="single" w:sz="4" w:space="0" w:color="E59EDC" w:themeColor="accent5" w:themeTint="66"/>
-              <w:left w:val="single" w:sz="4" w:space="0" w:color="E59EDC" w:themeColor="accent5" w:themeTint="66"/>
-              <w:bottom w:val="single" w:sz="4" w:space="0" w:color="E59EDC" w:themeColor="accent5" w:themeTint="66"/>
-              <w:right w:val="single" w:sz="4" w:space="0" w:color="E59EDC" w:themeColor="accent5" w:themeTint="66"/>
-            </w:tcBorders>
-          </w:tcPr>
-          <w:p>
-            <w:pPr>
-              <w:spacing w:after="0" w:line="240" w:lineRule="auto"/>
-              <w:jc w:val="center"/>
-              <w:rPr>
-                <w:rFonts w:ascii="Helvetica" w:hAnsi="Helvetica" w:cs="Helvetica"/>
-                <w:i w:val="0"/>
-                <w:iCs w:val="0"/>
-              </w:rPr>
-            </w:pPr>
-            <w:r>
-              <w:rPr>
-                <w:rFonts w:ascii="Helvetica" w:hAnsi="Helvetica" w:cs="Helvetica"/>
-              </w:rPr>
-              <w:t>T11</w:t>
-            </w:r>
-          </w:p>
-        </w:tc>
-        <w:tc>
-          <w:tcPr>
-            <w:tcW w:w="0" w:type="auto"/>
-            <w:tcBorders>
-              <w:left w:val="single" w:sz="4" w:space="0" w:color="E59EDC" w:themeColor="accent5" w:themeTint="66"/>
-              <w:right w:val="single" w:sz="4" w:space="0" w:color="E59EDC" w:themeColor="accent5" w:themeTint="66"/>
-            </w:tcBorders>
-          </w:tcPr>
-          <w:p>
-            <w:pPr>
-              <w:spacing w:after="0" w:line="240" w:lineRule="auto"/>
-              <w:jc w:val="center"/>
-              <w:cnfStyle w:val="000000000000" w:firstRow="0" w:lastRow="0" w:firstColumn="0" w:lastColumn="0" w:oddVBand="0" w:evenVBand="0" w:oddHBand="0" w:evenHBand="0" w:firstRowFirstColumn="0" w:firstRowLastColumn="0" w:lastRowFirstColumn="0" w:lastRowLastColumn="0"/>
-              <w:rPr>
-                <w:rFonts w:ascii="Helvetica" w:hAnsi="Helvetica" w:cs="Helvetica"/>
-                <w:b/>
-                <w:bCs/>
-                <w:i/>
-                <w:iCs/>
-              </w:rPr>
-            </w:pPr>
-            <w:r>
-              <w:rPr>
-                <w:rFonts w:ascii="Helvetica" w:hAnsi="Helvetica" w:cs="Helvetica"/>
-                <w:b/>
-                <w:bCs/>
-                <w:i/>
-                <w:iCs/>
-              </w:rPr>
-              <w:t>Set up GUI</w:t>
-            </w:r>
-          </w:p>
-        </w:tc>
-        <w:tc>
-          <w:tcPr>
-            <w:tcW w:w="0" w:type="auto"/>
-            <w:tcBorders>
-              <w:left w:val="single" w:sz="4" w:space="0" w:color="E59EDC" w:themeColor="accent5" w:themeTint="66"/>
-            </w:tcBorders>
-          </w:tcPr>
-          <w:p>
-            <w:pPr>
-              <w:spacing w:after="0" w:line="240" w:lineRule="auto"/>
-              <w:jc w:val="center"/>
-              <w:cnfStyle w:val="000000000000" w:firstRow="0" w:lastRow="0" w:firstColumn="0" w:lastColumn="0" w:oddVBand="0" w:evenVBand="0" w:oddHBand="0" w:evenHBand="0" w:firstRowFirstColumn="0" w:firstRowLastColumn="0" w:lastRowFirstColumn="0" w:lastRowLastColumn="0"/>
-              <w:rPr>
-                <w:rFonts w:ascii="Helvetica" w:hAnsi="Helvetica" w:cs="Helvetica"/>
-              </w:rPr>
-            </w:pPr>
-          </w:p>
-        </w:tc>
-        <w:tc>
-          <w:tcPr>
-            <w:tcW w:w="0" w:type="auto"/>
-          </w:tcPr>
-          <w:p>
-            <w:pPr>
-              <w:spacing w:after="0" w:line="240" w:lineRule="auto"/>
-              <w:jc w:val="center"/>
-              <w:cnfStyle w:val="000000000000" w:firstRow="0" w:lastRow="0" w:firstColumn="0" w:lastColumn="0" w:oddVBand="0" w:evenVBand="0" w:oddHBand="0" w:evenHBand="0" w:firstRowFirstColumn="0" w:firstRowLastColumn="0" w:lastRowFirstColumn="0" w:lastRowLastColumn="0"/>
-              <w:rPr>
-                <w:rFonts w:ascii="Helvetica" w:hAnsi="Helvetica" w:cs="Helvetica"/>
-              </w:rPr>
-            </w:pPr>
-            <w:r>
-              <w:rPr>
-                <w:rFonts w:ascii="Helvetica" w:hAnsi="Helvetica" w:cs="Helvetica"/>
-              </w:rPr>
-              <w:t>T1-T8</w:t>
-            </w:r>
+              </w:rPr>
+            </w:pPr>
           </w:p>
         </w:tc>
       </w:tr>
@@ -1471,24 +1650,11 @@
       <w:r>
         <w:rPr>
           <w:rFonts w:ascii="Helvetica" w:hAnsi="Helvetica" w:cs="Helvetica"/>
-        </w:rPr>
-        <w:t>Explain tasks, JUNITS, Class, database integration</w:t>
-      </w:r>
-    </w:p>
-    <w:p>
-      <w:pPr>
-        <w:rPr>
-          <w:rFonts w:ascii="Helvetica" w:hAnsi="Helvetica" w:cs="Helvetica"/>
-        </w:rPr>
-      </w:pPr>
-      <w:r>
-        <w:rPr>
-          <w:rFonts w:ascii="Helvetica" w:hAnsi="Helvetica" w:cs="Helvetica"/>
           <w:noProof/>
         </w:rPr>
         <w:lastRenderedPageBreak/>
         <w:drawing>
-          <wp:inline distT="0" distB="0" distL="0" distR="0" wp14:anchorId="34F0C00E" wp14:editId="0B0A24BD">
+          <wp:inline distT="0" distB="0" distL="0" distR="0" wp14:anchorId="34F0C00E" wp14:editId="4D23D45B">
             <wp:extent cx="5486400" cy="3200400"/>
             <wp:effectExtent l="0" t="0" r="0" b="0"/>
             <wp:docPr id="1770840092" name="Chart 2"/>
@@ -1518,6 +1684,7 @@
       <w:tr>
         <w:trPr>
           <w:cnfStyle w:val="100000000000" w:firstRow="1" w:lastRow="0" w:firstColumn="0" w:lastColumn="0" w:oddVBand="0" w:evenVBand="0" w:oddHBand="0" w:evenHBand="0" w:firstRowFirstColumn="0" w:firstRowLastColumn="0" w:lastRowFirstColumn="0" w:lastRowLastColumn="0"/>
+          <w:trHeight w:val="346"/>
         </w:trPr>
         <w:tc>
           <w:tcPr>
@@ -1530,6 +1697,7 @@
               <w:bottom w:val="nil"/>
               <w:right w:val="single" w:sz="4" w:space="0" w:color="E59EDC" w:themeColor="accent5" w:themeTint="66"/>
             </w:tcBorders>
+            <w:vAlign w:val="center"/>
           </w:tcPr>
           <w:p>
             <w:pPr>
@@ -1553,6 +1721,9 @@
         </w:tc>
       </w:tr>
       <w:tr>
+        <w:trPr>
+          <w:trHeight w:val="346"/>
+        </w:trPr>
         <w:tc>
           <w:tcPr>
             <w:cnfStyle w:val="001000000000" w:firstRow="0" w:lastRow="0" w:firstColumn="1" w:lastColumn="0" w:oddVBand="0" w:evenVBand="0" w:oddHBand="0" w:evenHBand="0" w:firstRowFirstColumn="0" w:firstRowLastColumn="0" w:lastRowFirstColumn="0" w:lastRowLastColumn="0"/>
@@ -1562,10 +1733,12 @@
               <w:left w:val="single" w:sz="4" w:space="0" w:color="E59EDC" w:themeColor="accent5" w:themeTint="66"/>
               <w:right w:val="single" w:sz="4" w:space="0" w:color="E59EDC" w:themeColor="accent5" w:themeTint="66"/>
             </w:tcBorders>
-          </w:tcPr>
-          <w:p>
-            <w:pPr>
-              <w:spacing w:after="0" w:line="240" w:lineRule="auto"/>
+            <w:vAlign w:val="center"/>
+          </w:tcPr>
+          <w:p>
+            <w:pPr>
+              <w:spacing w:after="0" w:line="240" w:lineRule="auto"/>
+              <w:jc w:val="center"/>
               <w:rPr>
                 <w:rFonts w:ascii="Helvetica" w:hAnsi="Helvetica" w:cs="Helvetica"/>
               </w:rPr>
@@ -1590,6 +1763,7 @@
               <w:right w:val="single" w:sz="4" w:space="0" w:color="E59EDC" w:themeColor="accent5" w:themeTint="66"/>
             </w:tcBorders>
             <w:shd w:val="clear" w:color="auto" w:fill="F2CEED" w:themeFill="accent5" w:themeFillTint="33"/>
+            <w:vAlign w:val="center"/>
           </w:tcPr>
           <w:p>
             <w:pPr>
@@ -1618,6 +1792,7 @@
               <w:right w:val="single" w:sz="4" w:space="0" w:color="E59EDC" w:themeColor="accent5" w:themeTint="66"/>
             </w:tcBorders>
             <w:shd w:val="clear" w:color="auto" w:fill="F2CEED" w:themeFill="accent5" w:themeFillTint="33"/>
+            <w:vAlign w:val="center"/>
           </w:tcPr>
           <w:p>
             <w:pPr>
@@ -1646,6 +1821,7 @@
               <w:right w:val="single" w:sz="4" w:space="0" w:color="E59EDC" w:themeColor="accent5" w:themeTint="66"/>
             </w:tcBorders>
             <w:shd w:val="clear" w:color="auto" w:fill="F2CEED" w:themeFill="accent5" w:themeFillTint="33"/>
+            <w:vAlign w:val="center"/>
           </w:tcPr>
           <w:p>
             <w:pPr>
@@ -1674,6 +1850,7 @@
               <w:right w:val="single" w:sz="4" w:space="0" w:color="E59EDC" w:themeColor="accent5" w:themeTint="66"/>
             </w:tcBorders>
             <w:shd w:val="clear" w:color="auto" w:fill="F2CEED" w:themeFill="accent5" w:themeFillTint="33"/>
+            <w:vAlign w:val="center"/>
           </w:tcPr>
           <w:p>
             <w:pPr>
@@ -1694,6 +1871,9 @@
         </w:tc>
       </w:tr>
       <w:tr>
+        <w:trPr>
+          <w:trHeight w:val="346"/>
+        </w:trPr>
         <w:tc>
           <w:tcPr>
             <w:cnfStyle w:val="001000000000" w:firstRow="0" w:lastRow="0" w:firstColumn="1" w:lastColumn="0" w:oddVBand="0" w:evenVBand="0" w:oddHBand="0" w:evenHBand="0" w:firstRowFirstColumn="0" w:firstRowLastColumn="0" w:lastRowFirstColumn="0" w:lastRowLastColumn="0"/>
@@ -1703,6 +1883,7 @@
               <w:left w:val="single" w:sz="4" w:space="0" w:color="E59EDC" w:themeColor="accent5" w:themeTint="66"/>
               <w:right w:val="single" w:sz="4" w:space="0" w:color="E59EDC" w:themeColor="accent5" w:themeTint="66"/>
             </w:tcBorders>
+            <w:vAlign w:val="center"/>
           </w:tcPr>
           <w:p>
             <w:pPr>
@@ -1729,6 +1910,7 @@
               <w:top w:val="single" w:sz="4" w:space="0" w:color="E59EDC" w:themeColor="accent5" w:themeTint="66"/>
               <w:left w:val="single" w:sz="4" w:space="0" w:color="E59EDC" w:themeColor="accent5" w:themeTint="66"/>
             </w:tcBorders>
+            <w:vAlign w:val="center"/>
           </w:tcPr>
           <w:p>
             <w:pPr>
@@ -1745,6 +1927,12 @@
               </w:rPr>
               <w:t>T</w:t>
             </w:r>
+            <w:r>
+              <w:rPr>
+                <w:rFonts w:ascii="Helvetica" w:hAnsi="Helvetica" w:cs="Helvetica"/>
+              </w:rPr>
+              <w:t>9</w:t>
+            </w:r>
           </w:p>
         </w:tc>
         <w:tc>
@@ -1753,6 +1941,7 @@
             <w:tcBorders>
               <w:top w:val="single" w:sz="4" w:space="0" w:color="E59EDC" w:themeColor="accent5" w:themeTint="66"/>
             </w:tcBorders>
+            <w:vAlign w:val="center"/>
           </w:tcPr>
           <w:p>
             <w:pPr>
@@ -1773,9 +1962,8 @@
             <w:r>
               <w:rPr>
                 <w:rFonts w:ascii="Helvetica" w:hAnsi="Helvetica" w:cs="Helvetica"/>
-                <w:lang w:val="en-US"/>
-              </w:rPr>
-              <w:t>1</w:t>
+              </w:rPr>
+              <w:t>12, T1</w:t>
             </w:r>
           </w:p>
         </w:tc>
@@ -1785,6 +1973,7 @@
             <w:tcBorders>
               <w:top w:val="single" w:sz="4" w:space="0" w:color="E59EDC" w:themeColor="accent5" w:themeTint="66"/>
             </w:tcBorders>
+            <w:vAlign w:val="center"/>
           </w:tcPr>
           <w:p>
             <w:pPr>
@@ -1801,6 +1990,12 @@
               </w:rPr>
               <w:t>T</w:t>
             </w:r>
+            <w:r>
+              <w:rPr>
+                <w:rFonts w:ascii="Helvetica" w:hAnsi="Helvetica" w:cs="Helvetica"/>
+              </w:rPr>
+              <w:t>2</w:t>
+            </w:r>
           </w:p>
         </w:tc>
         <w:tc>
@@ -1809,6 +2004,7 @@
             <w:tcBorders>
               <w:top w:val="single" w:sz="4" w:space="0" w:color="E59EDC" w:themeColor="accent5" w:themeTint="66"/>
             </w:tcBorders>
+            <w:vAlign w:val="center"/>
           </w:tcPr>
           <w:p>
             <w:pPr>
@@ -1824,11 +2020,20 @@
                 <w:rFonts w:ascii="Helvetica" w:hAnsi="Helvetica" w:cs="Helvetica"/>
               </w:rPr>
               <w:t>T</w:t>
+            </w:r>
+            <w:r>
+              <w:rPr>
+                <w:rFonts w:ascii="Helvetica" w:hAnsi="Helvetica" w:cs="Helvetica"/>
+              </w:rPr>
+              <w:t>12, T2</w:t>
             </w:r>
           </w:p>
         </w:tc>
       </w:tr>
       <w:tr>
+        <w:trPr>
+          <w:trHeight w:val="346"/>
+        </w:trPr>
         <w:tc>
           <w:tcPr>
             <w:cnfStyle w:val="001000000000" w:firstRow="0" w:lastRow="0" w:firstColumn="1" w:lastColumn="0" w:oddVBand="0" w:evenVBand="0" w:oddHBand="0" w:evenHBand="0" w:firstRowFirstColumn="0" w:firstRowLastColumn="0" w:lastRowFirstColumn="0" w:lastRowLastColumn="0"/>
@@ -1838,6 +2043,7 @@
               <w:left w:val="single" w:sz="4" w:space="0" w:color="E59EDC" w:themeColor="accent5" w:themeTint="66"/>
               <w:right w:val="single" w:sz="4" w:space="0" w:color="E59EDC" w:themeColor="accent5" w:themeTint="66"/>
             </w:tcBorders>
+            <w:vAlign w:val="center"/>
           </w:tcPr>
           <w:p>
             <w:pPr>
@@ -1864,6 +2070,7 @@
               <w:left w:val="single" w:sz="4" w:space="0" w:color="E59EDC" w:themeColor="accent5" w:themeTint="66"/>
             </w:tcBorders>
             <w:shd w:val="clear" w:color="auto" w:fill="F2CEED" w:themeFill="accent5" w:themeFillTint="33"/>
+            <w:vAlign w:val="center"/>
           </w:tcPr>
           <w:p>
             <w:pPr>
@@ -1894,6 +2101,7 @@
           <w:tcPr>
             <w:tcW w:w="2071" w:type="dxa"/>
             <w:shd w:val="clear" w:color="auto" w:fill="F2CEED" w:themeFill="accent5" w:themeFillTint="33"/>
+            <w:vAlign w:val="center"/>
           </w:tcPr>
           <w:p>
             <w:pPr>
@@ -1916,6 +2124,7 @@
           <w:tcPr>
             <w:tcW w:w="2048" w:type="dxa"/>
             <w:shd w:val="clear" w:color="auto" w:fill="F2CEED" w:themeFill="accent5" w:themeFillTint="33"/>
+            <w:vAlign w:val="center"/>
           </w:tcPr>
           <w:p>
             <w:pPr>
@@ -1946,6 +2155,7 @@
           <w:tcPr>
             <w:tcW w:w="2064" w:type="dxa"/>
             <w:shd w:val="clear" w:color="auto" w:fill="F2CEED" w:themeFill="accent5" w:themeFillTint="33"/>
+            <w:vAlign w:val="center"/>
           </w:tcPr>
           <w:p>
             <w:pPr>
@@ -1974,6 +2184,9 @@
         </w:tc>
       </w:tr>
       <w:tr>
+        <w:trPr>
+          <w:trHeight w:val="346"/>
+        </w:trPr>
         <w:tc>
           <w:tcPr>
             <w:cnfStyle w:val="001000000000" w:firstRow="0" w:lastRow="0" w:firstColumn="1" w:lastColumn="0" w:oddVBand="0" w:evenVBand="0" w:oddHBand="0" w:evenHBand="0" w:firstRowFirstColumn="0" w:firstRowLastColumn="0" w:lastRowFirstColumn="0" w:lastRowLastColumn="0"/>
@@ -1983,6 +2196,7 @@
               <w:left w:val="single" w:sz="4" w:space="0" w:color="E59EDC" w:themeColor="accent5" w:themeTint="66"/>
               <w:right w:val="single" w:sz="4" w:space="0" w:color="E59EDC" w:themeColor="accent5" w:themeTint="66"/>
             </w:tcBorders>
+            <w:vAlign w:val="center"/>
           </w:tcPr>
           <w:p>
             <w:pPr>
@@ -2008,6 +2222,7 @@
             <w:tcBorders>
               <w:left w:val="single" w:sz="4" w:space="0" w:color="E59EDC" w:themeColor="accent5" w:themeTint="66"/>
             </w:tcBorders>
+            <w:vAlign w:val="center"/>
           </w:tcPr>
           <w:p>
             <w:pPr>
@@ -2028,13 +2243,14 @@
               <w:rPr>
                 <w:rFonts w:ascii="Helvetica" w:hAnsi="Helvetica" w:cs="Helvetica"/>
               </w:rPr>
-              <w:t>9</w:t>
+              <w:t>10</w:t>
             </w:r>
           </w:p>
         </w:tc>
         <w:tc>
           <w:tcPr>
             <w:tcW w:w="2071" w:type="dxa"/>
+            <w:vAlign w:val="center"/>
           </w:tcPr>
           <w:p>
             <w:pPr>
@@ -2056,6 +2272,7 @@
         <w:tc>
           <w:tcPr>
             <w:tcW w:w="2048" w:type="dxa"/>
+            <w:vAlign w:val="center"/>
           </w:tcPr>
           <w:p>
             <w:pPr>
@@ -2077,6 +2294,7 @@
         <w:tc>
           <w:tcPr>
             <w:tcW w:w="2064" w:type="dxa"/>
+            <w:vAlign w:val="center"/>
           </w:tcPr>
           <w:p>
             <w:pPr>
@@ -2097,6 +2315,9 @@
         </w:tc>
       </w:tr>
       <w:tr>
+        <w:trPr>
+          <w:trHeight w:val="346"/>
+        </w:trPr>
         <w:tc>
           <w:tcPr>
             <w:cnfStyle w:val="001000000000" w:firstRow="0" w:lastRow="0" w:firstColumn="1" w:lastColumn="0" w:oddVBand="0" w:evenVBand="0" w:oddHBand="0" w:evenHBand="0" w:firstRowFirstColumn="0" w:firstRowLastColumn="0" w:lastRowFirstColumn="0" w:lastRowLastColumn="0"/>
@@ -2106,6 +2327,7 @@
               <w:left w:val="single" w:sz="4" w:space="0" w:color="E59EDC" w:themeColor="accent5" w:themeTint="66"/>
               <w:right w:val="single" w:sz="4" w:space="0" w:color="E59EDC" w:themeColor="accent5" w:themeTint="66"/>
             </w:tcBorders>
+            <w:vAlign w:val="center"/>
           </w:tcPr>
           <w:p>
             <w:pPr>
@@ -2132,6 +2354,7 @@
               <w:left w:val="single" w:sz="4" w:space="0" w:color="E59EDC" w:themeColor="accent5" w:themeTint="66"/>
             </w:tcBorders>
             <w:shd w:val="clear" w:color="auto" w:fill="F2CEED" w:themeFill="accent5" w:themeFillTint="33"/>
+            <w:vAlign w:val="center"/>
           </w:tcPr>
           <w:p>
             <w:pPr>
@@ -2152,7 +2375,7 @@
               <w:rPr>
                 <w:rFonts w:ascii="Helvetica" w:hAnsi="Helvetica" w:cs="Helvetica"/>
               </w:rPr>
-              <w:t>9</w:t>
+              <w:t>10</w:t>
             </w:r>
           </w:p>
         </w:tc>
@@ -2160,6 +2383,7 @@
           <w:tcPr>
             <w:tcW w:w="2071" w:type="dxa"/>
             <w:shd w:val="clear" w:color="auto" w:fill="F2CEED" w:themeFill="accent5" w:themeFillTint="33"/>
+            <w:vAlign w:val="center"/>
           </w:tcPr>
           <w:p>
             <w:pPr>
@@ -2182,6 +2406,7 @@
           <w:tcPr>
             <w:tcW w:w="2048" w:type="dxa"/>
             <w:shd w:val="clear" w:color="auto" w:fill="F2CEED" w:themeFill="accent5" w:themeFillTint="33"/>
+            <w:vAlign w:val="center"/>
           </w:tcPr>
           <w:p>
             <w:pPr>
@@ -2204,6 +2429,7 @@
           <w:tcPr>
             <w:tcW w:w="2064" w:type="dxa"/>
             <w:shd w:val="clear" w:color="auto" w:fill="F2CEED" w:themeFill="accent5" w:themeFillTint="33"/>
+            <w:vAlign w:val="center"/>
           </w:tcPr>
           <w:p>
             <w:pPr>
@@ -2224,6 +2450,9 @@
         </w:tc>
       </w:tr>
       <w:tr>
+        <w:trPr>
+          <w:trHeight w:val="346"/>
+        </w:trPr>
         <w:tc>
           <w:tcPr>
             <w:cnfStyle w:val="001000000000" w:firstRow="0" w:lastRow="0" w:firstColumn="1" w:lastColumn="0" w:oddVBand="0" w:evenVBand="0" w:oddHBand="0" w:evenHBand="0" w:firstRowFirstColumn="0" w:firstRowLastColumn="0" w:lastRowFirstColumn="0" w:lastRowLastColumn="0"/>
@@ -2233,6 +2462,7 @@
               <w:left w:val="single" w:sz="4" w:space="0" w:color="E59EDC" w:themeColor="accent5" w:themeTint="66"/>
               <w:right w:val="single" w:sz="4" w:space="0" w:color="E59EDC" w:themeColor="accent5" w:themeTint="66"/>
             </w:tcBorders>
+            <w:vAlign w:val="center"/>
           </w:tcPr>
           <w:p>
             <w:pPr>
@@ -2258,6 +2488,7 @@
             <w:tcBorders>
               <w:left w:val="single" w:sz="4" w:space="0" w:color="E59EDC" w:themeColor="accent5" w:themeTint="66"/>
             </w:tcBorders>
+            <w:vAlign w:val="center"/>
           </w:tcPr>
           <w:p>
             <w:pPr>
@@ -2285,6 +2516,7 @@
         <w:tc>
           <w:tcPr>
             <w:tcW w:w="2071" w:type="dxa"/>
+            <w:vAlign w:val="center"/>
           </w:tcPr>
           <w:p>
             <w:pPr>
@@ -2312,6 +2544,7 @@
         <w:tc>
           <w:tcPr>
             <w:tcW w:w="2048" w:type="dxa"/>
+            <w:vAlign w:val="center"/>
           </w:tcPr>
           <w:p>
             <w:pPr>
@@ -2333,6 +2566,7 @@
         <w:tc>
           <w:tcPr>
             <w:tcW w:w="2064" w:type="dxa"/>
+            <w:vAlign w:val="center"/>
           </w:tcPr>
           <w:p>
             <w:pPr>
@@ -2353,6 +2587,9 @@
         </w:tc>
       </w:tr>
       <w:tr>
+        <w:trPr>
+          <w:trHeight w:val="346"/>
+        </w:trPr>
         <w:tc>
           <w:tcPr>
             <w:cnfStyle w:val="001000000000" w:firstRow="0" w:lastRow="0" w:firstColumn="1" w:lastColumn="0" w:oddVBand="0" w:evenVBand="0" w:oddHBand="0" w:evenHBand="0" w:firstRowFirstColumn="0" w:firstRowLastColumn="0" w:lastRowFirstColumn="0" w:lastRowLastColumn="0"/>
@@ -2362,6 +2599,7 @@
               <w:left w:val="single" w:sz="4" w:space="0" w:color="E59EDC" w:themeColor="accent5" w:themeTint="66"/>
               <w:right w:val="single" w:sz="4" w:space="0" w:color="E59EDC" w:themeColor="accent5" w:themeTint="66"/>
             </w:tcBorders>
+            <w:vAlign w:val="center"/>
           </w:tcPr>
           <w:p>
             <w:pPr>
@@ -2388,6 +2626,7 @@
               <w:left w:val="single" w:sz="4" w:space="0" w:color="E59EDC" w:themeColor="accent5" w:themeTint="66"/>
             </w:tcBorders>
             <w:shd w:val="clear" w:color="auto" w:fill="F2CEED" w:themeFill="accent5" w:themeFillTint="33"/>
+            <w:vAlign w:val="center"/>
           </w:tcPr>
           <w:p>
             <w:pPr>
@@ -2416,6 +2655,7 @@
           <w:tcPr>
             <w:tcW w:w="2071" w:type="dxa"/>
             <w:shd w:val="clear" w:color="auto" w:fill="F2CEED" w:themeFill="accent5" w:themeFillTint="33"/>
+            <w:vAlign w:val="center"/>
           </w:tcPr>
           <w:p>
             <w:pPr>
@@ -2444,6 +2684,7 @@
           <w:tcPr>
             <w:tcW w:w="2048" w:type="dxa"/>
             <w:shd w:val="clear" w:color="auto" w:fill="F2CEED" w:themeFill="accent5" w:themeFillTint="33"/>
+            <w:vAlign w:val="center"/>
           </w:tcPr>
           <w:p>
             <w:pPr>
@@ -2466,6 +2707,7 @@
           <w:tcPr>
             <w:tcW w:w="2064" w:type="dxa"/>
             <w:shd w:val="clear" w:color="auto" w:fill="F2CEED" w:themeFill="accent5" w:themeFillTint="33"/>
+            <w:vAlign w:val="center"/>
           </w:tcPr>
           <w:p>
             <w:pPr>
@@ -2486,6 +2728,9 @@
         </w:tc>
       </w:tr>
       <w:tr>
+        <w:trPr>
+          <w:trHeight w:val="346"/>
+        </w:trPr>
         <w:tc>
           <w:tcPr>
             <w:cnfStyle w:val="001000000000" w:firstRow="0" w:lastRow="0" w:firstColumn="1" w:lastColumn="0" w:oddVBand="0" w:evenVBand="0" w:oddHBand="0" w:evenHBand="0" w:firstRowFirstColumn="0" w:firstRowLastColumn="0" w:lastRowFirstColumn="0" w:lastRowLastColumn="0"/>
@@ -2496,6 +2741,7 @@
               <w:bottom w:val="single" w:sz="4" w:space="0" w:color="E59EDC" w:themeColor="accent5" w:themeTint="66"/>
               <w:right w:val="single" w:sz="4" w:space="0" w:color="E59EDC" w:themeColor="accent5" w:themeTint="66"/>
             </w:tcBorders>
+            <w:vAlign w:val="center"/>
           </w:tcPr>
           <w:p>
             <w:pPr>
@@ -2521,6 +2767,7 @@
             <w:tcBorders>
               <w:left w:val="single" w:sz="4" w:space="0" w:color="E59EDC" w:themeColor="accent5" w:themeTint="66"/>
             </w:tcBorders>
+            <w:vAlign w:val="center"/>
           </w:tcPr>
           <w:p>
             <w:pPr>
@@ -2548,6 +2795,7 @@
         <w:tc>
           <w:tcPr>
             <w:tcW w:w="2071" w:type="dxa"/>
+            <w:vAlign w:val="center"/>
           </w:tcPr>
           <w:p>
             <w:pPr>
@@ -2575,6 +2823,7 @@
         <w:tc>
           <w:tcPr>
             <w:tcW w:w="2048" w:type="dxa"/>
+            <w:vAlign w:val="center"/>
           </w:tcPr>
           <w:p>
             <w:pPr>
@@ -2596,6 +2845,7 @@
         <w:tc>
           <w:tcPr>
             <w:tcW w:w="2064" w:type="dxa"/>
+            <w:vAlign w:val="center"/>
           </w:tcPr>
           <w:p>
             <w:pPr>
@@ -2657,27 +2907,31 @@
           <w:bCs/>
           <w:u w:val="single"/>
         </w:rPr>
-        <w:t xml:space="preserve"> </w:t>
+        <w:t xml:space="preserve"> 2 week increment</w:t>
       </w:r>
-      <w:proofErr w:type="gramStart"/>
+    </w:p>
+    <w:p>
+      <w:pPr>
+        <w:pStyle w:val="ListParagraph"/>
+        <w:numPr>
+          <w:ilvl w:val="0"/>
+          <w:numId w:val="1"/>
+        </w:numPr>
+        <w:rPr>
+          <w:rFonts w:ascii="Helvetica" w:hAnsi="Helvetica" w:cs="Helvetica"/>
+        </w:rPr>
+      </w:pPr>
       <w:r>
         <w:rPr>
           <w:rFonts w:ascii="Helvetica" w:hAnsi="Helvetica" w:cs="Helvetica"/>
-          <w:b/>
-          <w:bCs/>
-          <w:u w:val="single"/>
         </w:rPr>
-        <w:t>2 week</w:t>
+        <w:t>Design System Architecture</w:t>
       </w:r>
-      <w:proofErr w:type="gramEnd"/>
       <w:r>
         <w:rPr>
           <w:rFonts w:ascii="Helvetica" w:hAnsi="Helvetica" w:cs="Helvetica"/>
-          <w:b/>
-          <w:bCs/>
-          <w:u w:val="single"/>
         </w:rPr>
-        <w:t xml:space="preserve"> increment</w:t>
+        <w:t xml:space="preserve"> -</w:t>
       </w:r>
     </w:p>
     <w:p>
@@ -4328,16 +4582,43 @@
           <c:spPr>
             <a:noFill/>
             <a:ln>
-              <a:noFill/>
+              <a:solidFill>
+                <a:schemeClr val="bg1">
+                  <a:lumMod val="85000"/>
+                  <a:alpha val="90000"/>
+                </a:schemeClr>
+              </a:solidFill>
             </a:ln>
             <a:effectLst/>
           </c:spPr>
           <c:invertIfNegative val="0"/>
+          <c:dPt>
+            <c:idx val="10"/>
+            <c:invertIfNegative val="0"/>
+            <c:bubble3D val="0"/>
+            <c:spPr>
+              <a:noFill/>
+              <a:ln>
+                <a:solidFill>
+                  <a:schemeClr val="bg1">
+                    <a:lumMod val="85000"/>
+                    <a:alpha val="75000"/>
+                  </a:schemeClr>
+                </a:solidFill>
+              </a:ln>
+              <a:effectLst/>
+            </c:spPr>
+            <c:extLst>
+              <c:ext xmlns:c16="http://schemas.microsoft.com/office/drawing/2014/chart" uri="{C3380CC4-5D6E-409C-BE32-E72D297353CC}">
+                <c16:uniqueId val="{00000000-3A17-4B1B-A494-4435C5E207BC}"/>
+              </c:ext>
+            </c:extLst>
+          </c:dPt>
           <c:cat>
             <c:strRef>
-              <c:f>Sheet1!$A$2:$A$12</c:f>
+              <c:f>Sheet1!$A$2:$A$13</c:f>
               <c:strCache>
-                <c:ptCount val="11"/>
+                <c:ptCount val="12"/>
                 <c:pt idx="0">
                   <c:v>T1</c:v>
                 </c:pt>
@@ -4371,15 +4652,18 @@
                 <c:pt idx="10">
                   <c:v>T11</c:v>
                 </c:pt>
+                <c:pt idx="11">
+                  <c:v>T12</c:v>
+                </c:pt>
               </c:strCache>
             </c:strRef>
           </c:cat>
           <c:val>
             <c:numRef>
-              <c:f>Sheet1!$B$2:$B$12</c:f>
+              <c:f>Sheet1!$B$2:$B$13</c:f>
               <c:numCache>
                 <c:formatCode>General</c:formatCode>
-                <c:ptCount val="11"/>
+                <c:ptCount val="12"/>
                 <c:pt idx="0">
                   <c:v>0</c:v>
                 </c:pt>
@@ -4387,31 +4671,34 @@
                   <c:v>0</c:v>
                 </c:pt>
                 <c:pt idx="2">
+                  <c:v>1</c:v>
+                </c:pt>
+                <c:pt idx="3">
+                  <c:v>2</c:v>
+                </c:pt>
+                <c:pt idx="4">
+                  <c:v>3</c:v>
+                </c:pt>
+                <c:pt idx="5">
+                  <c:v>4</c:v>
+                </c:pt>
+                <c:pt idx="6">
+                  <c:v>5</c:v>
+                </c:pt>
+                <c:pt idx="7">
+                  <c:v>6</c:v>
+                </c:pt>
+                <c:pt idx="8">
                   <c:v>0</c:v>
                 </c:pt>
-                <c:pt idx="3">
-                  <c:v>0</c:v>
-                </c:pt>
-                <c:pt idx="4">
-                  <c:v>0</c:v>
-                </c:pt>
-                <c:pt idx="5">
-                  <c:v>0</c:v>
-                </c:pt>
-                <c:pt idx="6">
-                  <c:v>0</c:v>
-                </c:pt>
-                <c:pt idx="7">
-                  <c:v>0</c:v>
-                </c:pt>
-                <c:pt idx="8">
-                  <c:v>2</c:v>
-                </c:pt>
                 <c:pt idx="9">
-                  <c:v>5</c:v>
+                  <c:v>1</c:v>
                 </c:pt>
                 <c:pt idx="10">
                   <c:v>5</c:v>
+                </c:pt>
+                <c:pt idx="11">
+                  <c:v>0</c:v>
                 </c:pt>
               </c:numCache>
             </c:numRef>
@@ -4456,9 +4743,9 @@
           <c:invertIfNegative val="0"/>
           <c:cat>
             <c:strRef>
-              <c:f>Sheet1!$A$2:$A$12</c:f>
+              <c:f>Sheet1!$A$2:$A$13</c:f>
               <c:strCache>
-                <c:ptCount val="11"/>
+                <c:ptCount val="12"/>
                 <c:pt idx="0">
                   <c:v>T1</c:v>
                 </c:pt>
@@ -4492,15 +4779,18 @@
                 <c:pt idx="10">
                   <c:v>T11</c:v>
                 </c:pt>
+                <c:pt idx="11">
+                  <c:v>T12</c:v>
+                </c:pt>
               </c:strCache>
             </c:strRef>
           </c:cat>
           <c:val>
             <c:numRef>
-              <c:f>Sheet1!$C$2:$C$12</c:f>
+              <c:f>Sheet1!$C$2:$C$13</c:f>
               <c:numCache>
                 <c:formatCode>General</c:formatCode>
-                <c:ptCount val="11"/>
+                <c:ptCount val="12"/>
                 <c:pt idx="0">
                   <c:v>1</c:v>
                 </c:pt>
@@ -4508,31 +4798,34 @@
                   <c:v>2</c:v>
                 </c:pt>
                 <c:pt idx="2">
-                  <c:v>0</c:v>
+                  <c:v>1</c:v>
                 </c:pt>
                 <c:pt idx="3">
-                  <c:v>0</c:v>
+                  <c:v>1</c:v>
                 </c:pt>
                 <c:pt idx="4">
-                  <c:v>0</c:v>
+                  <c:v>1</c:v>
                 </c:pt>
                 <c:pt idx="5">
-                  <c:v>0</c:v>
+                  <c:v>1</c:v>
                 </c:pt>
                 <c:pt idx="6">
-                  <c:v>0</c:v>
+                  <c:v>1</c:v>
                 </c:pt>
                 <c:pt idx="7">
-                  <c:v>0</c:v>
+                  <c:v>1</c:v>
                 </c:pt>
                 <c:pt idx="8">
-                  <c:v>2</c:v>
+                  <c:v>1</c:v>
                 </c:pt>
                 <c:pt idx="9">
                   <c:v>7</c:v>
                 </c:pt>
                 <c:pt idx="10">
-                  <c:v>8</c:v>
+                  <c:v>3</c:v>
+                </c:pt>
+                <c:pt idx="11">
+                  <c:v>1</c:v>
                 </c:pt>
               </c:numCache>
             </c:numRef>

</xml_diff>

<commit_message>
Project architecture work & small document changes
Small correction in UserStories
Small updates to ProjectPlan
Added 8 empty classes of entities to the java project
Removed empty test class
Implemented architecture for Customer class
</commit_message>
<xml_diff>
--- a/Project Plan.docx
+++ b/Project Plan.docx
@@ -36,78 +36,6 @@
           <w:u w:val="single"/>
         </w:rPr>
       </w:pPr>
-    </w:p>
-    <w:p>
-      <w:pPr>
-        <w:rPr>
-          <w:rFonts w:ascii="Helvetica" w:hAnsi="Helvetica" w:cs="Helvetica"/>
-          <w:b/>
-          <w:bCs/>
-          <w:sz w:val="40"/>
-          <w:szCs w:val="40"/>
-          <w:u w:val="single"/>
-        </w:rPr>
-      </w:pPr>
-      <w:r>
-        <w:rPr>
-          <w:rFonts w:ascii="Helvetica" w:hAnsi="Helvetica" w:cs="Helvetica"/>
-          <w:b/>
-          <w:bCs/>
-          <w:noProof/>
-          <w:sz w:val="40"/>
-          <w:szCs w:val="40"/>
-          <w:u w:val="single"/>
-        </w:rPr>
-        <w:drawing>
-          <wp:inline distT="0" distB="0" distL="0" distR="0" wp14:anchorId="2C4AA4A2" wp14:editId="469A9FC9">
-            <wp:extent cx="6505575" cy="2960370"/>
-            <wp:effectExtent l="0" t="0" r="0" b="0"/>
-            <wp:docPr id="2066554090" name="Picture 1"/>
-            <wp:cNvGraphicFramePr>
-              <a:graphicFrameLocks xmlns:a="http://schemas.openxmlformats.org/drawingml/2006/main" noChangeAspect="1"/>
-            </wp:cNvGraphicFramePr>
-            <a:graphic xmlns:a="http://schemas.openxmlformats.org/drawingml/2006/main">
-              <a:graphicData uri="http://schemas.openxmlformats.org/drawingml/2006/picture">
-                <pic:pic xmlns:pic="http://schemas.openxmlformats.org/drawingml/2006/picture">
-                  <pic:nvPicPr>
-                    <pic:cNvPr id="2066554090" name="Picture 1"/>
-                    <pic:cNvPicPr>
-                      <a:picLocks noChangeAspect="1"/>
-                    </pic:cNvPicPr>
-                  </pic:nvPicPr>
-                  <pic:blipFill>
-                    <a:blip r:embed="rId7"/>
-                    <a:stretch>
-                      <a:fillRect/>
-                    </a:stretch>
-                  </pic:blipFill>
-                  <pic:spPr>
-                    <a:xfrm>
-                      <a:off x="0" y="0"/>
-                      <a:ext cx="6516460" cy="2965834"/>
-                    </a:xfrm>
-                    <a:prstGeom prst="rect">
-                      <a:avLst/>
-                    </a:prstGeom>
-                  </pic:spPr>
-                </pic:pic>
-              </a:graphicData>
-            </a:graphic>
-          </wp:inline>
-        </w:drawing>
-      </w:r>
-    </w:p>
-    <w:p>
-      <w:pPr>
-        <w:rPr>
-          <w:rFonts w:ascii="Helvetica" w:hAnsi="Helvetica" w:cs="Helvetica"/>
-          <w:b/>
-          <w:bCs/>
-          <w:sz w:val="40"/>
-          <w:szCs w:val="40"/>
-          <w:u w:val="single"/>
-        </w:rPr>
-      </w:pPr>
       <w:r>
         <w:rPr>
           <w:rFonts w:ascii="Helvetica" w:hAnsi="Helvetica" w:cs="Helvetica"/>
@@ -388,7 +316,7 @@
               <w:rPr>
                 <w:rFonts w:ascii="Helvetica" w:hAnsi="Helvetica" w:cs="Helvetica"/>
               </w:rPr>
-              <w:t>3</w:t>
+              <w:t>4</w:t>
             </w:r>
           </w:p>
         </w:tc>
@@ -502,7 +430,7 @@
               <w:rPr>
                 <w:rFonts w:ascii="Helvetica" w:hAnsi="Helvetica" w:cs="Helvetica"/>
               </w:rPr>
-              <w:t>3</w:t>
+              <w:t>4</w:t>
             </w:r>
           </w:p>
         </w:tc>
@@ -612,7 +540,7 @@
               <w:rPr>
                 <w:rFonts w:ascii="Helvetica" w:hAnsi="Helvetica" w:cs="Helvetica"/>
               </w:rPr>
-              <w:t>3</w:t>
+              <w:t>4</w:t>
             </w:r>
           </w:p>
         </w:tc>
@@ -723,7 +651,7 @@
               <w:rPr>
                 <w:rFonts w:ascii="Helvetica" w:hAnsi="Helvetica" w:cs="Helvetica"/>
               </w:rPr>
-              <w:t>3</w:t>
+              <w:t>4</w:t>
             </w:r>
           </w:p>
         </w:tc>
@@ -833,7 +761,7 @@
               <w:rPr>
                 <w:rFonts w:ascii="Helvetica" w:hAnsi="Helvetica" w:cs="Helvetica"/>
               </w:rPr>
-              <w:t>3</w:t>
+              <w:t>4</w:t>
             </w:r>
           </w:p>
         </w:tc>
@@ -944,7 +872,7 @@
               <w:rPr>
                 <w:rFonts w:ascii="Helvetica" w:hAnsi="Helvetica" w:cs="Helvetica"/>
               </w:rPr>
-              <w:t>3</w:t>
+              <w:t>4</w:t>
             </w:r>
           </w:p>
         </w:tc>
@@ -1054,7 +982,7 @@
               <w:rPr>
                 <w:rFonts w:ascii="Helvetica" w:hAnsi="Helvetica" w:cs="Helvetica"/>
               </w:rPr>
-              <w:t>3</w:t>
+              <w:t>4</w:t>
             </w:r>
           </w:p>
         </w:tc>
@@ -1165,7 +1093,7 @@
               <w:rPr>
                 <w:rFonts w:ascii="Helvetica" w:hAnsi="Helvetica" w:cs="Helvetica"/>
               </w:rPr>
-              <w:t>3</w:t>
+              <w:t>4</w:t>
             </w:r>
           </w:p>
         </w:tc>
@@ -1386,7 +1314,7 @@
               <w:rPr>
                 <w:rFonts w:ascii="Helvetica" w:hAnsi="Helvetica" w:cs="Helvetica"/>
               </w:rPr>
-              <w:t>6</w:t>
+              <w:t>8</w:t>
             </w:r>
           </w:p>
         </w:tc>
@@ -1497,7 +1425,7 @@
               <w:rPr>
                 <w:rFonts w:ascii="Helvetica" w:hAnsi="Helvetica" w:cs="Helvetica"/>
               </w:rPr>
-              <w:t>6</w:t>
+              <w:t>8</w:t>
             </w:r>
           </w:p>
         </w:tc>
@@ -1634,6 +1562,13 @@
         </w:tc>
       </w:tr>
     </w:tbl>
+    <w:p>
+      <w:pPr>
+        <w:rPr>
+          <w:rFonts w:ascii="Helvetica" w:hAnsi="Helvetica" w:cs="Helvetica"/>
+        </w:rPr>
+      </w:pPr>
+    </w:p>
     <w:p>
       <w:pPr>
         <w:rPr>
@@ -1652,7 +1587,6 @@
           <w:rFonts w:ascii="Helvetica" w:hAnsi="Helvetica" w:cs="Helvetica"/>
           <w:noProof/>
         </w:rPr>
-        <w:lastRenderedPageBreak/>
         <w:drawing>
           <wp:inline distT="0" distB="0" distL="0" distR="0" wp14:anchorId="34F0C00E" wp14:editId="4D23D45B">
             <wp:extent cx="5486400" cy="3200400"/>
@@ -1661,12 +1595,34 @@
             <wp:cNvGraphicFramePr/>
             <a:graphic xmlns:a="http://schemas.openxmlformats.org/drawingml/2006/main">
               <a:graphicData uri="http://schemas.openxmlformats.org/drawingml/2006/chart">
-                <c:chart xmlns:c="http://schemas.openxmlformats.org/drawingml/2006/chart" xmlns:r="http://schemas.openxmlformats.org/officeDocument/2006/relationships" r:id="rId8"/>
+                <c:chart xmlns:c="http://schemas.openxmlformats.org/drawingml/2006/chart" xmlns:r="http://schemas.openxmlformats.org/officeDocument/2006/relationships" r:id="rId7"/>
               </a:graphicData>
             </a:graphic>
           </wp:inline>
         </w:drawing>
       </w:r>
+    </w:p>
+    <w:p>
+      <w:pPr>
+        <w:spacing w:after="0" w:line="240" w:lineRule="auto"/>
+        <w:rPr>
+          <w:rFonts w:ascii="Helvetica" w:hAnsi="Helvetica" w:cs="Helvetica"/>
+        </w:rPr>
+      </w:pPr>
+      <w:r>
+        <w:rPr>
+          <w:rFonts w:ascii="Helvetica" w:hAnsi="Helvetica" w:cs="Helvetica"/>
+        </w:rPr>
+        <w:br w:type="page"/>
+      </w:r>
+    </w:p>
+    <w:p>
+      <w:pPr>
+        <w:spacing w:after="0" w:line="240" w:lineRule="auto"/>
+        <w:rPr>
+          <w:rFonts w:ascii="Helvetica" w:hAnsi="Helvetica" w:cs="Helvetica"/>
+        </w:rPr>
+      </w:pPr>
     </w:p>
     <w:tbl>
       <w:tblPr>
@@ -3053,6 +3009,74 @@
           <w:rFonts w:ascii="Helvetica" w:hAnsi="Helvetica" w:cs="Helvetica"/>
         </w:rPr>
       </w:pPr>
+      <w:r>
+        <w:rPr>
+          <w:rFonts w:ascii="Helvetica" w:hAnsi="Helvetica" w:cs="Helvetica"/>
+          <w:b/>
+          <w:bCs/>
+          <w:noProof/>
+          <w:sz w:val="40"/>
+          <w:szCs w:val="40"/>
+          <w:u w:val="single"/>
+        </w:rPr>
+        <w:drawing>
+          <wp:anchor distT="0" distB="0" distL="114300" distR="114300" simplePos="0" relativeHeight="251658240" behindDoc="1" locked="0" layoutInCell="1" allowOverlap="1" wp14:anchorId="2C4AA4A2" wp14:editId="78B4C0B6">
+            <wp:simplePos x="0" y="0"/>
+            <wp:positionH relativeFrom="column">
+              <wp:posOffset>-405765</wp:posOffset>
+            </wp:positionH>
+            <wp:positionV relativeFrom="paragraph">
+              <wp:posOffset>1698625</wp:posOffset>
+            </wp:positionV>
+            <wp:extent cx="6683041" cy="3041650"/>
+            <wp:effectExtent l="0" t="0" r="3810" b="6350"/>
+            <wp:wrapNone/>
+            <wp:docPr id="2066554090" name="Picture 1"/>
+            <wp:cNvGraphicFramePr>
+              <a:graphicFrameLocks xmlns:a="http://schemas.openxmlformats.org/drawingml/2006/main" noChangeAspect="1"/>
+            </wp:cNvGraphicFramePr>
+            <a:graphic xmlns:a="http://schemas.openxmlformats.org/drawingml/2006/main">
+              <a:graphicData uri="http://schemas.openxmlformats.org/drawingml/2006/picture">
+                <pic:pic xmlns:pic="http://schemas.openxmlformats.org/drawingml/2006/picture">
+                  <pic:nvPicPr>
+                    <pic:cNvPr id="2066554090" name="Picture 1"/>
+                    <pic:cNvPicPr>
+                      <a:picLocks noChangeAspect="1"/>
+                    </pic:cNvPicPr>
+                  </pic:nvPicPr>
+                  <pic:blipFill>
+                    <a:blip r:embed="rId8">
+                      <a:extLst>
+                        <a:ext uri="{28A0092B-C50C-407E-A947-70E740481C1C}">
+                          <a14:useLocalDpi xmlns:a14="http://schemas.microsoft.com/office/drawing/2010/main" val="0"/>
+                        </a:ext>
+                      </a:extLst>
+                    </a:blip>
+                    <a:stretch>
+                      <a:fillRect/>
+                    </a:stretch>
+                  </pic:blipFill>
+                  <pic:spPr>
+                    <a:xfrm>
+                      <a:off x="0" y="0"/>
+                      <a:ext cx="6683041" cy="3041650"/>
+                    </a:xfrm>
+                    <a:prstGeom prst="rect">
+                      <a:avLst/>
+                    </a:prstGeom>
+                  </pic:spPr>
+                </pic:pic>
+              </a:graphicData>
+            </a:graphic>
+            <wp14:sizeRelH relativeFrom="margin">
+              <wp14:pctWidth>0</wp14:pctWidth>
+            </wp14:sizeRelH>
+            <wp14:sizeRelV relativeFrom="margin">
+              <wp14:pctHeight>0</wp14:pctHeight>
+            </wp14:sizeRelV>
+          </wp:anchor>
+        </w:drawing>
+      </w:r>
       <w:r>
         <w:rPr>
           <w:rFonts w:ascii="Helvetica" w:hAnsi="Helvetica" w:cs="Helvetica"/>

</xml_diff>

<commit_message>
Project plan & Customer skeleton class changes
Filled in allocation table based on activity bar chart
Changed customer skeleton to fit what was shown in the lecture
</commit_message>
<xml_diff>
--- a/Project Plan.docx
+++ b/Project Plan.docx
@@ -51,7 +51,7 @@
       </w:tblPr>
       <w:tblGrid>
         <w:gridCol w:w="1052"/>
-        <w:gridCol w:w="3164"/>
+        <w:gridCol w:w="2711"/>
         <w:gridCol w:w="1870"/>
         <w:gridCol w:w="1844"/>
       </w:tblGrid>
@@ -106,6 +106,7 @@
               <w:left w:val="single" w:sz="4" w:space="0" w:color="E59EDC" w:themeColor="accent5" w:themeTint="66"/>
               <w:right w:val="single" w:sz="4" w:space="0" w:color="E59EDC" w:themeColor="accent5" w:themeTint="66"/>
             </w:tcBorders>
+            <w:shd w:val="clear" w:color="auto" w:fill="E59EDC" w:themeFill="accent5" w:themeFillTint="66"/>
             <w:vAlign w:val="center"/>
           </w:tcPr>
           <w:p>
@@ -141,7 +142,7 @@
               <w:bottom w:val="single" w:sz="4" w:space="0" w:color="E59EDC" w:themeColor="accent5" w:themeTint="66"/>
               <w:right w:val="single" w:sz="4" w:space="0" w:color="E59EDC" w:themeColor="accent5" w:themeTint="66"/>
             </w:tcBorders>
-            <w:shd w:val="clear" w:color="auto" w:fill="F2CEED" w:themeFill="accent5" w:themeFillTint="33"/>
+            <w:shd w:val="clear" w:color="auto" w:fill="E59EDC" w:themeFill="accent5" w:themeFillTint="66"/>
             <w:vAlign w:val="center"/>
           </w:tcPr>
           <w:p>
@@ -174,7 +175,7 @@
               <w:bottom w:val="single" w:sz="4" w:space="0" w:color="E59EDC" w:themeColor="accent5" w:themeTint="66"/>
               <w:right w:val="single" w:sz="4" w:space="0" w:color="E59EDC" w:themeColor="accent5" w:themeTint="66"/>
             </w:tcBorders>
-            <w:shd w:val="clear" w:color="auto" w:fill="F2CEED" w:themeFill="accent5" w:themeFillTint="33"/>
+            <w:shd w:val="clear" w:color="auto" w:fill="E59EDC" w:themeFill="accent5" w:themeFillTint="66"/>
             <w:vAlign w:val="center"/>
           </w:tcPr>
           <w:p>
@@ -207,7 +208,7 @@
               <w:bottom w:val="single" w:sz="4" w:space="0" w:color="E59EDC" w:themeColor="accent5" w:themeTint="66"/>
               <w:right w:val="single" w:sz="4" w:space="0" w:color="E59EDC" w:themeColor="accent5" w:themeTint="66"/>
             </w:tcBorders>
-            <w:shd w:val="clear" w:color="auto" w:fill="F2CEED" w:themeFill="accent5" w:themeFillTint="33"/>
+            <w:shd w:val="clear" w:color="auto" w:fill="E59EDC" w:themeFill="accent5" w:themeFillTint="66"/>
             <w:vAlign w:val="center"/>
           </w:tcPr>
           <w:p>
@@ -1449,115 +1450,6 @@
               </w:rPr>
               <w:t>T1-T8</w:t>
             </w:r>
-          </w:p>
-        </w:tc>
-      </w:tr>
-      <w:tr>
-        <w:trPr>
-          <w:trHeight w:val="346"/>
-        </w:trPr>
-        <w:tc>
-          <w:tcPr>
-            <w:cnfStyle w:val="001000000000" w:firstRow="0" w:lastRow="0" w:firstColumn="1" w:lastColumn="0" w:oddVBand="0" w:evenVBand="0" w:oddHBand="0" w:evenHBand="0" w:firstRowFirstColumn="0" w:firstRowLastColumn="0" w:lastRowFirstColumn="0" w:lastRowLastColumn="0"/>
-            <w:tcW w:w="0" w:type="auto"/>
-            <w:tcBorders>
-              <w:top w:val="single" w:sz="4" w:space="0" w:color="E59EDC" w:themeColor="accent5" w:themeTint="66"/>
-              <w:left w:val="single" w:sz="4" w:space="0" w:color="E59EDC" w:themeColor="accent5" w:themeTint="66"/>
-              <w:bottom w:val="single" w:sz="4" w:space="0" w:color="E59EDC" w:themeColor="accent5" w:themeTint="66"/>
-              <w:right w:val="single" w:sz="4" w:space="0" w:color="E59EDC" w:themeColor="accent5" w:themeTint="66"/>
-            </w:tcBorders>
-            <w:vAlign w:val="center"/>
-          </w:tcPr>
-          <w:p>
-            <w:pPr>
-              <w:spacing w:after="0" w:line="240" w:lineRule="auto"/>
-              <w:jc w:val="center"/>
-              <w:rPr>
-                <w:rFonts w:ascii="Helvetica" w:hAnsi="Helvetica" w:cs="Helvetica"/>
-                <w:i w:val="0"/>
-                <w:iCs w:val="0"/>
-              </w:rPr>
-            </w:pPr>
-            <w:r>
-              <w:rPr>
-                <w:rFonts w:ascii="Helvetica" w:hAnsi="Helvetica" w:cs="Helvetica"/>
-                <w:i w:val="0"/>
-                <w:iCs w:val="0"/>
-              </w:rPr>
-              <w:t>T12</w:t>
-            </w:r>
-          </w:p>
-        </w:tc>
-        <w:tc>
-          <w:tcPr>
-            <w:tcW w:w="0" w:type="auto"/>
-            <w:tcBorders>
-              <w:left w:val="single" w:sz="4" w:space="0" w:color="E59EDC" w:themeColor="accent5" w:themeTint="66"/>
-              <w:right w:val="single" w:sz="4" w:space="0" w:color="E59EDC" w:themeColor="accent5" w:themeTint="66"/>
-            </w:tcBorders>
-            <w:shd w:val="clear" w:color="auto" w:fill="F2CEED" w:themeFill="accent5" w:themeFillTint="33"/>
-            <w:vAlign w:val="center"/>
-          </w:tcPr>
-          <w:p>
-            <w:pPr>
-              <w:spacing w:after="0" w:line="240" w:lineRule="auto"/>
-              <w:jc w:val="center"/>
-              <w:cnfStyle w:val="000000000000" w:firstRow="0" w:lastRow="0" w:firstColumn="0" w:lastColumn="0" w:oddVBand="0" w:evenVBand="0" w:oddHBand="0" w:evenHBand="0" w:firstRowFirstColumn="0" w:firstRowLastColumn="0" w:lastRowFirstColumn="0" w:lastRowLastColumn="0"/>
-              <w:rPr>
-                <w:rFonts w:ascii="Helvetica" w:hAnsi="Helvetica" w:cs="Helvetica"/>
-              </w:rPr>
-            </w:pPr>
-            <w:r>
-              <w:rPr>
-                <w:rFonts w:ascii="Helvetica" w:hAnsi="Helvetica" w:cs="Helvetica"/>
-              </w:rPr>
-              <w:t>Design System Architecture</w:t>
-            </w:r>
-          </w:p>
-        </w:tc>
-        <w:tc>
-          <w:tcPr>
-            <w:tcW w:w="0" w:type="auto"/>
-            <w:tcBorders>
-              <w:left w:val="single" w:sz="4" w:space="0" w:color="E59EDC" w:themeColor="accent5" w:themeTint="66"/>
-            </w:tcBorders>
-            <w:shd w:val="clear" w:color="auto" w:fill="F2CEED" w:themeFill="accent5" w:themeFillTint="33"/>
-            <w:vAlign w:val="center"/>
-          </w:tcPr>
-          <w:p>
-            <w:pPr>
-              <w:spacing w:after="0" w:line="240" w:lineRule="auto"/>
-              <w:jc w:val="center"/>
-              <w:cnfStyle w:val="000000000000" w:firstRow="0" w:lastRow="0" w:firstColumn="0" w:lastColumn="0" w:oddVBand="0" w:evenVBand="0" w:oddHBand="0" w:evenHBand="0" w:firstRowFirstColumn="0" w:firstRowLastColumn="0" w:lastRowFirstColumn="0" w:lastRowLastColumn="0"/>
-              <w:rPr>
-                <w:rFonts w:ascii="Helvetica" w:hAnsi="Helvetica" w:cs="Helvetica"/>
-              </w:rPr>
-            </w:pPr>
-            <w:r>
-              <w:rPr>
-                <w:rFonts w:ascii="Helvetica" w:hAnsi="Helvetica" w:cs="Helvetica"/>
-              </w:rPr>
-              <w:t>6</w:t>
-            </w:r>
-          </w:p>
-        </w:tc>
-        <w:tc>
-          <w:tcPr>
-            <w:tcW w:w="0" w:type="auto"/>
-            <w:shd w:val="clear" w:color="auto" w:fill="F2CEED" w:themeFill="accent5" w:themeFillTint="33"/>
-            <w:vAlign w:val="center"/>
-          </w:tcPr>
-          <w:p>
-            <w:pPr>
-              <w:spacing w:after="0" w:line="240" w:lineRule="auto"/>
-              <w:jc w:val="center"/>
-              <w:cnfStyle w:val="000000000000" w:firstRow="0" w:lastRow="0" w:firstColumn="0" w:lastColumn="0" w:oddVBand="0" w:evenVBand="0" w:oddHBand="0" w:evenHBand="0" w:firstRowFirstColumn="0" w:firstRowLastColumn="0" w:lastRowFirstColumn="0" w:lastRowLastColumn="0"/>
-              <w:rPr>
-                <w:rFonts w:ascii="Helvetica" w:hAnsi="Helvetica" w:cs="Helvetica"/>
-                <w:b/>
-                <w:bCs/>
-              </w:rPr>
-            </w:pPr>
           </w:p>
         </w:tc>
       </w:tr>
@@ -1588,7 +1480,7 @@
           <w:noProof/>
         </w:rPr>
         <w:drawing>
-          <wp:inline distT="0" distB="0" distL="0" distR="0" wp14:anchorId="34F0C00E" wp14:editId="4D23D45B">
+          <wp:inline distT="0" distB="0" distL="0" distR="0" wp14:anchorId="34F0C00E" wp14:editId="6B590793">
             <wp:extent cx="5486400" cy="3200400"/>
             <wp:effectExtent l="0" t="0" r="0" b="0"/>
             <wp:docPr id="1770840092" name="Chart 2"/>
@@ -1689,6 +1581,7 @@
               <w:left w:val="single" w:sz="4" w:space="0" w:color="E59EDC" w:themeColor="accent5" w:themeTint="66"/>
               <w:right w:val="single" w:sz="4" w:space="0" w:color="E59EDC" w:themeColor="accent5" w:themeTint="66"/>
             </w:tcBorders>
+            <w:shd w:val="clear" w:color="auto" w:fill="E59EDC" w:themeFill="accent5" w:themeFillTint="66"/>
             <w:vAlign w:val="center"/>
           </w:tcPr>
           <w:p>
@@ -1718,7 +1611,7 @@
               <w:bottom w:val="single" w:sz="4" w:space="0" w:color="E59EDC" w:themeColor="accent5" w:themeTint="66"/>
               <w:right w:val="single" w:sz="4" w:space="0" w:color="E59EDC" w:themeColor="accent5" w:themeTint="66"/>
             </w:tcBorders>
-            <w:shd w:val="clear" w:color="auto" w:fill="F2CEED" w:themeFill="accent5" w:themeFillTint="33"/>
+            <w:shd w:val="clear" w:color="auto" w:fill="E59EDC" w:themeFill="accent5" w:themeFillTint="66"/>
             <w:vAlign w:val="center"/>
           </w:tcPr>
           <w:p>
@@ -1747,7 +1640,7 @@
               <w:bottom w:val="single" w:sz="4" w:space="0" w:color="E59EDC" w:themeColor="accent5" w:themeTint="66"/>
               <w:right w:val="single" w:sz="4" w:space="0" w:color="E59EDC" w:themeColor="accent5" w:themeTint="66"/>
             </w:tcBorders>
-            <w:shd w:val="clear" w:color="auto" w:fill="F2CEED" w:themeFill="accent5" w:themeFillTint="33"/>
+            <w:shd w:val="clear" w:color="auto" w:fill="E59EDC" w:themeFill="accent5" w:themeFillTint="66"/>
             <w:vAlign w:val="center"/>
           </w:tcPr>
           <w:p>
@@ -1776,7 +1669,7 @@
               <w:bottom w:val="single" w:sz="4" w:space="0" w:color="E59EDC" w:themeColor="accent5" w:themeTint="66"/>
               <w:right w:val="single" w:sz="4" w:space="0" w:color="E59EDC" w:themeColor="accent5" w:themeTint="66"/>
             </w:tcBorders>
-            <w:shd w:val="clear" w:color="auto" w:fill="F2CEED" w:themeFill="accent5" w:themeFillTint="33"/>
+            <w:shd w:val="clear" w:color="auto" w:fill="E59EDC" w:themeFill="accent5" w:themeFillTint="66"/>
             <w:vAlign w:val="center"/>
           </w:tcPr>
           <w:p>
@@ -1805,7 +1698,7 @@
               <w:bottom w:val="single" w:sz="4" w:space="0" w:color="E59EDC" w:themeColor="accent5" w:themeTint="66"/>
               <w:right w:val="single" w:sz="4" w:space="0" w:color="E59EDC" w:themeColor="accent5" w:themeTint="66"/>
             </w:tcBorders>
-            <w:shd w:val="clear" w:color="auto" w:fill="F2CEED" w:themeFill="accent5" w:themeFillTint="33"/>
+            <w:shd w:val="clear" w:color="auto" w:fill="E59EDC" w:themeFill="accent5" w:themeFillTint="66"/>
             <w:vAlign w:val="center"/>
           </w:tcPr>
           <w:p>
@@ -1913,19 +1806,44 @@
               <w:rPr>
                 <w:rFonts w:ascii="Helvetica" w:hAnsi="Helvetica" w:cs="Helvetica"/>
               </w:rPr>
+              <w:t>T1</w:t>
+            </w:r>
+          </w:p>
+        </w:tc>
+        <w:tc>
+          <w:tcPr>
+            <w:tcW w:w="2048" w:type="dxa"/>
+            <w:tcBorders>
+              <w:top w:val="single" w:sz="4" w:space="0" w:color="E59EDC" w:themeColor="accent5" w:themeTint="66"/>
+            </w:tcBorders>
+            <w:vAlign w:val="center"/>
+          </w:tcPr>
+          <w:p>
+            <w:pPr>
+              <w:spacing w:after="0" w:line="240" w:lineRule="auto"/>
+              <w:jc w:val="center"/>
+              <w:cnfStyle w:val="000000000000" w:firstRow="0" w:lastRow="0" w:firstColumn="0" w:lastColumn="0" w:oddVBand="0" w:evenVBand="0" w:oddHBand="0" w:evenHBand="0" w:firstRowFirstColumn="0" w:firstRowLastColumn="0" w:lastRowFirstColumn="0" w:lastRowLastColumn="0"/>
+              <w:rPr>
+                <w:rFonts w:ascii="Helvetica" w:hAnsi="Helvetica" w:cs="Helvetica"/>
+              </w:rPr>
+            </w:pPr>
+            <w:r>
+              <w:rPr>
+                <w:rFonts w:ascii="Helvetica" w:hAnsi="Helvetica" w:cs="Helvetica"/>
+              </w:rPr>
               <w:t>T</w:t>
             </w:r>
             <w:r>
               <w:rPr>
                 <w:rFonts w:ascii="Helvetica" w:hAnsi="Helvetica" w:cs="Helvetica"/>
               </w:rPr>
-              <w:t>12, T1</w:t>
-            </w:r>
-          </w:p>
-        </w:tc>
-        <w:tc>
-          <w:tcPr>
-            <w:tcW w:w="2048" w:type="dxa"/>
+              <w:t>2</w:t>
+            </w:r>
+          </w:p>
+        </w:tc>
+        <w:tc>
+          <w:tcPr>
+            <w:tcW w:w="2064" w:type="dxa"/>
             <w:tcBorders>
               <w:top w:val="single" w:sz="4" w:space="0" w:color="E59EDC" w:themeColor="accent5" w:themeTint="66"/>
             </w:tcBorders>
@@ -1944,44 +1862,7 @@
               <w:rPr>
                 <w:rFonts w:ascii="Helvetica" w:hAnsi="Helvetica" w:cs="Helvetica"/>
               </w:rPr>
-              <w:t>T</w:t>
-            </w:r>
-            <w:r>
-              <w:rPr>
-                <w:rFonts w:ascii="Helvetica" w:hAnsi="Helvetica" w:cs="Helvetica"/>
-              </w:rPr>
-              <w:t>2</w:t>
-            </w:r>
-          </w:p>
-        </w:tc>
-        <w:tc>
-          <w:tcPr>
-            <w:tcW w:w="2064" w:type="dxa"/>
-            <w:tcBorders>
-              <w:top w:val="single" w:sz="4" w:space="0" w:color="E59EDC" w:themeColor="accent5" w:themeTint="66"/>
-            </w:tcBorders>
-            <w:vAlign w:val="center"/>
-          </w:tcPr>
-          <w:p>
-            <w:pPr>
-              <w:spacing w:after="0" w:line="240" w:lineRule="auto"/>
-              <w:jc w:val="center"/>
-              <w:cnfStyle w:val="000000000000" w:firstRow="0" w:lastRow="0" w:firstColumn="0" w:lastColumn="0" w:oddVBand="0" w:evenVBand="0" w:oddHBand="0" w:evenHBand="0" w:firstRowFirstColumn="0" w:firstRowLastColumn="0" w:lastRowFirstColumn="0" w:lastRowLastColumn="0"/>
-              <w:rPr>
-                <w:rFonts w:ascii="Helvetica" w:hAnsi="Helvetica" w:cs="Helvetica"/>
-              </w:rPr>
-            </w:pPr>
-            <w:r>
-              <w:rPr>
-                <w:rFonts w:ascii="Helvetica" w:hAnsi="Helvetica" w:cs="Helvetica"/>
-              </w:rPr>
-              <w:t>T</w:t>
-            </w:r>
-            <w:r>
-              <w:rPr>
-                <w:rFonts w:ascii="Helvetica" w:hAnsi="Helvetica" w:cs="Helvetica"/>
-              </w:rPr>
-              <w:t>12, T2</w:t>
+              <w:t>T2</w:t>
             </w:r>
           </w:p>
         </w:tc>
@@ -2074,6 +1955,12 @@
               </w:rPr>
               <w:t>T</w:t>
             </w:r>
+            <w:r>
+              <w:rPr>
+                <w:rFonts w:ascii="Helvetica" w:hAnsi="Helvetica" w:cs="Helvetica"/>
+              </w:rPr>
+              <w:t>3</w:t>
+            </w:r>
           </w:p>
         </w:tc>
         <w:tc>
@@ -2223,6 +2110,12 @@
               </w:rPr>
               <w:t>T</w:t>
             </w:r>
+            <w:r>
+              <w:rPr>
+                <w:rFonts w:ascii="Helvetica" w:hAnsi="Helvetica" w:cs="Helvetica"/>
+              </w:rPr>
+              <w:t>3</w:t>
+            </w:r>
           </w:p>
         </w:tc>
         <w:tc>
@@ -2245,6 +2138,12 @@
               </w:rPr>
               <w:t>T</w:t>
             </w:r>
+            <w:r>
+              <w:rPr>
+                <w:rFonts w:ascii="Helvetica" w:hAnsi="Helvetica" w:cs="Helvetica"/>
+              </w:rPr>
+              <w:t>3</w:t>
+            </w:r>
           </w:p>
         </w:tc>
         <w:tc>
@@ -2266,6 +2165,12 @@
                 <w:rFonts w:ascii="Helvetica" w:hAnsi="Helvetica" w:cs="Helvetica"/>
               </w:rPr>
               <w:t>T</w:t>
+            </w:r>
+            <w:r>
+              <w:rPr>
+                <w:rFonts w:ascii="Helvetica" w:hAnsi="Helvetica" w:cs="Helvetica"/>
+              </w:rPr>
+              <w:t>3</w:t>
             </w:r>
           </w:p>
         </w:tc>
@@ -2291,15 +2196,17 @@
               <w:jc w:val="center"/>
               <w:rPr>
                 <w:rFonts w:ascii="Helvetica" w:hAnsi="Helvetica" w:cs="Helvetica"/>
-              </w:rPr>
-            </w:pPr>
-            <w:r>
-              <w:rPr>
-                <w:rFonts w:ascii="Helvetica" w:hAnsi="Helvetica" w:cs="Helvetica"/>
                 <w:i w:val="0"/>
                 <w:iCs w:val="0"/>
               </w:rPr>
-              <w:t>5</w:t>
+            </w:pPr>
+            <w:r>
+              <w:rPr>
+                <w:rFonts w:ascii="Helvetica" w:hAnsi="Helvetica" w:cs="Helvetica"/>
+                <w:i w:val="0"/>
+                <w:iCs w:val="0"/>
+              </w:rPr>
+              <w:t>4</w:t>
             </w:r>
           </w:p>
         </w:tc>
@@ -2325,13 +2232,7 @@
               <w:rPr>
                 <w:rFonts w:ascii="Helvetica" w:hAnsi="Helvetica" w:cs="Helvetica"/>
               </w:rPr>
-              <w:t>T</w:t>
-            </w:r>
-            <w:r>
-              <w:rPr>
-                <w:rFonts w:ascii="Helvetica" w:hAnsi="Helvetica" w:cs="Helvetica"/>
-              </w:rPr>
-              <w:t>10</w:t>
+              <w:t>T10</w:t>
             </w:r>
           </w:p>
         </w:tc>
@@ -2354,7 +2255,7 @@
               <w:rPr>
                 <w:rFonts w:ascii="Helvetica" w:hAnsi="Helvetica" w:cs="Helvetica"/>
               </w:rPr>
-              <w:t>T</w:t>
+              <w:t>T4</w:t>
             </w:r>
           </w:p>
         </w:tc>
@@ -2377,7 +2278,7 @@
               <w:rPr>
                 <w:rFonts w:ascii="Helvetica" w:hAnsi="Helvetica" w:cs="Helvetica"/>
               </w:rPr>
-              <w:t>T</w:t>
+              <w:t>T4</w:t>
             </w:r>
           </w:p>
         </w:tc>
@@ -2400,7 +2301,7 @@
               <w:rPr>
                 <w:rFonts w:ascii="Helvetica" w:hAnsi="Helvetica" w:cs="Helvetica"/>
               </w:rPr>
-              <w:t>T</w:t>
+              <w:t>T4</w:t>
             </w:r>
           </w:p>
         </w:tc>
@@ -2434,7 +2335,7 @@
                 <w:i w:val="0"/>
                 <w:iCs w:val="0"/>
               </w:rPr>
-              <w:t>6</w:t>
+              <w:t>5</w:t>
             </w:r>
           </w:p>
         </w:tc>
@@ -2444,6 +2345,7 @@
             <w:tcBorders>
               <w:left w:val="single" w:sz="4" w:space="0" w:color="E59EDC" w:themeColor="accent5" w:themeTint="66"/>
             </w:tcBorders>
+            <w:shd w:val="clear" w:color="auto" w:fill="FFFFFF" w:themeFill="background1"/>
             <w:vAlign w:val="center"/>
           </w:tcPr>
           <w:p>
@@ -2472,6 +2374,7 @@
         <w:tc>
           <w:tcPr>
             <w:tcW w:w="2071" w:type="dxa"/>
+            <w:shd w:val="clear" w:color="auto" w:fill="FFFFFF" w:themeFill="background1"/>
             <w:vAlign w:val="center"/>
           </w:tcPr>
           <w:p>
@@ -2500,6 +2403,7 @@
         <w:tc>
           <w:tcPr>
             <w:tcW w:w="2048" w:type="dxa"/>
+            <w:shd w:val="clear" w:color="auto" w:fill="FFFFFF" w:themeFill="background1"/>
             <w:vAlign w:val="center"/>
           </w:tcPr>
           <w:p>
@@ -2517,11 +2421,18 @@
               </w:rPr>
               <w:t>T</w:t>
             </w:r>
+            <w:r>
+              <w:rPr>
+                <w:rFonts w:ascii="Helvetica" w:hAnsi="Helvetica" w:cs="Helvetica"/>
+              </w:rPr>
+              <w:t>5</w:t>
+            </w:r>
           </w:p>
         </w:tc>
         <w:tc>
           <w:tcPr>
             <w:tcW w:w="2064" w:type="dxa"/>
+            <w:shd w:val="clear" w:color="auto" w:fill="FFFFFF" w:themeFill="background1"/>
             <w:vAlign w:val="center"/>
           </w:tcPr>
           <w:p>
@@ -2538,6 +2449,12 @@
                 <w:rFonts w:ascii="Helvetica" w:hAnsi="Helvetica" w:cs="Helvetica"/>
               </w:rPr>
               <w:t>T</w:t>
+            </w:r>
+            <w:r>
+              <w:rPr>
+                <w:rFonts w:ascii="Helvetica" w:hAnsi="Helvetica" w:cs="Helvetica"/>
+              </w:rPr>
+              <w:t>5</w:t>
             </w:r>
           </w:p>
         </w:tc>
@@ -2571,7 +2488,7 @@
                 <w:i w:val="0"/>
                 <w:iCs w:val="0"/>
               </w:rPr>
-              <w:t>7</w:t>
+              <w:t>6</w:t>
             </w:r>
           </w:p>
         </w:tc>
@@ -2657,6 +2574,12 @@
               </w:rPr>
               <w:t>T</w:t>
             </w:r>
+            <w:r>
+              <w:rPr>
+                <w:rFonts w:ascii="Helvetica" w:hAnsi="Helvetica" w:cs="Helvetica"/>
+              </w:rPr>
+              <w:t>6</w:t>
+            </w:r>
           </w:p>
         </w:tc>
         <w:tc>
@@ -2679,6 +2602,12 @@
                 <w:rFonts w:ascii="Helvetica" w:hAnsi="Helvetica" w:cs="Helvetica"/>
               </w:rPr>
               <w:t>T</w:t>
+            </w:r>
+            <w:r>
+              <w:rPr>
+                <w:rFonts w:ascii="Helvetica" w:hAnsi="Helvetica" w:cs="Helvetica"/>
+              </w:rPr>
+              <w:t>6</w:t>
             </w:r>
           </w:p>
         </w:tc>
@@ -2694,6 +2623,159 @@
             <w:tcBorders>
               <w:top w:val="single" w:sz="4" w:space="0" w:color="E59EDC" w:themeColor="accent5" w:themeTint="66"/>
               <w:left w:val="single" w:sz="4" w:space="0" w:color="E59EDC" w:themeColor="accent5" w:themeTint="66"/>
+              <w:right w:val="single" w:sz="4" w:space="0" w:color="E59EDC" w:themeColor="accent5" w:themeTint="66"/>
+            </w:tcBorders>
+            <w:vAlign w:val="center"/>
+          </w:tcPr>
+          <w:p>
+            <w:pPr>
+              <w:spacing w:after="0" w:line="240" w:lineRule="auto"/>
+              <w:jc w:val="center"/>
+              <w:rPr>
+                <w:rFonts w:ascii="Helvetica" w:hAnsi="Helvetica" w:cs="Helvetica"/>
+              </w:rPr>
+            </w:pPr>
+            <w:r>
+              <w:rPr>
+                <w:rFonts w:ascii="Helvetica" w:hAnsi="Helvetica" w:cs="Helvetica"/>
+                <w:i w:val="0"/>
+                <w:iCs w:val="0"/>
+              </w:rPr>
+              <w:t>7</w:t>
+            </w:r>
+          </w:p>
+        </w:tc>
+        <w:tc>
+          <w:tcPr>
+            <w:tcW w:w="2074" w:type="dxa"/>
+            <w:tcBorders>
+              <w:left w:val="single" w:sz="4" w:space="0" w:color="E59EDC" w:themeColor="accent5" w:themeTint="66"/>
+            </w:tcBorders>
+            <w:shd w:val="clear" w:color="auto" w:fill="FFFFFF" w:themeFill="background1"/>
+            <w:vAlign w:val="center"/>
+          </w:tcPr>
+          <w:p>
+            <w:pPr>
+              <w:spacing w:after="0" w:line="240" w:lineRule="auto"/>
+              <w:jc w:val="center"/>
+              <w:cnfStyle w:val="000000000000" w:firstRow="0" w:lastRow="0" w:firstColumn="0" w:lastColumn="0" w:oddVBand="0" w:evenVBand="0" w:oddHBand="0" w:evenHBand="0" w:firstRowFirstColumn="0" w:firstRowLastColumn="0" w:lastRowFirstColumn="0" w:lastRowLastColumn="0"/>
+              <w:rPr>
+                <w:rFonts w:ascii="Helvetica" w:hAnsi="Helvetica" w:cs="Helvetica"/>
+              </w:rPr>
+            </w:pPr>
+            <w:r>
+              <w:rPr>
+                <w:rFonts w:ascii="Helvetica" w:hAnsi="Helvetica" w:cs="Helvetica"/>
+              </w:rPr>
+              <w:t>T</w:t>
+            </w:r>
+            <w:r>
+              <w:rPr>
+                <w:rFonts w:ascii="Helvetica" w:hAnsi="Helvetica" w:cs="Helvetica"/>
+              </w:rPr>
+              <w:t>10</w:t>
+            </w:r>
+          </w:p>
+        </w:tc>
+        <w:tc>
+          <w:tcPr>
+            <w:tcW w:w="2071" w:type="dxa"/>
+            <w:shd w:val="clear" w:color="auto" w:fill="FFFFFF" w:themeFill="background1"/>
+            <w:vAlign w:val="center"/>
+          </w:tcPr>
+          <w:p>
+            <w:pPr>
+              <w:spacing w:after="0" w:line="240" w:lineRule="auto"/>
+              <w:jc w:val="center"/>
+              <w:cnfStyle w:val="000000000000" w:firstRow="0" w:lastRow="0" w:firstColumn="0" w:lastColumn="0" w:oddVBand="0" w:evenVBand="0" w:oddHBand="0" w:evenHBand="0" w:firstRowFirstColumn="0" w:firstRowLastColumn="0" w:lastRowFirstColumn="0" w:lastRowLastColumn="0"/>
+              <w:rPr>
+                <w:rFonts w:ascii="Helvetica" w:hAnsi="Helvetica" w:cs="Helvetica"/>
+              </w:rPr>
+            </w:pPr>
+            <w:r>
+              <w:rPr>
+                <w:rFonts w:ascii="Helvetica" w:hAnsi="Helvetica" w:cs="Helvetica"/>
+              </w:rPr>
+              <w:t>T</w:t>
+            </w:r>
+            <w:r>
+              <w:rPr>
+                <w:rFonts w:ascii="Helvetica" w:hAnsi="Helvetica" w:cs="Helvetica"/>
+              </w:rPr>
+              <w:t>11</w:t>
+            </w:r>
+          </w:p>
+        </w:tc>
+        <w:tc>
+          <w:tcPr>
+            <w:tcW w:w="2048" w:type="dxa"/>
+            <w:shd w:val="clear" w:color="auto" w:fill="FFFFFF" w:themeFill="background1"/>
+            <w:vAlign w:val="center"/>
+          </w:tcPr>
+          <w:p>
+            <w:pPr>
+              <w:spacing w:after="0" w:line="240" w:lineRule="auto"/>
+              <w:jc w:val="center"/>
+              <w:cnfStyle w:val="000000000000" w:firstRow="0" w:lastRow="0" w:firstColumn="0" w:lastColumn="0" w:oddVBand="0" w:evenVBand="0" w:oddHBand="0" w:evenHBand="0" w:firstRowFirstColumn="0" w:firstRowLastColumn="0" w:lastRowFirstColumn="0" w:lastRowLastColumn="0"/>
+              <w:rPr>
+                <w:rFonts w:ascii="Helvetica" w:hAnsi="Helvetica" w:cs="Helvetica"/>
+              </w:rPr>
+            </w:pPr>
+            <w:r>
+              <w:rPr>
+                <w:rFonts w:ascii="Helvetica" w:hAnsi="Helvetica" w:cs="Helvetica"/>
+              </w:rPr>
+              <w:t>T</w:t>
+            </w:r>
+            <w:r>
+              <w:rPr>
+                <w:rFonts w:ascii="Helvetica" w:hAnsi="Helvetica" w:cs="Helvetica"/>
+              </w:rPr>
+              <w:t>7</w:t>
+            </w:r>
+          </w:p>
+        </w:tc>
+        <w:tc>
+          <w:tcPr>
+            <w:tcW w:w="2064" w:type="dxa"/>
+            <w:shd w:val="clear" w:color="auto" w:fill="FFFFFF" w:themeFill="background1"/>
+            <w:vAlign w:val="center"/>
+          </w:tcPr>
+          <w:p>
+            <w:pPr>
+              <w:spacing w:after="0" w:line="240" w:lineRule="auto"/>
+              <w:jc w:val="center"/>
+              <w:cnfStyle w:val="000000000000" w:firstRow="0" w:lastRow="0" w:firstColumn="0" w:lastColumn="0" w:oddVBand="0" w:evenVBand="0" w:oddHBand="0" w:evenHBand="0" w:firstRowFirstColumn="0" w:firstRowLastColumn="0" w:lastRowFirstColumn="0" w:lastRowLastColumn="0"/>
+              <w:rPr>
+                <w:rFonts w:ascii="Helvetica" w:hAnsi="Helvetica" w:cs="Helvetica"/>
+              </w:rPr>
+            </w:pPr>
+            <w:r>
+              <w:rPr>
+                <w:rFonts w:ascii="Helvetica" w:hAnsi="Helvetica" w:cs="Helvetica"/>
+              </w:rPr>
+              <w:t>T</w:t>
+            </w:r>
+            <w:r>
+              <w:rPr>
+                <w:rFonts w:ascii="Helvetica" w:hAnsi="Helvetica" w:cs="Helvetica"/>
+              </w:rPr>
+              <w:t>7</w:t>
+            </w:r>
+          </w:p>
+        </w:tc>
+      </w:tr>
+      <w:tr>
+        <w:trPr>
+          <w:trHeight w:val="346"/>
+        </w:trPr>
+        <w:tc>
+          <w:tcPr>
+            <w:cnfStyle w:val="001000000000" w:firstRow="0" w:lastRow="0" w:firstColumn="1" w:lastColumn="0" w:oddVBand="0" w:evenVBand="0" w:oddHBand="0" w:evenHBand="0" w:firstRowFirstColumn="0" w:firstRowLastColumn="0" w:lastRowFirstColumn="0" w:lastRowLastColumn="0"/>
+            <w:tcW w:w="839" w:type="dxa"/>
+            <w:tcBorders>
+              <w:top w:val="single" w:sz="4" w:space="0" w:color="E59EDC" w:themeColor="accent5" w:themeTint="66"/>
+              <w:left w:val="single" w:sz="4" w:space="0" w:color="E59EDC" w:themeColor="accent5" w:themeTint="66"/>
               <w:bottom w:val="single" w:sz="4" w:space="0" w:color="E59EDC" w:themeColor="accent5" w:themeTint="66"/>
               <w:right w:val="single" w:sz="4" w:space="0" w:color="E59EDC" w:themeColor="accent5" w:themeTint="66"/>
             </w:tcBorders>
@@ -2723,6 +2805,7 @@
             <w:tcBorders>
               <w:left w:val="single" w:sz="4" w:space="0" w:color="E59EDC" w:themeColor="accent5" w:themeTint="66"/>
             </w:tcBorders>
+            <w:shd w:val="clear" w:color="auto" w:fill="F2CEED" w:themeFill="accent5" w:themeFillTint="33"/>
             <w:vAlign w:val="center"/>
           </w:tcPr>
           <w:p>
@@ -2751,6 +2834,7 @@
         <w:tc>
           <w:tcPr>
             <w:tcW w:w="2071" w:type="dxa"/>
+            <w:shd w:val="clear" w:color="auto" w:fill="F2CEED" w:themeFill="accent5" w:themeFillTint="33"/>
             <w:vAlign w:val="center"/>
           </w:tcPr>
           <w:p>
@@ -2779,6 +2863,7 @@
         <w:tc>
           <w:tcPr>
             <w:tcW w:w="2048" w:type="dxa"/>
+            <w:shd w:val="clear" w:color="auto" w:fill="F2CEED" w:themeFill="accent5" w:themeFillTint="33"/>
             <w:vAlign w:val="center"/>
           </w:tcPr>
           <w:p>
@@ -2796,11 +2881,18 @@
               </w:rPr>
               <w:t>T</w:t>
             </w:r>
+            <w:r>
+              <w:rPr>
+                <w:rFonts w:ascii="Helvetica" w:hAnsi="Helvetica" w:cs="Helvetica"/>
+              </w:rPr>
+              <w:t>11</w:t>
+            </w:r>
           </w:p>
         </w:tc>
         <w:tc>
           <w:tcPr>
             <w:tcW w:w="2064" w:type="dxa"/>
+            <w:shd w:val="clear" w:color="auto" w:fill="F2CEED" w:themeFill="accent5" w:themeFillTint="33"/>
             <w:vAlign w:val="center"/>
           </w:tcPr>
           <w:p>
@@ -2817,6 +2909,12 @@
                 <w:rFonts w:ascii="Helvetica" w:hAnsi="Helvetica" w:cs="Helvetica"/>
               </w:rPr>
               <w:t>T</w:t>
+            </w:r>
+            <w:r>
+              <w:rPr>
+                <w:rFonts w:ascii="Helvetica" w:hAnsi="Helvetica" w:cs="Helvetica"/>
+              </w:rPr>
+              <w:t>11</w:t>
             </w:r>
           </w:p>
         </w:tc>
@@ -2833,9 +2931,6 @@
       <w:pPr>
         <w:rPr>
           <w:rFonts w:ascii="Helvetica" w:hAnsi="Helvetica" w:cs="Helvetica"/>
-          <w:b/>
-          <w:bCs/>
-          <w:u w:val="single"/>
         </w:rPr>
       </w:pPr>
       <w:r>
@@ -2863,31 +2958,27 @@
           <w:bCs/>
           <w:u w:val="single"/>
         </w:rPr>
-        <w:t xml:space="preserve"> 2 week increment</w:t>
+        <w:t xml:space="preserve"> </w:t>
       </w:r>
-    </w:p>
-    <w:p>
-      <w:pPr>
-        <w:pStyle w:val="ListParagraph"/>
-        <w:numPr>
-          <w:ilvl w:val="0"/>
-          <w:numId w:val="1"/>
-        </w:numPr>
-        <w:rPr>
-          <w:rFonts w:ascii="Helvetica" w:hAnsi="Helvetica" w:cs="Helvetica"/>
-        </w:rPr>
-      </w:pPr>
+      <w:proofErr w:type="gramStart"/>
       <w:r>
         <w:rPr>
           <w:rFonts w:ascii="Helvetica" w:hAnsi="Helvetica" w:cs="Helvetica"/>
+          <w:b/>
+          <w:bCs/>
+          <w:u w:val="single"/>
         </w:rPr>
-        <w:t>Design System Architecture</w:t>
+        <w:t>2 week</w:t>
       </w:r>
+      <w:proofErr w:type="gramEnd"/>
       <w:r>
         <w:rPr>
           <w:rFonts w:ascii="Helvetica" w:hAnsi="Helvetica" w:cs="Helvetica"/>
+          <w:b/>
+          <w:bCs/>
+          <w:u w:val="single"/>
         </w:rPr>
-        <w:t xml:space="preserve"> -</w:t>
+        <w:t xml:space="preserve"> increment</w:t>
       </w:r>
     </w:p>
     <w:p>
@@ -4640,9 +4731,9 @@
           </c:dPt>
           <c:cat>
             <c:strRef>
-              <c:f>Sheet1!$A$2:$A$13</c:f>
+              <c:f>Sheet1!$A$2:$A$12</c:f>
               <c:strCache>
-                <c:ptCount val="12"/>
+                <c:ptCount val="11"/>
                 <c:pt idx="0">
                   <c:v>T1</c:v>
                 </c:pt>
@@ -4676,18 +4767,15 @@
                 <c:pt idx="10">
                   <c:v>T11</c:v>
                 </c:pt>
-                <c:pt idx="11">
-                  <c:v>T12</c:v>
-                </c:pt>
               </c:strCache>
             </c:strRef>
           </c:cat>
           <c:val>
             <c:numRef>
-              <c:f>Sheet1!$B$2:$B$13</c:f>
+              <c:f>Sheet1!$B$2:$B$12</c:f>
               <c:numCache>
                 <c:formatCode>General</c:formatCode>
-                <c:ptCount val="12"/>
+                <c:ptCount val="11"/>
                 <c:pt idx="0">
                   <c:v>0</c:v>
                 </c:pt>
@@ -4719,10 +4807,7 @@
                   <c:v>1</c:v>
                 </c:pt>
                 <c:pt idx="10">
-                  <c:v>5</c:v>
-                </c:pt>
-                <c:pt idx="11">
-                  <c:v>0</c:v>
+                  <c:v>4</c:v>
                 </c:pt>
               </c:numCache>
             </c:numRef>
@@ -4767,9 +4852,9 @@
           <c:invertIfNegative val="0"/>
           <c:cat>
             <c:strRef>
-              <c:f>Sheet1!$A$2:$A$13</c:f>
+              <c:f>Sheet1!$A$2:$A$12</c:f>
               <c:strCache>
-                <c:ptCount val="12"/>
+                <c:ptCount val="11"/>
                 <c:pt idx="0">
                   <c:v>T1</c:v>
                 </c:pt>
@@ -4803,18 +4888,15 @@
                 <c:pt idx="10">
                   <c:v>T11</c:v>
                 </c:pt>
-                <c:pt idx="11">
-                  <c:v>T12</c:v>
-                </c:pt>
               </c:strCache>
             </c:strRef>
           </c:cat>
           <c:val>
             <c:numRef>
-              <c:f>Sheet1!$C$2:$C$13</c:f>
+              <c:f>Sheet1!$C$2:$C$12</c:f>
               <c:numCache>
                 <c:formatCode>General</c:formatCode>
-                <c:ptCount val="12"/>
+                <c:ptCount val="11"/>
                 <c:pt idx="0">
                   <c:v>1</c:v>
                 </c:pt>
@@ -4846,10 +4928,7 @@
                   <c:v>7</c:v>
                 </c:pt>
                 <c:pt idx="10">
-                  <c:v>3</c:v>
-                </c:pt>
-                <c:pt idx="11">
-                  <c:v>1</c:v>
+                  <c:v>4</c:v>
                 </c:pt>
               </c:numCache>
             </c:numRef>

</xml_diff>

<commit_message>
Removed outdated files & Changed Plan Increments
</commit_message>
<xml_diff>
--- a/Project Plan.docx
+++ b/Project Plan.docx
@@ -1,6 +1,6 @@
 
 <file path=word/document.xml><?xml version="1.0" encoding="utf-8"?>
-<w:document xmlns:wpc="http://schemas.microsoft.com/office/word/2010/wordprocessingCanvas" xmlns:cx="http://schemas.microsoft.com/office/drawing/2014/chartex" xmlns:cx1="http://schemas.microsoft.com/office/drawing/2015/9/8/chartex" xmlns:cx2="http://schemas.microsoft.com/office/drawing/2015/10/21/chartex" xmlns:cx3="http://schemas.microsoft.com/office/drawing/2016/5/9/chartex" xmlns:cx4="http://schemas.microsoft.com/office/drawing/2016/5/10/chartex" xmlns:cx5="http://schemas.microsoft.com/office/drawing/2016/5/11/chartex" xmlns:cx6="http://schemas.microsoft.com/office/drawing/2016/5/12/chartex" xmlns:cx7="http://schemas.microsoft.com/office/drawing/2016/5/13/chartex" xmlns:cx8="http://schemas.microsoft.com/office/drawing/2016/5/14/chartex" xmlns:mc="http://schemas.openxmlformats.org/markup-compatibility/2006" xmlns:aink="http://schemas.microsoft.com/office/drawing/2016/ink" xmlns:am3d="http://schemas.microsoft.com/office/drawing/2017/model3d" xmlns:o="urn:schemas-microsoft-com:office:office" xmlns:oel="http://schemas.microsoft.com/office/2019/extlst" xmlns:r="http://schemas.openxmlformats.org/officeDocument/2006/relationships" xmlns:m="http://schemas.openxmlformats.org/officeDocument/2006/math" xmlns:v="urn:schemas-microsoft-com:vml" xmlns:wp14="http://schemas.microsoft.com/office/word/2010/wordprocessingDrawing" xmlns:wp="http://schemas.openxmlformats.org/drawingml/2006/wordprocessingDrawing" xmlns:w10="urn:schemas-microsoft-com:office:word" xmlns:w="http://schemas.openxmlformats.org/wordprocessingml/2006/main" xmlns:w14="http://schemas.microsoft.com/office/word/2010/wordml" xmlns:w15="http://schemas.microsoft.com/office/word/2012/wordml" xmlns:w16cex="http://schemas.microsoft.com/office/word/2018/wordml/cex" xmlns:w16cid="http://schemas.microsoft.com/office/word/2016/wordml/cid" xmlns:w16="http://schemas.microsoft.com/office/word/2018/wordml" xmlns:w16du="http://schemas.microsoft.com/office/word/2023/wordml/word16du" xmlns:w16sdtdh="http://schemas.microsoft.com/office/word/2020/wordml/sdtdatahash" xmlns:w16sdtfl="http://schemas.microsoft.com/office/word/2024/wordml/sdtformatlock" xmlns:w16se="http://schemas.microsoft.com/office/word/2015/wordml/symex" xmlns:wpg="http://schemas.microsoft.com/office/word/2010/wordprocessingGroup" xmlns:wpi="http://schemas.microsoft.com/office/word/2010/wordprocessingInk" xmlns:wne="http://schemas.microsoft.com/office/word/2006/wordml" xmlns:wps="http://schemas.microsoft.com/office/word/2010/wordprocessingShape" mc:Ignorable="w14 w15 w16se w16cid w16 w16cex w16sdtdh w16sdtfl w16du wp14">
+<w:document xmlns:wpc="http://schemas.microsoft.com/office/word/2010/wordprocessingCanvas" xmlns:cx="http://schemas.microsoft.com/office/drawing/2014/chartex" xmlns:cx1="http://schemas.microsoft.com/office/drawing/2015/9/8/chartex" xmlns:cx2="http://schemas.microsoft.com/office/drawing/2015/10/21/chartex" xmlns:cx3="http://schemas.microsoft.com/office/drawing/2016/5/9/chartex" xmlns:cx4="http://schemas.microsoft.com/office/drawing/2016/5/10/chartex" xmlns:cx5="http://schemas.microsoft.com/office/drawing/2016/5/11/chartex" xmlns:cx6="http://schemas.microsoft.com/office/drawing/2016/5/12/chartex" xmlns:cx7="http://schemas.microsoft.com/office/drawing/2016/5/13/chartex" xmlns:cx8="http://schemas.microsoft.com/office/drawing/2016/5/14/chartex" xmlns:mc="http://schemas.openxmlformats.org/markup-compatibility/2006" xmlns:aink="http://schemas.microsoft.com/office/drawing/2016/ink" xmlns:am3d="http://schemas.microsoft.com/office/drawing/2017/model3d" xmlns:o="urn:schemas-microsoft-com:office:office" xmlns:oel="http://schemas.microsoft.com/office/2019/extlst" xmlns:r="http://schemas.openxmlformats.org/officeDocument/2006/relationships" xmlns:m="http://schemas.openxmlformats.org/officeDocument/2006/math" xmlns:v="urn:schemas-microsoft-com:vml" xmlns:wp14="http://schemas.microsoft.com/office/word/2010/wordprocessingDrawing" xmlns:wp="http://schemas.openxmlformats.org/drawingml/2006/wordprocessingDrawing" xmlns:w10="urn:schemas-microsoft-com:office:word" xmlns:w="http://schemas.openxmlformats.org/wordprocessingml/2006/main" xmlns:w14="http://schemas.microsoft.com/office/word/2010/wordml" xmlns:w15="http://schemas.microsoft.com/office/word/2012/wordml" xmlns:w16cex="http://schemas.microsoft.com/office/word/2018/wordml/cex" xmlns:w16cid="http://schemas.microsoft.com/office/word/2016/wordml/cid" xmlns:w16="http://schemas.microsoft.com/office/word/2018/wordml" xmlns:w16sdtdh="http://schemas.microsoft.com/office/word/2020/wordml/sdtdatahash" xmlns:w16se="http://schemas.microsoft.com/office/word/2015/wordml/symex" xmlns:wpg="http://schemas.microsoft.com/office/word/2010/wordprocessingGroup" xmlns:wpi="http://schemas.microsoft.com/office/word/2010/wordprocessingInk" xmlns:wne="http://schemas.microsoft.com/office/word/2006/wordml" xmlns:wps="http://schemas.microsoft.com/office/word/2010/wordprocessingShape" mc:Ignorable="w14 w15 w16se w16cid w16 w16cex w16sdtdh wp14">
   <w:body>
     <w:p>
       <w:pPr>
@@ -3191,7 +3191,16 @@
           <w:bCs/>
           <w:u w:val="single"/>
         </w:rPr>
-        <w:t>First Increment</w:t>
+        <w:t>Work Summary</w:t>
+      </w:r>
+      <w:r>
+        <w:rPr>
+          <w:rFonts w:ascii="Helvetica" w:hAnsi="Helvetica" w:cs="Helvetica"/>
+          <w:b/>
+          <w:bCs/>
+          <w:u w:val="single"/>
+        </w:rPr>
+        <w:t xml:space="preserve"> Plan</w:t>
       </w:r>
       <w:r>
         <w:rPr>
@@ -3365,19 +3374,7 @@
         <w:rPr>
           <w:rFonts w:ascii="Helvetica" w:hAnsi="Helvetica" w:cs="Helvetica"/>
         </w:rPr>
-        <w:t xml:space="preserve">Setup repository files </w:t>
-      </w:r>
-      <w:r>
-        <w:rPr>
-          <w:rFonts w:ascii="Helvetica" w:hAnsi="Helvetica" w:cs="Helvetica"/>
-        </w:rPr>
-        <w:t>–</w:t>
-      </w:r>
-      <w:r>
-        <w:rPr>
-          <w:rFonts w:ascii="Helvetica" w:hAnsi="Helvetica" w:cs="Helvetica"/>
-        </w:rPr>
-        <w:t xml:space="preserve"> Luke</w:t>
+        <w:t>Setup repository files – Luke</w:t>
       </w:r>
     </w:p>
     <w:p>
@@ -3395,19 +3392,7 @@
         <w:rPr>
           <w:rFonts w:ascii="Helvetica" w:hAnsi="Helvetica" w:cs="Helvetica"/>
         </w:rPr>
-        <w:t xml:space="preserve">Begin Excel Sheet for User Stories </w:t>
-      </w:r>
-      <w:r>
-        <w:rPr>
-          <w:rFonts w:ascii="Helvetica" w:hAnsi="Helvetica" w:cs="Helvetica"/>
-        </w:rPr>
-        <w:t>–</w:t>
-      </w:r>
-      <w:r>
-        <w:rPr>
-          <w:rFonts w:ascii="Helvetica" w:hAnsi="Helvetica" w:cs="Helvetica"/>
-        </w:rPr>
-        <w:t xml:space="preserve"> Michael, Luke</w:t>
+        <w:t>Begin Excel Sheet for User Stories – Michael, Luke</w:t>
       </w:r>
     </w:p>
     <w:p>
@@ -3430,7 +3415,7 @@
           <w:bCs/>
           <w:u w:val="single"/>
         </w:rPr>
-        <w:t>Second</w:t>
+        <w:t xml:space="preserve">Work Summary </w:t>
       </w:r>
       <w:r>
         <w:rPr>
@@ -3439,7 +3424,7 @@
           <w:bCs/>
           <w:u w:val="single"/>
         </w:rPr>
-        <w:t xml:space="preserve"> Increment</w:t>
+        <w:t xml:space="preserve">Plan </w:t>
       </w:r>
       <w:r>
         <w:rPr>
@@ -3448,7 +3433,7 @@
           <w:bCs/>
           <w:u w:val="single"/>
         </w:rPr>
-        <w:t xml:space="preserve"> –</w:t>
+        <w:t>–</w:t>
       </w:r>
       <w:r>
         <w:rPr>
@@ -3831,7 +3816,7 @@
           <w:u w:val="single"/>
         </w:rPr>
         <w:lastRenderedPageBreak/>
-        <w:t>Third</w:t>
+        <w:t>Work Summary</w:t>
       </w:r>
       <w:r>
         <w:rPr>
@@ -3840,7 +3825,7 @@
           <w:bCs/>
           <w:u w:val="single"/>
         </w:rPr>
-        <w:t xml:space="preserve"> Increment</w:t>
+        <w:t xml:space="preserve"> </w:t>
       </w:r>
       <w:r>
         <w:rPr>
@@ -3849,7 +3834,7 @@
           <w:bCs/>
           <w:u w:val="single"/>
         </w:rPr>
-        <w:t xml:space="preserve"> –</w:t>
+        <w:t xml:space="preserve">Plan </w:t>
       </w:r>
       <w:r>
         <w:rPr>
@@ -3858,7 +3843,7 @@
           <w:bCs/>
           <w:u w:val="single"/>
         </w:rPr>
-        <w:t xml:space="preserve"> </w:t>
+        <w:t>–</w:t>
       </w:r>
       <w:r>
         <w:rPr>
@@ -3867,7 +3852,7 @@
           <w:bCs/>
           <w:u w:val="single"/>
         </w:rPr>
-        <w:t xml:space="preserve">Week </w:t>
+        <w:t xml:space="preserve"> </w:t>
       </w:r>
       <w:r>
         <w:rPr>
@@ -3876,25 +3861,7 @@
           <w:bCs/>
           <w:u w:val="single"/>
         </w:rPr>
-        <w:t>5</w:t>
-      </w:r>
-      <w:r>
-        <w:rPr>
-          <w:rFonts w:ascii="Helvetica" w:hAnsi="Helvetica" w:cs="Helvetica"/>
-          <w:b/>
-          <w:bCs/>
-          <w:u w:val="single"/>
-        </w:rPr>
-        <w:t xml:space="preserve"> – Week </w:t>
-      </w:r>
-      <w:r>
-        <w:rPr>
-          <w:rFonts w:ascii="Helvetica" w:hAnsi="Helvetica" w:cs="Helvetica"/>
-          <w:b/>
-          <w:bCs/>
-          <w:u w:val="single"/>
-        </w:rPr>
-        <w:t>6</w:t>
+        <w:t>Week 5 – Week 6</w:t>
       </w:r>
     </w:p>
     <w:p>
@@ -3912,19 +3879,7 @@
         <w:rPr>
           <w:rFonts w:ascii="Helvetica" w:hAnsi="Helvetica" w:cs="Helvetica"/>
         </w:rPr>
-        <w:t xml:space="preserve">Create and execute Junit Testing following Test Driven Development for Customer </w:t>
-      </w:r>
-      <w:r>
-        <w:rPr>
-          <w:rFonts w:ascii="Helvetica" w:hAnsi="Helvetica" w:cs="Helvetica"/>
-        </w:rPr>
-        <w:t>–</w:t>
-      </w:r>
-      <w:r>
-        <w:rPr>
-          <w:rFonts w:ascii="Helvetica" w:hAnsi="Helvetica" w:cs="Helvetica"/>
-        </w:rPr>
-        <w:t xml:space="preserve"> James</w:t>
+        <w:t>Create and execute Junit Testing following Test Driven Development for Customer – James</w:t>
       </w:r>
     </w:p>
     <w:p>
@@ -3942,25 +3897,7 @@
         <w:rPr>
           <w:rFonts w:ascii="Helvetica" w:hAnsi="Helvetica" w:cs="Helvetica"/>
         </w:rPr>
-        <w:t xml:space="preserve">Create and execute Junit Testing following Test Driven Development for </w:t>
-      </w:r>
-      <w:r>
-        <w:rPr>
-          <w:rFonts w:ascii="Helvetica" w:hAnsi="Helvetica" w:cs="Helvetica"/>
-        </w:rPr>
-        <w:t>Newsagent</w:t>
-      </w:r>
-      <w:r>
-        <w:rPr>
-          <w:rFonts w:ascii="Helvetica" w:hAnsi="Helvetica" w:cs="Helvetica"/>
-        </w:rPr>
-        <w:t xml:space="preserve"> – </w:t>
-      </w:r>
-      <w:r>
-        <w:rPr>
-          <w:rFonts w:ascii="Helvetica" w:hAnsi="Helvetica" w:cs="Helvetica"/>
-        </w:rPr>
-        <w:t>Joseph</w:t>
+        <w:t>Create and execute Junit Testing following Test Driven Development for Newsagent – Joseph</w:t>
       </w:r>
     </w:p>
     <w:p>
@@ -3978,25 +3915,7 @@
         <w:rPr>
           <w:rFonts w:ascii="Helvetica" w:hAnsi="Helvetica" w:cs="Helvetica"/>
         </w:rPr>
-        <w:t xml:space="preserve">Create and execute Junit Testing following Test Driven Development for </w:t>
-      </w:r>
-      <w:r>
-        <w:rPr>
-          <w:rFonts w:ascii="Helvetica" w:hAnsi="Helvetica" w:cs="Helvetica"/>
-        </w:rPr>
-        <w:t>Order</w:t>
-      </w:r>
-      <w:r>
-        <w:rPr>
-          <w:rFonts w:ascii="Helvetica" w:hAnsi="Helvetica" w:cs="Helvetica"/>
-        </w:rPr>
-        <w:t xml:space="preserve"> – </w:t>
-      </w:r>
-      <w:r>
-        <w:rPr>
-          <w:rFonts w:ascii="Helvetica" w:hAnsi="Helvetica" w:cs="Helvetica"/>
-        </w:rPr>
-        <w:t>Luke</w:t>
+        <w:t>Create and execute Junit Testing following Test Driven Development for Order – Luke</w:t>
       </w:r>
     </w:p>
     <w:p>
@@ -4062,13 +3981,7 @@
         <w:rPr>
           <w:rFonts w:ascii="Helvetica" w:hAnsi="Helvetica" w:cs="Helvetica"/>
         </w:rPr>
-        <w:t>–</w:t>
-      </w:r>
-      <w:r>
-        <w:rPr>
-          <w:rFonts w:ascii="Helvetica" w:hAnsi="Helvetica" w:cs="Helvetica"/>
-        </w:rPr>
-        <w:t xml:space="preserve"> James</w:t>
+        <w:t>– James</w:t>
       </w:r>
     </w:p>
     <w:p>
@@ -4086,31 +3999,7 @@
         <w:rPr>
           <w:rFonts w:ascii="Helvetica" w:hAnsi="Helvetica" w:cs="Helvetica"/>
         </w:rPr>
-        <w:t xml:space="preserve">Have </w:t>
-      </w:r>
-      <w:r>
-        <w:rPr>
-          <w:rFonts w:ascii="Helvetica" w:hAnsi="Helvetica" w:cs="Helvetica"/>
-        </w:rPr>
-        <w:t>Newsagent</w:t>
-      </w:r>
-      <w:r>
-        <w:rPr>
-          <w:rFonts w:ascii="Helvetica" w:hAnsi="Helvetica" w:cs="Helvetica"/>
-        </w:rPr>
-        <w:t xml:space="preserve"> fully connected to the database with the necessary files and be able to create a new </w:t>
-      </w:r>
-      <w:r>
-        <w:rPr>
-          <w:rFonts w:ascii="Helvetica" w:hAnsi="Helvetica" w:cs="Helvetica"/>
-        </w:rPr>
-        <w:t>newsagent</w:t>
-      </w:r>
-      <w:r>
-        <w:rPr>
-          <w:rFonts w:ascii="Helvetica" w:hAnsi="Helvetica" w:cs="Helvetica"/>
-        </w:rPr>
-        <w:t xml:space="preserve"> object completely from the Command Line and </w:t>
+        <w:t xml:space="preserve">Have Newsagent fully connected to the database with the necessary files and be able to create a new newsagent object completely from the Command Line and </w:t>
       </w:r>
       <w:r>
         <w:rPr>
@@ -4122,13 +4011,7 @@
         <w:rPr>
           <w:rFonts w:ascii="Helvetica" w:hAnsi="Helvetica" w:cs="Helvetica"/>
         </w:rPr>
-        <w:t xml:space="preserve"> – </w:t>
-      </w:r>
-      <w:r>
-        <w:rPr>
-          <w:rFonts w:ascii="Helvetica" w:hAnsi="Helvetica" w:cs="Helvetica"/>
-        </w:rPr>
-        <w:t>Joseph</w:t>
+        <w:t xml:space="preserve"> – Joseph</w:t>
       </w:r>
     </w:p>
     <w:p>
@@ -4146,31 +4029,7 @@
         <w:rPr>
           <w:rFonts w:ascii="Helvetica" w:hAnsi="Helvetica" w:cs="Helvetica"/>
         </w:rPr>
-        <w:t xml:space="preserve">Have </w:t>
-      </w:r>
-      <w:r>
-        <w:rPr>
-          <w:rFonts w:ascii="Helvetica" w:hAnsi="Helvetica" w:cs="Helvetica"/>
-        </w:rPr>
-        <w:t>Order</w:t>
-      </w:r>
-      <w:r>
-        <w:rPr>
-          <w:rFonts w:ascii="Helvetica" w:hAnsi="Helvetica" w:cs="Helvetica"/>
-        </w:rPr>
-        <w:t xml:space="preserve"> fully connected to the database with the necessary files and be able to create a new </w:t>
-      </w:r>
-      <w:r>
-        <w:rPr>
-          <w:rFonts w:ascii="Helvetica" w:hAnsi="Helvetica" w:cs="Helvetica"/>
-        </w:rPr>
-        <w:t>order</w:t>
-      </w:r>
-      <w:r>
-        <w:rPr>
-          <w:rFonts w:ascii="Helvetica" w:hAnsi="Helvetica" w:cs="Helvetica"/>
-        </w:rPr>
-        <w:t xml:space="preserve"> object completely from the Command Line and </w:t>
+        <w:t xml:space="preserve">Have Order fully connected to the database with the necessary files and be able to create a new order object completely from the Command Line and </w:t>
       </w:r>
       <w:r>
         <w:rPr>
@@ -4193,11 +4052,24 @@
     </w:p>
     <w:p>
       <w:pPr>
-        <w:ind w:left="360"/>
-        <w:rPr>
-          <w:rFonts w:ascii="Helvetica" w:hAnsi="Helvetica" w:cs="Helvetica"/>
-        </w:rPr>
-      </w:pPr>
+        <w:rPr>
+          <w:rFonts w:ascii="Helvetica" w:hAnsi="Helvetica" w:cs="Helvetica"/>
+          <w:b/>
+          <w:bCs/>
+          <w:sz w:val="32"/>
+          <w:szCs w:val="32"/>
+        </w:rPr>
+      </w:pPr>
+      <w:r>
+        <w:rPr>
+          <w:rFonts w:ascii="Helvetica" w:hAnsi="Helvetica" w:cs="Helvetica"/>
+          <w:b/>
+          <w:bCs/>
+          <w:sz w:val="32"/>
+          <w:szCs w:val="32"/>
+        </w:rPr>
+        <w:t>6 Week Project Plan – Divided into 3 Increments (2 weeks)</w:t>
+      </w:r>
     </w:p>
     <w:p>
       <w:pPr>
@@ -4212,7 +4084,7 @@
           <w:bCs/>
           <w:u w:val="single"/>
         </w:rPr>
-        <w:t>Fourth</w:t>
+        <w:t>F</w:t>
       </w:r>
       <w:r>
         <w:rPr>
@@ -4221,7 +4093,7 @@
           <w:bCs/>
           <w:u w:val="single"/>
         </w:rPr>
-        <w:t xml:space="preserve"> Increment</w:t>
+        <w:t>irst</w:t>
       </w:r>
       <w:r>
         <w:rPr>
@@ -4230,7 +4102,7 @@
           <w:bCs/>
           <w:u w:val="single"/>
         </w:rPr>
-        <w:t xml:space="preserve"> –</w:t>
+        <w:t xml:space="preserve"> Increment</w:t>
       </w:r>
       <w:r>
         <w:rPr>
@@ -4239,7 +4111,7 @@
           <w:bCs/>
           <w:u w:val="single"/>
         </w:rPr>
-        <w:t xml:space="preserve"> </w:t>
+        <w:t xml:space="preserve"> –</w:t>
       </w:r>
       <w:r>
         <w:rPr>
@@ -4248,7 +4120,7 @@
           <w:bCs/>
           <w:u w:val="single"/>
         </w:rPr>
-        <w:t xml:space="preserve">Week </w:t>
+        <w:t xml:space="preserve"> </w:t>
       </w:r>
       <w:r>
         <w:rPr>
@@ -4257,25 +4129,7 @@
           <w:bCs/>
           <w:u w:val="single"/>
         </w:rPr>
-        <w:t>7</w:t>
-      </w:r>
-      <w:r>
-        <w:rPr>
-          <w:rFonts w:ascii="Helvetica" w:hAnsi="Helvetica" w:cs="Helvetica"/>
-          <w:b/>
-          <w:bCs/>
-          <w:u w:val="single"/>
-        </w:rPr>
-        <w:t xml:space="preserve"> – Week </w:t>
-      </w:r>
-      <w:r>
-        <w:rPr>
-          <w:rFonts w:ascii="Helvetica" w:hAnsi="Helvetica" w:cs="Helvetica"/>
-          <w:b/>
-          <w:bCs/>
-          <w:u w:val="single"/>
-        </w:rPr>
-        <w:t>8</w:t>
+        <w:t>Week 7 – Week 8</w:t>
       </w:r>
     </w:p>
     <w:p>
@@ -4293,19 +4147,7 @@
         <w:rPr>
           <w:rFonts w:ascii="Helvetica" w:hAnsi="Helvetica" w:cs="Helvetica"/>
         </w:rPr>
-        <w:t xml:space="preserve">Have all the statements and methods implemented so that the User can Create, Read, Update or Delete any Customer from the database </w:t>
-      </w:r>
-      <w:r>
-        <w:rPr>
-          <w:rFonts w:ascii="Helvetica" w:hAnsi="Helvetica" w:cs="Helvetica"/>
-        </w:rPr>
-        <w:t>–</w:t>
-      </w:r>
-      <w:r>
-        <w:rPr>
-          <w:rFonts w:ascii="Helvetica" w:hAnsi="Helvetica" w:cs="Helvetica"/>
-        </w:rPr>
-        <w:t xml:space="preserve"> James</w:t>
+        <w:t>Have all the statements and methods implemented so that the User can Create, Read, Update or Delete any Customer from the database – James</w:t>
       </w:r>
     </w:p>
     <w:p>
@@ -4323,25 +4165,7 @@
         <w:rPr>
           <w:rFonts w:ascii="Helvetica" w:hAnsi="Helvetica" w:cs="Helvetica"/>
         </w:rPr>
-        <w:t xml:space="preserve">Have all the statements and methods implemented so that the User can Create, Read, Update or Delete any </w:t>
-      </w:r>
-      <w:r>
-        <w:rPr>
-          <w:rFonts w:ascii="Helvetica" w:hAnsi="Helvetica" w:cs="Helvetica"/>
-        </w:rPr>
-        <w:t>Newsagent</w:t>
-      </w:r>
-      <w:r>
-        <w:rPr>
-          <w:rFonts w:ascii="Helvetica" w:hAnsi="Helvetica" w:cs="Helvetica"/>
-        </w:rPr>
-        <w:t xml:space="preserve"> from the database – </w:t>
-      </w:r>
-      <w:r>
-        <w:rPr>
-          <w:rFonts w:ascii="Helvetica" w:hAnsi="Helvetica" w:cs="Helvetica"/>
-        </w:rPr>
-        <w:t>Joseph</w:t>
+        <w:t>Have all the statements and methods implemented so that the User can Create, Read, Update or Delete any Newsagent from the database – Joseph</w:t>
       </w:r>
     </w:p>
     <w:p>
@@ -4359,25 +4183,7 @@
         <w:rPr>
           <w:rFonts w:ascii="Helvetica" w:hAnsi="Helvetica" w:cs="Helvetica"/>
         </w:rPr>
-        <w:t xml:space="preserve">Have all the statements and methods implemented so that the User can Create, Read, Update or Delete any </w:t>
-      </w:r>
-      <w:r>
-        <w:rPr>
-          <w:rFonts w:ascii="Helvetica" w:hAnsi="Helvetica" w:cs="Helvetica"/>
-        </w:rPr>
-        <w:t>Order</w:t>
-      </w:r>
-      <w:r>
-        <w:rPr>
-          <w:rFonts w:ascii="Helvetica" w:hAnsi="Helvetica" w:cs="Helvetica"/>
-        </w:rPr>
-        <w:t xml:space="preserve"> from the database – </w:t>
-      </w:r>
-      <w:r>
-        <w:rPr>
-          <w:rFonts w:ascii="Helvetica" w:hAnsi="Helvetica" w:cs="Helvetica"/>
-        </w:rPr>
-        <w:t>Luke</w:t>
+        <w:t>Have all the statements and methods implemented so that the User can Create, Read, Update or Delete any Order from the database – Luke</w:t>
       </w:r>
     </w:p>
     <w:p>
@@ -4395,19 +4201,7 @@
         <w:rPr>
           <w:rFonts w:ascii="Helvetica" w:hAnsi="Helvetica" w:cs="Helvetica"/>
         </w:rPr>
-        <w:t xml:space="preserve">Do a complete team peer review of each other’s work and look for things that can be improved </w:t>
-      </w:r>
-      <w:r>
-        <w:rPr>
-          <w:rFonts w:ascii="Helvetica" w:hAnsi="Helvetica" w:cs="Helvetica"/>
-        </w:rPr>
-        <w:t>–</w:t>
-      </w:r>
-      <w:r>
-        <w:rPr>
-          <w:rFonts w:ascii="Helvetica" w:hAnsi="Helvetica" w:cs="Helvetica"/>
-        </w:rPr>
-        <w:t xml:space="preserve"> ALL</w:t>
+        <w:t>Do a complete team peer review of each other’s work and look for things that can be improved – ALL</w:t>
       </w:r>
     </w:p>
     <w:p>
@@ -4431,19 +4225,7 @@
         <w:rPr>
           <w:rFonts w:ascii="Helvetica" w:hAnsi="Helvetica" w:cs="Helvetica"/>
         </w:rPr>
-        <w:t xml:space="preserve">all parameters, TDD and connection to the database for Delivery Person </w:t>
-      </w:r>
-      <w:r>
-        <w:rPr>
-          <w:rFonts w:ascii="Helvetica" w:hAnsi="Helvetica" w:cs="Helvetica"/>
-        </w:rPr>
-        <w:t>–</w:t>
-      </w:r>
-      <w:r>
-        <w:rPr>
-          <w:rFonts w:ascii="Helvetica" w:hAnsi="Helvetica" w:cs="Helvetica"/>
-        </w:rPr>
-        <w:t xml:space="preserve"> Joseph</w:t>
+        <w:t>all parameters, TDD and connection to the database for Delivery Person – Joseph</w:t>
       </w:r>
     </w:p>
     <w:p>
@@ -4461,25 +4243,7 @@
         <w:rPr>
           <w:rFonts w:ascii="Helvetica" w:hAnsi="Helvetica" w:cs="Helvetica"/>
         </w:rPr>
-        <w:t xml:space="preserve">Implement all parameters, TDD and connection to the database for </w:t>
-      </w:r>
-      <w:r>
-        <w:rPr>
-          <w:rFonts w:ascii="Helvetica" w:hAnsi="Helvetica" w:cs="Helvetica"/>
-        </w:rPr>
-        <w:t>Publications</w:t>
-      </w:r>
-      <w:r>
-        <w:rPr>
-          <w:rFonts w:ascii="Helvetica" w:hAnsi="Helvetica" w:cs="Helvetica"/>
-        </w:rPr>
-        <w:t xml:space="preserve"> – </w:t>
-      </w:r>
-      <w:r>
-        <w:rPr>
-          <w:rFonts w:ascii="Helvetica" w:hAnsi="Helvetica" w:cs="Helvetica"/>
-        </w:rPr>
-        <w:t>Luke</w:t>
+        <w:t>Implement all parameters, TDD and connection to the database for Publications – Luke</w:t>
       </w:r>
     </w:p>
     <w:p>
@@ -4497,25 +4261,7 @@
         <w:rPr>
           <w:rFonts w:ascii="Helvetica" w:hAnsi="Helvetica" w:cs="Helvetica"/>
         </w:rPr>
-        <w:t xml:space="preserve">Implement all parameters, TDD and connection to the database for Delivery </w:t>
-      </w:r>
-      <w:r>
-        <w:rPr>
-          <w:rFonts w:ascii="Helvetica" w:hAnsi="Helvetica" w:cs="Helvetica"/>
-        </w:rPr>
-        <w:t>Docket</w:t>
-      </w:r>
-      <w:r>
-        <w:rPr>
-          <w:rFonts w:ascii="Helvetica" w:hAnsi="Helvetica" w:cs="Helvetica"/>
-        </w:rPr>
-        <w:t xml:space="preserve"> – </w:t>
-      </w:r>
-      <w:r>
-        <w:rPr>
-          <w:rFonts w:ascii="Helvetica" w:hAnsi="Helvetica" w:cs="Helvetica"/>
-        </w:rPr>
-        <w:t>James</w:t>
+        <w:t>Implement all parameters, TDD and connection to the database for Delivery Docket – James</w:t>
       </w:r>
     </w:p>
     <w:p>
@@ -4533,25 +4279,7 @@
         <w:rPr>
           <w:rFonts w:ascii="Helvetica" w:hAnsi="Helvetica" w:cs="Helvetica"/>
         </w:rPr>
-        <w:t xml:space="preserve">Implement all parameters, TDD and connection to the database for Delivery </w:t>
-      </w:r>
-      <w:r>
-        <w:rPr>
-          <w:rFonts w:ascii="Helvetica" w:hAnsi="Helvetica" w:cs="Helvetica"/>
-        </w:rPr>
-        <w:t>Area</w:t>
-      </w:r>
-      <w:r>
-        <w:rPr>
-          <w:rFonts w:ascii="Helvetica" w:hAnsi="Helvetica" w:cs="Helvetica"/>
-        </w:rPr>
-        <w:t xml:space="preserve"> – James</w:t>
-      </w:r>
-      <w:r>
-        <w:rPr>
-          <w:rFonts w:ascii="Helvetica" w:hAnsi="Helvetica" w:cs="Helvetica"/>
-        </w:rPr>
-        <w:t>, Luke</w:t>
+        <w:t>Implement all parameters, TDD and connection to the database for Delivery Area – James, Luke</w:t>
       </w:r>
     </w:p>
     <w:p>
@@ -4569,34 +4297,8 @@
         <w:rPr>
           <w:rFonts w:ascii="Helvetica" w:hAnsi="Helvetica" w:cs="Helvetica"/>
         </w:rPr>
-        <w:t xml:space="preserve">Implement all parameters, TDD and connection to the database for </w:t>
-      </w:r>
-      <w:r>
-        <w:rPr>
-          <w:rFonts w:ascii="Helvetica" w:hAnsi="Helvetica" w:cs="Helvetica"/>
-        </w:rPr>
-        <w:t xml:space="preserve">Bill </w:t>
-      </w:r>
-      <w:r>
-        <w:rPr>
-          <w:rFonts w:ascii="Helvetica" w:hAnsi="Helvetica" w:cs="Helvetica"/>
-        </w:rPr>
-        <w:t xml:space="preserve">– </w:t>
-      </w:r>
-      <w:r>
-        <w:rPr>
-          <w:rFonts w:ascii="Helvetica" w:hAnsi="Helvetica" w:cs="Helvetica"/>
-        </w:rPr>
-        <w:t>Joseph, Michael</w:t>
-      </w:r>
-    </w:p>
-    <w:p>
-      <w:pPr>
-        <w:ind w:left="360"/>
-        <w:rPr>
-          <w:rFonts w:ascii="Helvetica" w:hAnsi="Helvetica" w:cs="Helvetica"/>
-        </w:rPr>
-      </w:pPr>
+        <w:t>Implement all parameters, TDD and connection to the database for Bill – Joseph, Michael</w:t>
+      </w:r>
     </w:p>
     <w:p>
       <w:pPr>
@@ -4627,7 +4329,7 @@
           <w:u w:val="single"/>
         </w:rPr>
         <w:lastRenderedPageBreak/>
-        <w:t>Fifth</w:t>
+        <w:t>Second</w:t>
       </w:r>
       <w:r>
         <w:rPr>
@@ -4663,34 +4365,7 @@
           <w:bCs/>
           <w:u w:val="single"/>
         </w:rPr>
-        <w:t xml:space="preserve">Week </w:t>
-      </w:r>
-      <w:r>
-        <w:rPr>
-          <w:rFonts w:ascii="Helvetica" w:hAnsi="Helvetica" w:cs="Helvetica"/>
-          <w:b/>
-          <w:bCs/>
-          <w:u w:val="single"/>
-        </w:rPr>
-        <w:t>9</w:t>
-      </w:r>
-      <w:r>
-        <w:rPr>
-          <w:rFonts w:ascii="Helvetica" w:hAnsi="Helvetica" w:cs="Helvetica"/>
-          <w:b/>
-          <w:bCs/>
-          <w:u w:val="single"/>
-        </w:rPr>
-        <w:t xml:space="preserve"> – Week </w:t>
-      </w:r>
-      <w:r>
-        <w:rPr>
-          <w:rFonts w:ascii="Helvetica" w:hAnsi="Helvetica" w:cs="Helvetica"/>
-          <w:b/>
-          <w:bCs/>
-          <w:u w:val="single"/>
-        </w:rPr>
-        <w:t>10</w:t>
+        <w:t>Week 9 – Week 10</w:t>
       </w:r>
     </w:p>
     <w:p>
@@ -4708,19 +4383,7 @@
         <w:rPr>
           <w:rFonts w:ascii="Helvetica" w:hAnsi="Helvetica" w:cs="Helvetica"/>
         </w:rPr>
-        <w:t xml:space="preserve">Create GUI and base login system for Newsagent who can now manage any entity with its database with buttons and other actions on the GUI </w:t>
-      </w:r>
-      <w:r>
-        <w:rPr>
-          <w:rFonts w:ascii="Helvetica" w:hAnsi="Helvetica" w:cs="Helvetica"/>
-        </w:rPr>
-        <w:t>–</w:t>
-      </w:r>
-      <w:r>
-        <w:rPr>
-          <w:rFonts w:ascii="Helvetica" w:hAnsi="Helvetica" w:cs="Helvetica"/>
-        </w:rPr>
-        <w:t xml:space="preserve"> Joseph</w:t>
+        <w:t>Create GUI and base login system for Newsagent who can now manage any entity with its database with buttons and other actions on the GUI – Joseph</w:t>
       </w:r>
     </w:p>
     <w:p>
@@ -4738,19 +4401,7 @@
         <w:rPr>
           <w:rFonts w:ascii="Helvetica" w:hAnsi="Helvetica" w:cs="Helvetica"/>
         </w:rPr>
-        <w:t xml:space="preserve">Implement the order list for the delivery person who receives a new list of all publications to be delivered each day to each address and a system to check off if they have successfully delivered that publication </w:t>
-      </w:r>
-      <w:r>
-        <w:rPr>
-          <w:rFonts w:ascii="Helvetica" w:hAnsi="Helvetica" w:cs="Helvetica"/>
-        </w:rPr>
-        <w:t>–</w:t>
-      </w:r>
-      <w:r>
-        <w:rPr>
-          <w:rFonts w:ascii="Helvetica" w:hAnsi="Helvetica" w:cs="Helvetica"/>
-        </w:rPr>
-        <w:t xml:space="preserve"> James</w:t>
+        <w:t>Implement the order list for the delivery person who receives a new list of all publications to be delivered each day to each address and a system to check off if they have successfully delivered that publication – James</w:t>
       </w:r>
     </w:p>
     <w:p>
@@ -4780,19 +4431,7 @@
         <w:rPr>
           <w:rFonts w:ascii="Helvetica" w:hAnsi="Helvetica" w:cs="Helvetica"/>
         </w:rPr>
-        <w:t xml:space="preserve">received that day </w:t>
-      </w:r>
-      <w:r>
-        <w:rPr>
-          <w:rFonts w:ascii="Helvetica" w:hAnsi="Helvetica" w:cs="Helvetica"/>
-        </w:rPr>
-        <w:t>–</w:t>
-      </w:r>
-      <w:r>
-        <w:rPr>
-          <w:rFonts w:ascii="Helvetica" w:hAnsi="Helvetica" w:cs="Helvetica"/>
-        </w:rPr>
-        <w:t xml:space="preserve"> Luke</w:t>
+        <w:t>received that day – Luke</w:t>
       </w:r>
     </w:p>
     <w:p>
@@ -4828,20 +4467,16 @@
         <w:rPr>
           <w:rFonts w:ascii="Helvetica" w:hAnsi="Helvetica" w:cs="Helvetica"/>
         </w:rPr>
-        <w:t xml:space="preserve">gent when inventory of a certain item becomes low </w:t>
-      </w:r>
-      <w:r>
-        <w:rPr>
-          <w:rFonts w:ascii="Helvetica" w:hAnsi="Helvetica" w:cs="Helvetica"/>
-        </w:rPr>
-        <w:t>–</w:t>
-      </w:r>
-      <w:r>
-        <w:rPr>
-          <w:rFonts w:ascii="Helvetica" w:hAnsi="Helvetica" w:cs="Helvetica"/>
-        </w:rPr>
-        <w:t xml:space="preserve"> Luke, Michael</w:t>
-      </w:r>
+        <w:t>gent when inventory of a certain item becomes low – Luke, Michael</w:t>
+      </w:r>
+    </w:p>
+    <w:p>
+      <w:pPr>
+        <w:ind w:left="360"/>
+        <w:rPr>
+          <w:rFonts w:ascii="Helvetica" w:hAnsi="Helvetica" w:cs="Helvetica"/>
+        </w:rPr>
+      </w:pPr>
     </w:p>
     <w:p>
       <w:pPr>
@@ -4892,43 +4527,7 @@
           <w:bCs/>
           <w:u w:val="single"/>
         </w:rPr>
-        <w:t>Week 1</w:t>
-      </w:r>
-      <w:r>
-        <w:rPr>
-          <w:rFonts w:ascii="Helvetica" w:hAnsi="Helvetica" w:cs="Helvetica"/>
-          <w:b/>
-          <w:bCs/>
-          <w:u w:val="single"/>
-        </w:rPr>
-        <w:t>1</w:t>
-      </w:r>
-      <w:r>
-        <w:rPr>
-          <w:rFonts w:ascii="Helvetica" w:hAnsi="Helvetica" w:cs="Helvetica"/>
-          <w:b/>
-          <w:bCs/>
-          <w:u w:val="single"/>
-        </w:rPr>
-        <w:t xml:space="preserve"> – Week </w:t>
-      </w:r>
-      <w:r>
-        <w:rPr>
-          <w:rFonts w:ascii="Helvetica" w:hAnsi="Helvetica" w:cs="Helvetica"/>
-          <w:b/>
-          <w:bCs/>
-          <w:u w:val="single"/>
-        </w:rPr>
-        <w:t>1</w:t>
-      </w:r>
-      <w:r>
-        <w:rPr>
-          <w:rFonts w:ascii="Helvetica" w:hAnsi="Helvetica" w:cs="Helvetica"/>
-          <w:b/>
-          <w:bCs/>
-          <w:u w:val="single"/>
-        </w:rPr>
-        <w:t>2</w:t>
+        <w:t>Week 11 – Week 12</w:t>
       </w:r>
     </w:p>
     <w:p>
@@ -4946,19 +4545,7 @@
         <w:rPr>
           <w:rFonts w:ascii="Helvetica" w:hAnsi="Helvetica" w:cs="Helvetica"/>
         </w:rPr>
-        <w:t xml:space="preserve">Implement the calculated bill for a certain customer for that month and make sure the bill is included for the delivery person to deliver along side their publications </w:t>
-      </w:r>
-      <w:r>
-        <w:rPr>
-          <w:rFonts w:ascii="Helvetica" w:hAnsi="Helvetica" w:cs="Helvetica"/>
-        </w:rPr>
-        <w:t>–</w:t>
-      </w:r>
-      <w:r>
-        <w:rPr>
-          <w:rFonts w:ascii="Helvetica" w:hAnsi="Helvetica" w:cs="Helvetica"/>
-        </w:rPr>
-        <w:t xml:space="preserve"> Joseph, James</w:t>
+        <w:t>Implement the calculated bill for a certain customer for that month and make sure the bill is included for the delivery person to deliver along side their publications – Joseph, James</w:t>
       </w:r>
     </w:p>
     <w:p>
@@ -4976,19 +4563,7 @@
         <w:rPr>
           <w:rFonts w:ascii="Helvetica" w:hAnsi="Helvetica" w:cs="Helvetica"/>
         </w:rPr>
-        <w:t xml:space="preserve">Implement where the customer will not be charged for the time they are away or put any publications on their deliver list if they are on holiday/away </w:t>
-      </w:r>
-      <w:r>
-        <w:rPr>
-          <w:rFonts w:ascii="Helvetica" w:hAnsi="Helvetica" w:cs="Helvetica"/>
-        </w:rPr>
-        <w:t>–</w:t>
-      </w:r>
-      <w:r>
-        <w:rPr>
-          <w:rFonts w:ascii="Helvetica" w:hAnsi="Helvetica" w:cs="Helvetica"/>
-        </w:rPr>
-        <w:t xml:space="preserve"> Luke, Michael</w:t>
+        <w:t>Implement where the customer will not be charged for the time they are away or put any publications on their deliver list if they are on holiday/away – Luke, Michael</w:t>
       </w:r>
     </w:p>
     <w:p>
@@ -5012,19 +4587,7 @@
         <w:rPr>
           <w:rFonts w:ascii="Helvetica" w:hAnsi="Helvetica" w:cs="Helvetica"/>
         </w:rPr>
-        <w:t xml:space="preserve">mplement a warning and reminder system for a scenario where the customer hasn’t paid their monthly bill and is sent the message along side their bill </w:t>
-      </w:r>
-      <w:r>
-        <w:rPr>
-          <w:rFonts w:ascii="Helvetica" w:hAnsi="Helvetica" w:cs="Helvetica"/>
-        </w:rPr>
-        <w:t>–</w:t>
-      </w:r>
-      <w:r>
-        <w:rPr>
-          <w:rFonts w:ascii="Helvetica" w:hAnsi="Helvetica" w:cs="Helvetica"/>
-        </w:rPr>
-        <w:t xml:space="preserve"> James</w:t>
+        <w:t>mplement a warning and reminder system for a scenario where the customer hasn’t paid their monthly bill and is sent the message along side their bill – James</w:t>
       </w:r>
     </w:p>
     <w:p>
@@ -5042,19 +4605,7 @@
         <w:rPr>
           <w:rFonts w:ascii="Helvetica" w:hAnsi="Helvetica" w:cs="Helvetica"/>
         </w:rPr>
-        <w:t xml:space="preserve">Create a notification for the Customer if a publication they ordered is not available/can’t be delivered </w:t>
-      </w:r>
-      <w:r>
-        <w:rPr>
-          <w:rFonts w:ascii="Helvetica" w:hAnsi="Helvetica" w:cs="Helvetica"/>
-        </w:rPr>
-        <w:t>–</w:t>
-      </w:r>
-      <w:r>
-        <w:rPr>
-          <w:rFonts w:ascii="Helvetica" w:hAnsi="Helvetica" w:cs="Helvetica"/>
-        </w:rPr>
-        <w:t xml:space="preserve"> Joseph</w:t>
+        <w:t>Create a notification for the Customer if a publication they ordered is not available/can’t be delivered – Joseph</w:t>
       </w:r>
     </w:p>
     <w:p>
@@ -5072,19 +4623,7 @@
         <w:rPr>
           <w:rFonts w:ascii="Helvetica" w:hAnsi="Helvetica" w:cs="Helvetica"/>
         </w:rPr>
-        <w:t xml:space="preserve">Make sure if a delivery is failed, it is added to the next day delivery docket </w:t>
-      </w:r>
-      <w:r>
-        <w:rPr>
-          <w:rFonts w:ascii="Helvetica" w:hAnsi="Helvetica" w:cs="Helvetica"/>
-        </w:rPr>
-        <w:t>–</w:t>
-      </w:r>
-      <w:r>
-        <w:rPr>
-          <w:rFonts w:ascii="Helvetica" w:hAnsi="Helvetica" w:cs="Helvetica"/>
-        </w:rPr>
-        <w:t xml:space="preserve"> Luke</w:t>
+        <w:t>Make sure if a delivery is failed, it is added to the next day delivery docket – Luke</w:t>
       </w:r>
     </w:p>
     <w:p>
@@ -5102,19 +4641,7 @@
         <w:rPr>
           <w:rFonts w:ascii="Helvetica" w:hAnsi="Helvetica" w:cs="Helvetica"/>
         </w:rPr>
-        <w:t xml:space="preserve">Perform an entire review and testing (for bugs etc) of the Project and reflect on how it meets the speciation’s of the project </w:t>
-      </w:r>
-      <w:r>
-        <w:rPr>
-          <w:rFonts w:ascii="Helvetica" w:hAnsi="Helvetica" w:cs="Helvetica"/>
-        </w:rPr>
-        <w:t>–</w:t>
-      </w:r>
-      <w:r>
-        <w:rPr>
-          <w:rFonts w:ascii="Helvetica" w:hAnsi="Helvetica" w:cs="Helvetica"/>
-        </w:rPr>
-        <w:t xml:space="preserve"> ALL</w:t>
+        <w:t>Perform an entire review and testing (for bugs etc) of the Project and reflect on how it meets the speciation’s of the project – ALL</w:t>
       </w:r>
     </w:p>
     <w:p>
@@ -5149,7 +4676,7 @@
 </file>
 
 <file path=word/endnotes.xml><?xml version="1.0" encoding="utf-8"?>
-<w:endnotes xmlns:wpc="http://schemas.microsoft.com/office/word/2010/wordprocessingCanvas" xmlns:cx="http://schemas.microsoft.com/office/drawing/2014/chartex" xmlns:cx1="http://schemas.microsoft.com/office/drawing/2015/9/8/chartex" xmlns:cx2="http://schemas.microsoft.com/office/drawing/2015/10/21/chartex" xmlns:cx3="http://schemas.microsoft.com/office/drawing/2016/5/9/chartex" xmlns:cx4="http://schemas.microsoft.com/office/drawing/2016/5/10/chartex" xmlns:cx5="http://schemas.microsoft.com/office/drawing/2016/5/11/chartex" xmlns:cx6="http://schemas.microsoft.com/office/drawing/2016/5/12/chartex" xmlns:cx7="http://schemas.microsoft.com/office/drawing/2016/5/13/chartex" xmlns:cx8="http://schemas.microsoft.com/office/drawing/2016/5/14/chartex" xmlns:mc="http://schemas.openxmlformats.org/markup-compatibility/2006" xmlns:aink="http://schemas.microsoft.com/office/drawing/2016/ink" xmlns:am3d="http://schemas.microsoft.com/office/drawing/2017/model3d" xmlns:o="urn:schemas-microsoft-com:office:office" xmlns:oel="http://schemas.microsoft.com/office/2019/extlst" xmlns:r="http://schemas.openxmlformats.org/officeDocument/2006/relationships" xmlns:m="http://schemas.openxmlformats.org/officeDocument/2006/math" xmlns:v="urn:schemas-microsoft-com:vml" xmlns:wp14="http://schemas.microsoft.com/office/word/2010/wordprocessingDrawing" xmlns:wp="http://schemas.openxmlformats.org/drawingml/2006/wordprocessingDrawing" xmlns:w10="urn:schemas-microsoft-com:office:word" xmlns:w="http://schemas.openxmlformats.org/wordprocessingml/2006/main" xmlns:w14="http://schemas.microsoft.com/office/word/2010/wordml" xmlns:w15="http://schemas.microsoft.com/office/word/2012/wordml" xmlns:w16cex="http://schemas.microsoft.com/office/word/2018/wordml/cex" xmlns:w16cid="http://schemas.microsoft.com/office/word/2016/wordml/cid" xmlns:w16="http://schemas.microsoft.com/office/word/2018/wordml" xmlns:w16du="http://schemas.microsoft.com/office/word/2023/wordml/word16du" xmlns:w16sdtdh="http://schemas.microsoft.com/office/word/2020/wordml/sdtdatahash" xmlns:w16sdtfl="http://schemas.microsoft.com/office/word/2024/wordml/sdtformatlock" xmlns:w16se="http://schemas.microsoft.com/office/word/2015/wordml/symex" xmlns:wpg="http://schemas.microsoft.com/office/word/2010/wordprocessingGroup" xmlns:wpi="http://schemas.microsoft.com/office/word/2010/wordprocessingInk" xmlns:wne="http://schemas.microsoft.com/office/word/2006/wordml" xmlns:wps="http://schemas.microsoft.com/office/word/2010/wordprocessingShape" mc:Ignorable="w14 w15 w16se w16cid w16 w16cex w16sdtdh w16sdtfl w16du wp14">
+<w:endnotes xmlns:wpc="http://schemas.microsoft.com/office/word/2010/wordprocessingCanvas" xmlns:cx="http://schemas.microsoft.com/office/drawing/2014/chartex" xmlns:cx1="http://schemas.microsoft.com/office/drawing/2015/9/8/chartex" xmlns:cx2="http://schemas.microsoft.com/office/drawing/2015/10/21/chartex" xmlns:cx3="http://schemas.microsoft.com/office/drawing/2016/5/9/chartex" xmlns:cx4="http://schemas.microsoft.com/office/drawing/2016/5/10/chartex" xmlns:cx5="http://schemas.microsoft.com/office/drawing/2016/5/11/chartex" xmlns:cx6="http://schemas.microsoft.com/office/drawing/2016/5/12/chartex" xmlns:cx7="http://schemas.microsoft.com/office/drawing/2016/5/13/chartex" xmlns:cx8="http://schemas.microsoft.com/office/drawing/2016/5/14/chartex" xmlns:mc="http://schemas.openxmlformats.org/markup-compatibility/2006" xmlns:aink="http://schemas.microsoft.com/office/drawing/2016/ink" xmlns:am3d="http://schemas.microsoft.com/office/drawing/2017/model3d" xmlns:o="urn:schemas-microsoft-com:office:office" xmlns:oel="http://schemas.microsoft.com/office/2019/extlst" xmlns:r="http://schemas.openxmlformats.org/officeDocument/2006/relationships" xmlns:m="http://schemas.openxmlformats.org/officeDocument/2006/math" xmlns:v="urn:schemas-microsoft-com:vml" xmlns:wp14="http://schemas.microsoft.com/office/word/2010/wordprocessingDrawing" xmlns:wp="http://schemas.openxmlformats.org/drawingml/2006/wordprocessingDrawing" xmlns:w10="urn:schemas-microsoft-com:office:word" xmlns:w="http://schemas.openxmlformats.org/wordprocessingml/2006/main" xmlns:w14="http://schemas.microsoft.com/office/word/2010/wordml" xmlns:w15="http://schemas.microsoft.com/office/word/2012/wordml" xmlns:w16cex="http://schemas.microsoft.com/office/word/2018/wordml/cex" xmlns:w16cid="http://schemas.microsoft.com/office/word/2016/wordml/cid" xmlns:w16="http://schemas.microsoft.com/office/word/2018/wordml" xmlns:w16sdtdh="http://schemas.microsoft.com/office/word/2020/wordml/sdtdatahash" xmlns:w16se="http://schemas.microsoft.com/office/word/2015/wordml/symex" xmlns:wpg="http://schemas.microsoft.com/office/word/2010/wordprocessingGroup" xmlns:wpi="http://schemas.microsoft.com/office/word/2010/wordprocessingInk" xmlns:wne="http://schemas.microsoft.com/office/word/2006/wordml" xmlns:wps="http://schemas.microsoft.com/office/word/2010/wordprocessingShape" mc:Ignorable="w14 w15 w16se w16cid w16 w16cex w16sdtdh wp14">
   <w:endnote w:type="separator" w:id="-1">
     <w:p>
       <w:pPr>
@@ -5174,7 +4701,7 @@
 </file>
 
 <file path=word/footnotes.xml><?xml version="1.0" encoding="utf-8"?>
-<w:footnotes xmlns:wpc="http://schemas.microsoft.com/office/word/2010/wordprocessingCanvas" xmlns:cx="http://schemas.microsoft.com/office/drawing/2014/chartex" xmlns:cx1="http://schemas.microsoft.com/office/drawing/2015/9/8/chartex" xmlns:cx2="http://schemas.microsoft.com/office/drawing/2015/10/21/chartex" xmlns:cx3="http://schemas.microsoft.com/office/drawing/2016/5/9/chartex" xmlns:cx4="http://schemas.microsoft.com/office/drawing/2016/5/10/chartex" xmlns:cx5="http://schemas.microsoft.com/office/drawing/2016/5/11/chartex" xmlns:cx6="http://schemas.microsoft.com/office/drawing/2016/5/12/chartex" xmlns:cx7="http://schemas.microsoft.com/office/drawing/2016/5/13/chartex" xmlns:cx8="http://schemas.microsoft.com/office/drawing/2016/5/14/chartex" xmlns:mc="http://schemas.openxmlformats.org/markup-compatibility/2006" xmlns:aink="http://schemas.microsoft.com/office/drawing/2016/ink" xmlns:am3d="http://schemas.microsoft.com/office/drawing/2017/model3d" xmlns:o="urn:schemas-microsoft-com:office:office" xmlns:oel="http://schemas.microsoft.com/office/2019/extlst" xmlns:r="http://schemas.openxmlformats.org/officeDocument/2006/relationships" xmlns:m="http://schemas.openxmlformats.org/officeDocument/2006/math" xmlns:v="urn:schemas-microsoft-com:vml" xmlns:wp14="http://schemas.microsoft.com/office/word/2010/wordprocessingDrawing" xmlns:wp="http://schemas.openxmlformats.org/drawingml/2006/wordprocessingDrawing" xmlns:w10="urn:schemas-microsoft-com:office:word" xmlns:w="http://schemas.openxmlformats.org/wordprocessingml/2006/main" xmlns:w14="http://schemas.microsoft.com/office/word/2010/wordml" xmlns:w15="http://schemas.microsoft.com/office/word/2012/wordml" xmlns:w16cex="http://schemas.microsoft.com/office/word/2018/wordml/cex" xmlns:w16cid="http://schemas.microsoft.com/office/word/2016/wordml/cid" xmlns:w16="http://schemas.microsoft.com/office/word/2018/wordml" xmlns:w16du="http://schemas.microsoft.com/office/word/2023/wordml/word16du" xmlns:w16sdtdh="http://schemas.microsoft.com/office/word/2020/wordml/sdtdatahash" xmlns:w16sdtfl="http://schemas.microsoft.com/office/word/2024/wordml/sdtformatlock" xmlns:w16se="http://schemas.microsoft.com/office/word/2015/wordml/symex" xmlns:wpg="http://schemas.microsoft.com/office/word/2010/wordprocessingGroup" xmlns:wpi="http://schemas.microsoft.com/office/word/2010/wordprocessingInk" xmlns:wne="http://schemas.microsoft.com/office/word/2006/wordml" xmlns:wps="http://schemas.microsoft.com/office/word/2010/wordprocessingShape" mc:Ignorable="w14 w15 w16se w16cid w16 w16cex w16sdtdh w16sdtfl w16du wp14">
+<w:footnotes xmlns:wpc="http://schemas.microsoft.com/office/word/2010/wordprocessingCanvas" xmlns:cx="http://schemas.microsoft.com/office/drawing/2014/chartex" xmlns:cx1="http://schemas.microsoft.com/office/drawing/2015/9/8/chartex" xmlns:cx2="http://schemas.microsoft.com/office/drawing/2015/10/21/chartex" xmlns:cx3="http://schemas.microsoft.com/office/drawing/2016/5/9/chartex" xmlns:cx4="http://schemas.microsoft.com/office/drawing/2016/5/10/chartex" xmlns:cx5="http://schemas.microsoft.com/office/drawing/2016/5/11/chartex" xmlns:cx6="http://schemas.microsoft.com/office/drawing/2016/5/12/chartex" xmlns:cx7="http://schemas.microsoft.com/office/drawing/2016/5/13/chartex" xmlns:cx8="http://schemas.microsoft.com/office/drawing/2016/5/14/chartex" xmlns:mc="http://schemas.openxmlformats.org/markup-compatibility/2006" xmlns:aink="http://schemas.microsoft.com/office/drawing/2016/ink" xmlns:am3d="http://schemas.microsoft.com/office/drawing/2017/model3d" xmlns:o="urn:schemas-microsoft-com:office:office" xmlns:oel="http://schemas.microsoft.com/office/2019/extlst" xmlns:r="http://schemas.openxmlformats.org/officeDocument/2006/relationships" xmlns:m="http://schemas.openxmlformats.org/officeDocument/2006/math" xmlns:v="urn:schemas-microsoft-com:vml" xmlns:wp14="http://schemas.microsoft.com/office/word/2010/wordprocessingDrawing" xmlns:wp="http://schemas.openxmlformats.org/drawingml/2006/wordprocessingDrawing" xmlns:w10="urn:schemas-microsoft-com:office:word" xmlns:w="http://schemas.openxmlformats.org/wordprocessingml/2006/main" xmlns:w14="http://schemas.microsoft.com/office/word/2010/wordml" xmlns:w15="http://schemas.microsoft.com/office/word/2012/wordml" xmlns:w16cex="http://schemas.microsoft.com/office/word/2018/wordml/cex" xmlns:w16cid="http://schemas.microsoft.com/office/word/2016/wordml/cid" xmlns:w16="http://schemas.microsoft.com/office/word/2018/wordml" xmlns:w16sdtdh="http://schemas.microsoft.com/office/word/2020/wordml/sdtdatahash" xmlns:w16se="http://schemas.microsoft.com/office/word/2015/wordml/symex" xmlns:wpg="http://schemas.microsoft.com/office/word/2010/wordprocessingGroup" xmlns:wpi="http://schemas.microsoft.com/office/word/2010/wordprocessingInk" xmlns:wne="http://schemas.microsoft.com/office/word/2006/wordml" xmlns:wps="http://schemas.microsoft.com/office/word/2010/wordprocessingShape" mc:Ignorable="w14 w15 w16se w16cid w16 w16cex w16sdtdh wp14">
   <w:footnote w:type="separator" w:id="-1">
     <w:p>
       <w:pPr>
@@ -5199,7 +4726,7 @@
 </file>
 
 <file path=word/numbering.xml><?xml version="1.0" encoding="utf-8"?>
-<w:numbering xmlns:wpc="http://schemas.microsoft.com/office/word/2010/wordprocessingCanvas" xmlns:cx="http://schemas.microsoft.com/office/drawing/2014/chartex" xmlns:cx1="http://schemas.microsoft.com/office/drawing/2015/9/8/chartex" xmlns:cx2="http://schemas.microsoft.com/office/drawing/2015/10/21/chartex" xmlns:cx3="http://schemas.microsoft.com/office/drawing/2016/5/9/chartex" xmlns:cx4="http://schemas.microsoft.com/office/drawing/2016/5/10/chartex" xmlns:cx5="http://schemas.microsoft.com/office/drawing/2016/5/11/chartex" xmlns:cx6="http://schemas.microsoft.com/office/drawing/2016/5/12/chartex" xmlns:cx7="http://schemas.microsoft.com/office/drawing/2016/5/13/chartex" xmlns:cx8="http://schemas.microsoft.com/office/drawing/2016/5/14/chartex" xmlns:mc="http://schemas.openxmlformats.org/markup-compatibility/2006" xmlns:aink="http://schemas.microsoft.com/office/drawing/2016/ink" xmlns:am3d="http://schemas.microsoft.com/office/drawing/2017/model3d" xmlns:o="urn:schemas-microsoft-com:office:office" xmlns:oel="http://schemas.microsoft.com/office/2019/extlst" xmlns:r="http://schemas.openxmlformats.org/officeDocument/2006/relationships" xmlns:m="http://schemas.openxmlformats.org/officeDocument/2006/math" xmlns:v="urn:schemas-microsoft-com:vml" xmlns:wp14="http://schemas.microsoft.com/office/word/2010/wordprocessingDrawing" xmlns:wp="http://schemas.openxmlformats.org/drawingml/2006/wordprocessingDrawing" xmlns:w10="urn:schemas-microsoft-com:office:word" xmlns:w="http://schemas.openxmlformats.org/wordprocessingml/2006/main" xmlns:w14="http://schemas.microsoft.com/office/word/2010/wordml" xmlns:w15="http://schemas.microsoft.com/office/word/2012/wordml" xmlns:w16cex="http://schemas.microsoft.com/office/word/2018/wordml/cex" xmlns:w16cid="http://schemas.microsoft.com/office/word/2016/wordml/cid" xmlns:w16="http://schemas.microsoft.com/office/word/2018/wordml" xmlns:w16du="http://schemas.microsoft.com/office/word/2023/wordml/word16du" xmlns:w16sdtdh="http://schemas.microsoft.com/office/word/2020/wordml/sdtdatahash" xmlns:w16sdtfl="http://schemas.microsoft.com/office/word/2024/wordml/sdtformatlock" xmlns:w16se="http://schemas.microsoft.com/office/word/2015/wordml/symex" xmlns:wpg="http://schemas.microsoft.com/office/word/2010/wordprocessingGroup" xmlns:wpi="http://schemas.microsoft.com/office/word/2010/wordprocessingInk" xmlns:wne="http://schemas.microsoft.com/office/word/2006/wordml" xmlns:wps="http://schemas.microsoft.com/office/word/2010/wordprocessingShape" mc:Ignorable="w14 w15 w16se w16cid w16 w16cex w16sdtdh w16sdtfl w16du wp14">
+<w:numbering xmlns:wpc="http://schemas.microsoft.com/office/word/2010/wordprocessingCanvas" xmlns:cx="http://schemas.microsoft.com/office/drawing/2014/chartex" xmlns:cx1="http://schemas.microsoft.com/office/drawing/2015/9/8/chartex" xmlns:cx2="http://schemas.microsoft.com/office/drawing/2015/10/21/chartex" xmlns:cx3="http://schemas.microsoft.com/office/drawing/2016/5/9/chartex" xmlns:cx4="http://schemas.microsoft.com/office/drawing/2016/5/10/chartex" xmlns:cx5="http://schemas.microsoft.com/office/drawing/2016/5/11/chartex" xmlns:cx6="http://schemas.microsoft.com/office/drawing/2016/5/12/chartex" xmlns:cx7="http://schemas.microsoft.com/office/drawing/2016/5/13/chartex" xmlns:cx8="http://schemas.microsoft.com/office/drawing/2016/5/14/chartex" xmlns:mc="http://schemas.openxmlformats.org/markup-compatibility/2006" xmlns:aink="http://schemas.microsoft.com/office/drawing/2016/ink" xmlns:am3d="http://schemas.microsoft.com/office/drawing/2017/model3d" xmlns:o="urn:schemas-microsoft-com:office:office" xmlns:oel="http://schemas.microsoft.com/office/2019/extlst" xmlns:r="http://schemas.openxmlformats.org/officeDocument/2006/relationships" xmlns:m="http://schemas.openxmlformats.org/officeDocument/2006/math" xmlns:v="urn:schemas-microsoft-com:vml" xmlns:wp14="http://schemas.microsoft.com/office/word/2010/wordprocessingDrawing" xmlns:wp="http://schemas.openxmlformats.org/drawingml/2006/wordprocessingDrawing" xmlns:w10="urn:schemas-microsoft-com:office:word" xmlns:w="http://schemas.openxmlformats.org/wordprocessingml/2006/main" xmlns:w14="http://schemas.microsoft.com/office/word/2010/wordml" xmlns:w15="http://schemas.microsoft.com/office/word/2012/wordml" xmlns:w16cex="http://schemas.microsoft.com/office/word/2018/wordml/cex" xmlns:w16cid="http://schemas.microsoft.com/office/word/2016/wordml/cid" xmlns:w16="http://schemas.microsoft.com/office/word/2018/wordml" xmlns:w16sdtdh="http://schemas.microsoft.com/office/word/2020/wordml/sdtdatahash" xmlns:w16se="http://schemas.microsoft.com/office/word/2015/wordml/symex" xmlns:wpg="http://schemas.microsoft.com/office/word/2010/wordprocessingGroup" xmlns:wpi="http://schemas.microsoft.com/office/word/2010/wordprocessingInk" xmlns:wne="http://schemas.microsoft.com/office/word/2006/wordml" xmlns:wps="http://schemas.microsoft.com/office/word/2010/wordprocessingShape" mc:Ignorable="w14 w15 w16se w16cid w16 w16cex w16sdtdh wp14">
   <w:abstractNum w:abstractNumId="0" w15:restartNumberingAfterBreak="0">
     <w:nsid w:val="02313AB1"/>
     <w:multiLevelType w:val="hybridMultilevel"/>
@@ -5320,7 +4847,7 @@
 </file>
 
 <file path=word/styles.xml><?xml version="1.0" encoding="utf-8"?>
-<w:styles xmlns:mc="http://schemas.openxmlformats.org/markup-compatibility/2006" xmlns:r="http://schemas.openxmlformats.org/officeDocument/2006/relationships" xmlns:w="http://schemas.openxmlformats.org/wordprocessingml/2006/main" xmlns:w14="http://schemas.microsoft.com/office/word/2010/wordml" xmlns:w15="http://schemas.microsoft.com/office/word/2012/wordml" xmlns:w16cex="http://schemas.microsoft.com/office/word/2018/wordml/cex" xmlns:w16cid="http://schemas.microsoft.com/office/word/2016/wordml/cid" xmlns:w16="http://schemas.microsoft.com/office/word/2018/wordml" xmlns:w16du="http://schemas.microsoft.com/office/word/2023/wordml/word16du" xmlns:w16sdtdh="http://schemas.microsoft.com/office/word/2020/wordml/sdtdatahash" xmlns:w16sdtfl="http://schemas.microsoft.com/office/word/2024/wordml/sdtformatlock" xmlns:w16se="http://schemas.microsoft.com/office/word/2015/wordml/symex" mc:Ignorable="w14 w15 w16se w16cid w16 w16cex w16sdtdh w16sdtfl w16du">
+<w:styles xmlns:mc="http://schemas.openxmlformats.org/markup-compatibility/2006" xmlns:r="http://schemas.openxmlformats.org/officeDocument/2006/relationships" xmlns:w="http://schemas.openxmlformats.org/wordprocessingml/2006/main" xmlns:w14="http://schemas.microsoft.com/office/word/2010/wordml" xmlns:w15="http://schemas.microsoft.com/office/word/2012/wordml" xmlns:w16cex="http://schemas.microsoft.com/office/word/2018/wordml/cex" xmlns:w16cid="http://schemas.microsoft.com/office/word/2016/wordml/cid" xmlns:w16="http://schemas.microsoft.com/office/word/2018/wordml" xmlns:w16sdtdh="http://schemas.microsoft.com/office/word/2020/wordml/sdtdatahash" xmlns:w16se="http://schemas.microsoft.com/office/word/2015/wordml/symex" mc:Ignorable="w14 w15 w16se w16cid w16 w16cex w16sdtdh">
   <w:docDefaults>
     <w:rPrDefault>
       <w:rPr>

</xml_diff>